<commit_message>
Use the institute cover page as the report's first page
</commit_message>
<xml_diff>
--- a/report/DSP_Signature_Verification_Report.docx
+++ b/report/DSP_Signature_Verification_Report.docx
@@ -4,260 +4,194 @@
   <w:body>
     <w:p>
       <w:pPr>
-        <w:spacing w:after="240" w:line="300" w:lineRule="auto"/>
-        <w:jc w:val="center"/>
-      </w:pPr>
-      <w:r>
-        <w:rPr>
-          <w:b/>
-          <w:bCs/>
-        </w:rPr>
-        <w:t>A PROJECT REPORT ON</w:t>
-      </w:r>
-    </w:p>
-    <w:p>
-      <w:pPr>
-        <w:spacing w:after="120" w:line="300" w:lineRule="auto"/>
-        <w:jc w:val="center"/>
-      </w:pPr>
-      <w:r>
-        <w:rPr>
-          <w:b/>
-          <w:bCs/>
-          <w:sz w:val="40"/>
-          <w:szCs w:val="40"/>
-        </w:rPr>
-        <w:t>A DSP-BASED BANK SIGNATURE VERIFICATION SYSTEM</w:t>
-      </w:r>
-    </w:p>
-    <w:p>
-      <w:pPr>
-        <w:spacing w:after="600" w:line="300" w:lineRule="auto"/>
-        <w:jc w:val="center"/>
+        <w:sectPr>
+          <w:pgSz w:w="11906" w:h="16838"/>
+          <w:pgMar w:top="0" w:right="0" w:bottom="0" w:left="0" w:header="0" w:footer="0" w:gutter="0"/>
+          <w:cols w:space="720"/>
+          <w:docGrid w:linePitch="360"/>
+        </w:sectPr>
+      </w:pPr>
+      <w:r>
+        <w:rPr>
+          <w:noProof/>
+        </w:rPr>
+        <w:drawing>
+          <wp:inline distT="0" distB="0" distL="0" distR="0" wp14:anchorId="1224D008" wp14:editId="294D8BD0">
+            <wp:extent cx="7553325" cy="10648950"/>
+            <wp:effectExtent l="0" t="0" r="0" b="0"/>
+            <wp:docPr id="19" name="Picture 19"/>
+            <wp:cNvGraphicFramePr>
+              <a:graphicFrameLocks xmlns:a="http://schemas.openxmlformats.org/drawingml/2006/main" noChangeAspect="1"/>
+            </wp:cNvGraphicFramePr>
+            <a:graphic xmlns:a="http://schemas.openxmlformats.org/drawingml/2006/main">
+              <a:graphicData uri="http://schemas.openxmlformats.org/drawingml/2006/picture">
+                <pic:pic xmlns:pic="http://schemas.openxmlformats.org/drawingml/2006/picture">
+                  <pic:nvPicPr>
+                    <pic:cNvPr id="0" name=""/>
+                    <pic:cNvPicPr>
+                      <a:picLocks noChangeAspect="1" noChangeArrowheads="1"/>
+                    </pic:cNvPicPr>
+                  </pic:nvPicPr>
+                  <pic:blipFill>
+                    <a:blip r:embed="rId7"/>
+                    <a:srcRect/>
+                    <a:stretch>
+                      <a:fillRect/>
+                    </a:stretch>
+                  </pic:blipFill>
+                  <pic:spPr bwMode="auto">
+                    <a:xfrm>
+                      <a:off x="0" y="0"/>
+                      <a:ext cx="7553325" cy="10648950"/>
+                    </a:xfrm>
+                    <a:prstGeom prst="rect">
+                      <a:avLst/>
+                    </a:prstGeom>
+                  </pic:spPr>
+                </pic:pic>
+              </a:graphicData>
+            </a:graphic>
+          </wp:inline>
+        </w:drawing>
+      </w:r>
+    </w:p>
+    <w:p>
+      <w:pPr>
+        <w:pStyle w:val="Heading1"/>
+      </w:pPr>
+      <w:bookmarkStart w:id="0" w:name="_Toc243940935"/>
+      <w:r>
+        <w:lastRenderedPageBreak/>
+        <w:t>ACKNOWLEDGEMENT</w:t>
+      </w:r>
+      <w:bookmarkEnd w:id="0"/>
+    </w:p>
+    <w:p>
+      <w:pPr>
+        <w:spacing w:after="120" w:line="276" w:lineRule="auto"/>
+        <w:jc w:val="both"/>
+      </w:pPr>
+      <w:r>
+        <w:t>We take this opportunity to express our sincere gratitude to everyone who helped us in completing this project on a signature verification system for banks, carried out as part of the course Digital Signal Processing (ECN15101).</w:t>
+      </w:r>
+    </w:p>
+    <w:p>
+      <w:pPr>
+        <w:spacing w:after="120" w:line="276" w:lineRule="auto"/>
+        <w:jc w:val="both"/>
+      </w:pPr>
+      <w:r>
+        <w:t>We are deeply thankful to our project guide and to the faculty members of the department for their constant encouragement, valuable suggestions and patient review of our work at every stage. Their teaching of digital signal processing gave us the foundation on which every module of this system is built. We would especially like to thank:</w:t>
+      </w:r>
+    </w:p>
+    <w:p>
+      <w:pPr>
+        <w:spacing w:after="80"/>
+      </w:pPr>
+    </w:p>
+    <w:p>
+      <w:pPr>
+        <w:spacing w:after="120" w:line="276" w:lineRule="auto"/>
+        <w:jc w:val="both"/>
+      </w:pPr>
+      <w:r>
+        <w:t>1.  Prof. _________________________________________</w:t>
+      </w:r>
+    </w:p>
+    <w:p>
+      <w:pPr>
+        <w:spacing w:after="120" w:line="276" w:lineRule="auto"/>
+        <w:jc w:val="both"/>
+      </w:pPr>
+      <w:r>
+        <w:t xml:space="preserve">     (Designation, Department)</w:t>
+      </w:r>
+    </w:p>
+    <w:p>
+      <w:pPr>
+        <w:spacing w:after="80"/>
+      </w:pPr>
+    </w:p>
+    <w:p>
+      <w:pPr>
+        <w:spacing w:after="120" w:line="276" w:lineRule="auto"/>
+        <w:jc w:val="both"/>
+      </w:pPr>
+      <w:r>
+        <w:t>2.  Prof. _________________________________________</w:t>
+      </w:r>
+    </w:p>
+    <w:p>
+      <w:pPr>
+        <w:spacing w:after="120" w:line="276" w:lineRule="auto"/>
+        <w:jc w:val="both"/>
+      </w:pPr>
+      <w:r>
+        <w:t xml:space="preserve">     (Designation, Department)</w:t>
+      </w:r>
+    </w:p>
+    <w:p>
+      <w:pPr>
+        <w:spacing w:after="80"/>
+      </w:pPr>
+    </w:p>
+    <w:p>
+      <w:pPr>
+        <w:spacing w:after="120" w:line="276" w:lineRule="auto"/>
+        <w:jc w:val="both"/>
+      </w:pPr>
+      <w:r>
+        <w:t>3.  Prof. _________________________________________</w:t>
+      </w:r>
+    </w:p>
+    <w:p>
+      <w:pPr>
+        <w:spacing w:after="120" w:line="276" w:lineRule="auto"/>
+        <w:jc w:val="both"/>
+      </w:pPr>
+      <w:r>
+        <w:t xml:space="preserve">     (Designation, Department)</w:t>
+      </w:r>
+    </w:p>
+    <w:p>
+      <w:pPr>
+        <w:spacing w:after="80"/>
+      </w:pPr>
+    </w:p>
+    <w:p>
+      <w:pPr>
+        <w:spacing w:after="120" w:line="276" w:lineRule="auto"/>
+        <w:jc w:val="both"/>
+      </w:pPr>
+      <w:r>
+        <w:t>We also thank the Head of the Department of Electronics and Communication Engineering, Motilal Nehru National Institute of Technology Allahabad, and the laboratory staff for providing access to the computing facilities and MATLAB licences used throughout the project. We acknowledge the Center of Excellence for Document Analysis and Recognition (CEDAR), University at Buffalo, for making their signature database publicly available for research.</w:t>
+      </w:r>
+    </w:p>
+    <w:p>
+      <w:pPr>
+        <w:spacing w:after="120" w:line="276" w:lineRule="auto"/>
+        <w:jc w:val="both"/>
+      </w:pPr>
+      <w:r>
+        <w:t>Finally, we thank our families and friends for their support and understanding during the course of this work.</w:t>
+      </w:r>
+    </w:p>
+    <w:p>
+      <w:pPr>
+        <w:spacing w:after="80"/>
+      </w:pPr>
+    </w:p>
+    <w:p>
+      <w:pPr>
+        <w:spacing w:before="400"/>
+        <w:jc w:val="right"/>
       </w:pPr>
       <w:r>
         <w:rPr>
           <w:i/>
           <w:iCs/>
         </w:rPr>
-        <w:t>Offline Handwritten Signature Verification using Digital Signal Processing and Machine Learning in MATLAB</w:t>
-      </w:r>
-    </w:p>
-    <w:p>
-      <w:pPr>
-        <w:spacing w:after="60" w:line="300" w:lineRule="auto"/>
-        <w:jc w:val="center"/>
-      </w:pPr>
-      <w:r>
-        <w:t>Submitted in partial fulfilment of the requirements of the</w:t>
-      </w:r>
-    </w:p>
-    <w:p>
-      <w:pPr>
-        <w:spacing w:after="600" w:line="300" w:lineRule="auto"/>
-        <w:jc w:val="center"/>
-      </w:pPr>
-      <w:r>
-        <w:rPr>
-          <w:b/>
-          <w:bCs/>
-        </w:rPr>
-        <w:t>Digital Signal Processing Laboratory</w:t>
-      </w:r>
-    </w:p>
-    <w:p>
-      <w:pPr>
-        <w:spacing w:after="160" w:line="300" w:lineRule="auto"/>
-        <w:jc w:val="center"/>
-      </w:pPr>
-      <w:r>
-        <w:rPr>
-          <w:b/>
-          <w:bCs/>
-        </w:rPr>
-        <w:t>Submitted by</w:t>
-      </w:r>
-    </w:p>
-    <w:tbl>
-      <w:tblPr>
-        <w:tblW w:w="6000" w:type="dxa"/>
-        <w:jc w:val="center"/>
-        <w:tblLook w:val="04A0" w:firstRow="1" w:lastRow="0" w:firstColumn="1" w:lastColumn="0" w:noHBand="0" w:noVBand="1"/>
-      </w:tblPr>
-      <w:tblGrid>
-        <w:gridCol w:w="3600"/>
-        <w:gridCol w:w="2400"/>
-      </w:tblGrid>
-      <w:tr>
-        <w:trPr>
-          <w:jc w:val="center"/>
-        </w:trPr>
-        <w:tc>
-          <w:tcPr>
-            <w:tcW w:w="3600" w:type="dxa"/>
-          </w:tcPr>
-          <w:p>
-            <w:r>
-              <w:t>Ashish Singh</w:t>
-            </w:r>
-          </w:p>
-        </w:tc>
-        <w:tc>
-          <w:tcPr>
-            <w:tcW w:w="2400" w:type="dxa"/>
-          </w:tcPr>
-          <w:p>
-            <w:pPr>
-              <w:jc w:val="right"/>
-            </w:pPr>
-            <w:r>
-              <w:t>20244045</w:t>
-            </w:r>
-          </w:p>
-        </w:tc>
-      </w:tr>
-      <w:tr>
-        <w:trPr>
-          <w:jc w:val="center"/>
-        </w:trPr>
-        <w:tc>
-          <w:tcPr>
-            <w:tcW w:w="3600" w:type="dxa"/>
-          </w:tcPr>
-          <w:p>
-            <w:r>
-              <w:t>Ayush Agarwal</w:t>
-            </w:r>
-          </w:p>
-        </w:tc>
-        <w:tc>
-          <w:tcPr>
-            <w:tcW w:w="2400" w:type="dxa"/>
-          </w:tcPr>
-          <w:p>
-            <w:pPr>
-              <w:jc w:val="right"/>
-            </w:pPr>
-            <w:r>
-              <w:t>20244047</w:t>
-            </w:r>
-          </w:p>
-        </w:tc>
-      </w:tr>
-      <w:tr>
-        <w:trPr>
-          <w:jc w:val="center"/>
-        </w:trPr>
-        <w:tc>
-          <w:tcPr>
-            <w:tcW w:w="3600" w:type="dxa"/>
-          </w:tcPr>
-          <w:p>
-            <w:r>
-              <w:t>Ayush Jadaun</w:t>
-            </w:r>
-          </w:p>
-        </w:tc>
-        <w:tc>
-          <w:tcPr>
-            <w:tcW w:w="2400" w:type="dxa"/>
-          </w:tcPr>
-          <w:p>
-            <w:pPr>
-              <w:jc w:val="right"/>
-            </w:pPr>
-            <w:r>
-              <w:t>20244048</w:t>
-            </w:r>
-          </w:p>
-        </w:tc>
-      </w:tr>
-      <w:tr>
-        <w:trPr>
-          <w:jc w:val="center"/>
-        </w:trPr>
-        <w:tc>
-          <w:tcPr>
-            <w:tcW w:w="3600" w:type="dxa"/>
-          </w:tcPr>
-          <w:p>
-            <w:r>
-              <w:t>Ayush Kaushal</w:t>
-            </w:r>
-          </w:p>
-        </w:tc>
-        <w:tc>
-          <w:tcPr>
-            <w:tcW w:w="2400" w:type="dxa"/>
-          </w:tcPr>
-          <w:p>
-            <w:pPr>
-              <w:jc w:val="right"/>
-            </w:pPr>
-            <w:r>
-              <w:t>20244049</w:t>
-            </w:r>
-          </w:p>
-        </w:tc>
-      </w:tr>
-    </w:tbl>
-    <w:p>
-      <w:pPr>
-        <w:spacing w:after="500" w:line="300" w:lineRule="auto"/>
-        <w:jc w:val="center"/>
-      </w:pPr>
-    </w:p>
-    <w:p>
-      <w:pPr>
-        <w:spacing w:after="120" w:line="300" w:lineRule="auto"/>
-        <w:jc w:val="center"/>
-      </w:pPr>
-      <w:r>
-        <w:rPr>
-          <w:b/>
-          <w:bCs/>
-        </w:rPr>
-        <w:t>Under the guidance of</w:t>
-      </w:r>
-    </w:p>
-    <w:p>
-      <w:pPr>
-        <w:spacing w:after="600" w:line="300" w:lineRule="auto"/>
-        <w:jc w:val="center"/>
-      </w:pPr>
-      <w:r>
-        <w:t>Prof. ______________________________</w:t>
-      </w:r>
-    </w:p>
-    <w:p>
-      <w:pPr>
-        <w:spacing w:after="60" w:line="300" w:lineRule="auto"/>
-        <w:jc w:val="center"/>
-      </w:pPr>
-      <w:r>
-        <w:t>Department of ______________________________</w:t>
-      </w:r>
-    </w:p>
-    <w:p>
-      <w:pPr>
-        <w:spacing w:after="60" w:line="300" w:lineRule="auto"/>
-        <w:jc w:val="center"/>
-      </w:pPr>
-      <w:r>
-        <w:t>______________________________ (Name of the University / Institute)</w:t>
-      </w:r>
-    </w:p>
-    <w:p>
-      <w:pPr>
-        <w:spacing w:after="120" w:line="300" w:lineRule="auto"/>
-        <w:jc w:val="center"/>
-      </w:pPr>
-      <w:r>
-        <w:rPr>
-          <w:b/>
-          <w:bCs/>
-        </w:rPr>
-        <w:t>Academic Year 2026</w:t>
+        <w:t>Ashish Singh, Ayush Agarwal, Ayush Jadaun, Ayush Kaushal</w:t>
       </w:r>
     </w:p>
     <w:p>
@@ -265,12 +199,12 @@
         <w:pStyle w:val="Heading1"/>
         <w:pageBreakBefore/>
       </w:pPr>
-      <w:bookmarkStart w:id="0" w:name="_Toc243940835"/>
+      <w:bookmarkStart w:id="1" w:name="_Toc243940936"/>
       <w:r>
         <w:lastRenderedPageBreak/>
-        <w:t>ACKNOWLEDGEMENT</w:t>
-      </w:r>
-      <w:bookmarkEnd w:id="0"/>
+        <w:t>PREFACE</w:t>
+      </w:r>
+      <w:bookmarkEnd w:id="1"/>
     </w:p>
     <w:p>
       <w:pPr>
@@ -278,7 +212,7 @@
         <w:jc w:val="both"/>
       </w:pPr>
       <w:r>
-        <w:t>We take this opportunity to express our sincere gratitude to everyone who helped us in completing this project on a DSP-based bank signature verification system.</w:t>
+        <w:t>Handwritten signatures remain the most widely accepted means of authorising a financial transaction. Every cheque, withdrawal slip and account opening form in a bank carries one, and the burden of checking it usually falls on a clerk comparing the document against a specimen card by eye. This is slow, subjective and vulnerable to skilled forgeries.</w:t>
       </w:r>
     </w:p>
     <w:p>
@@ -287,13 +221,11 @@
         <w:jc w:val="both"/>
       </w:pPr>
       <w:r>
-        <w:t>We are deeply thankful to our project guide and to the faculty members of the department for their constant encouragement, valuable suggestions and patient review of our work at every stage. Their teaching of digital signal processing gave us the foundation on which every module of this system is built. We would especially like to thank:</w:t>
-      </w:r>
-    </w:p>
-    <w:p>
-      <w:pPr>
-        <w:spacing w:after="80"/>
-      </w:pPr>
+        <w:t>This report documents the design and implementation of an offline signature verification system written entirely in MATLAB. The central idea is to treat a scanned signature as a signal: the image is cleaned with classical filters, reduced to one-dimensional projection signals, analysed in the frequency domain with the Fast Fourier Transform, decomposed with a Haar wavelet transform and compared against the stored specimens with two-dimensional normalised cross-correlation. A small writer-independent machine</w:t>
+      </w:r>
+      <w:r>
+        <w:t xml:space="preserve"> learning classifier is layered on top of the same DSP features, and both scores are fused into a single decision.</w:t>
+      </w:r>
     </w:p>
     <w:p>
       <w:pPr>
@@ -301,7 +233,10 @@
         <w:jc w:val="both"/>
       </w:pPr>
       <w:r>
-        <w:t>1.  Prof. _________________________________________</w:t>
+        <w:t>The report is organised in the order in which a signature travels through the system. After the introduction and theoretical background, separate chapters cover preprocessing, feature extraction, matching and scoring, threshold calibration and parameter tuning, the graphical user interface, and the experimental evaluation on the public CEDAR database. Relevant MATLAB code is reproduced directly from the project source so that each explanation can be checked against the implementation. Applications, future s</w:t>
+      </w:r>
+      <w:r>
+        <w:t>cope and conclusions follow, and the appendices give the complete file listing, reproduction steps and sample log output.</w:t>
       </w:r>
     </w:p>
     <w:p>
@@ -310,94 +245,7 @@
         <w:jc w:val="both"/>
       </w:pPr>
       <w:r>
-        <w:t xml:space="preserve">     (Designation, Department)</w:t>
-      </w:r>
-    </w:p>
-    <w:p>
-      <w:pPr>
-        <w:spacing w:after="80"/>
-      </w:pPr>
-    </w:p>
-    <w:p>
-      <w:pPr>
-        <w:spacing w:after="120" w:line="276" w:lineRule="auto"/>
-        <w:jc w:val="both"/>
-      </w:pPr>
-      <w:r>
-        <w:t>2.  Prof. _________________________________________</w:t>
-      </w:r>
-    </w:p>
-    <w:p>
-      <w:pPr>
-        <w:spacing w:after="120" w:line="276" w:lineRule="auto"/>
-        <w:jc w:val="both"/>
-      </w:pPr>
-      <w:r>
-        <w:t xml:space="preserve">     (Designation, Department)</w:t>
-      </w:r>
-    </w:p>
-    <w:p>
-      <w:pPr>
-        <w:spacing w:after="80"/>
-      </w:pPr>
-    </w:p>
-    <w:p>
-      <w:pPr>
-        <w:spacing w:after="120" w:line="276" w:lineRule="auto"/>
-        <w:jc w:val="both"/>
-      </w:pPr>
-      <w:r>
-        <w:t>3.  Prof. _________________________________________</w:t>
-      </w:r>
-    </w:p>
-    <w:p>
-      <w:pPr>
-        <w:spacing w:after="120" w:line="276" w:lineRule="auto"/>
-        <w:jc w:val="both"/>
-      </w:pPr>
-      <w:r>
-        <w:t xml:space="preserve">     (Designation, Department)</w:t>
-      </w:r>
-    </w:p>
-    <w:p>
-      <w:pPr>
-        <w:spacing w:after="80"/>
-      </w:pPr>
-    </w:p>
-    <w:p>
-      <w:pPr>
-        <w:spacing w:after="120" w:line="276" w:lineRule="auto"/>
-        <w:jc w:val="both"/>
-      </w:pPr>
-      <w:r>
-        <w:t>We also thank the Head of the Department and the laboratory staff for providing access to the computing facilities and MATLAB licences used throughout the project. We acknowledge the Center of Excellence for Document Analysis and Recognition (CEDAR), University at Buffalo, for making their signature database publicly available for research.</w:t>
-      </w:r>
-    </w:p>
-    <w:p>
-      <w:pPr>
-        <w:spacing w:after="120" w:line="276" w:lineRule="auto"/>
-        <w:jc w:val="both"/>
-      </w:pPr>
-      <w:r>
-        <w:t>Finally, we thank our families and friends for their support and understanding during the course of this work.</w:t>
-      </w:r>
-    </w:p>
-    <w:p>
-      <w:pPr>
-        <w:spacing w:after="80"/>
-      </w:pPr>
-    </w:p>
-    <w:p>
-      <w:pPr>
-        <w:spacing w:before="400"/>
-        <w:jc w:val="right"/>
-      </w:pPr>
-      <w:r>
-        <w:rPr>
-          <w:i/>
-          <w:iCs/>
-        </w:rPr>
-        <w:t>Ashish Singh, Ayush Agarwal, Ayush Jadaun, Ayush Kaushal</w:t>
+        <w:t>We hope the report serves both as a record of our work and as a practical example of how core DSP concepts taught in the classroom can be applied to a real problem in banking security.</w:t>
       </w:r>
     </w:p>
     <w:p>
@@ -405,61 +253,7 @@
         <w:pStyle w:val="Heading1"/>
         <w:pageBreakBefore/>
       </w:pPr>
-      <w:bookmarkStart w:id="1" w:name="_Toc243940836"/>
-      <w:r>
-        <w:lastRenderedPageBreak/>
-        <w:t>PREFACE</w:t>
-      </w:r>
-      <w:bookmarkEnd w:id="1"/>
-    </w:p>
-    <w:p>
-      <w:pPr>
-        <w:spacing w:after="120" w:line="276" w:lineRule="auto"/>
-        <w:jc w:val="both"/>
-      </w:pPr>
-      <w:r>
-        <w:t>Handwritten signatures remain the most widely accepted means of authorising a financial transaction. Every cheque, withdrawal slip and account opening form in a bank carries one, and the burden of checking it usually falls on a clerk comparing the document against a specimen card by eye. This is slow, subjective and vulnerable to skilled forgeries.</w:t>
-      </w:r>
-    </w:p>
-    <w:p>
-      <w:pPr>
-        <w:spacing w:after="120" w:line="276" w:lineRule="auto"/>
-        <w:jc w:val="both"/>
-      </w:pPr>
-      <w:r>
-        <w:t>This report documents the design and implementation of an offline signature verification system written entirely in MATLAB. The central idea is to treat a scanned signature as a signal: the image is cleaned with classical filters, reduced to one-dimensional projection signals, analysed in the frequency domain with the Fast Fourier Transform, decomposed with a Haar wavelet transform and compared against the stored specimens with two-dimensional normalised cross-correlation. A small writer-independent machine</w:t>
-      </w:r>
-      <w:r>
-        <w:t xml:space="preserve"> learning classifier is layered on top of the same DSP features, and both scores are fused into a single decision.</w:t>
-      </w:r>
-    </w:p>
-    <w:p>
-      <w:pPr>
-        <w:spacing w:after="120" w:line="276" w:lineRule="auto"/>
-        <w:jc w:val="both"/>
-      </w:pPr>
-      <w:r>
-        <w:t>The report is organised in the order in which a signature travels through the system. After the introduction and theoretical background, separate chapters cover preprocessing, feature extraction, matching and scoring, threshold calibration and parameter tuning, the graphical user interface, and the experimental evaluation on the public CEDAR database. Relevant MATLAB code is reproduced directly from the project source so that each explanation can be checked against the implementation. Applications, future s</w:t>
-      </w:r>
-      <w:r>
-        <w:t>cope and conclusions follow, and the appendices give the complete file listing, reproduction steps and sample log output.</w:t>
-      </w:r>
-    </w:p>
-    <w:p>
-      <w:pPr>
-        <w:spacing w:after="120" w:line="276" w:lineRule="auto"/>
-        <w:jc w:val="both"/>
-      </w:pPr>
-      <w:r>
-        <w:t>We hope the report serves both as a record of our work and as a practical example of how core DSP concepts taught in the classroom can be applied to a real problem in banking security.</w:t>
-      </w:r>
-    </w:p>
-    <w:p>
-      <w:pPr>
-        <w:pStyle w:val="Heading1"/>
-        <w:pageBreakBefore/>
-      </w:pPr>
-      <w:bookmarkStart w:id="2" w:name="_Toc243940837"/>
+      <w:bookmarkStart w:id="2" w:name="_Toc243940937"/>
       <w:r>
         <w:lastRenderedPageBreak/>
         <w:t>INDEX</w:t>
@@ -469,7 +263,7 @@
     <w:sdt>
       <w:sdtPr>
         <w:alias w:val="Index"/>
-        <w:id w:val="541098166"/>
+        <w:id w:val="1490982605"/>
       </w:sdtPr>
       <w:sdtEndPr/>
       <w:sdtContent>
@@ -497,7 +291,7 @@
           <w:r>
             <w:fldChar w:fldCharType="separate"/>
           </w:r>
-          <w:hyperlink w:anchor="_Toc243940835" w:history="1">
+          <w:hyperlink w:anchor="_Toc243940935" w:history="1">
             <w:r>
               <w:rPr>
                 <w:rStyle w:val="Hyperlink"/>
@@ -521,7 +315,7 @@
               <w:rPr>
                 <w:noProof/>
               </w:rPr>
-              <w:instrText xml:space="preserve"> PAGEREF _Toc243940835 \h </w:instrText>
+              <w:instrText xml:space="preserve"> PAGEREF _Toc243940935 \h </w:instrText>
             </w:r>
             <w:r>
               <w:rPr>
@@ -538,7 +332,7 @@
               <w:rPr>
                 <w:noProof/>
               </w:rPr>
-              <w:t>ii</w:t>
+              <w:t>i</w:t>
             </w:r>
             <w:r>
               <w:rPr>
@@ -563,7 +357,7 @@
               <w14:ligatures w14:val="standardContextual"/>
             </w:rPr>
           </w:pPr>
-          <w:hyperlink w:anchor="_Toc243940836" w:history="1">
+          <w:hyperlink w:anchor="_Toc243940936" w:history="1">
             <w:r>
               <w:rPr>
                 <w:rStyle w:val="Hyperlink"/>
@@ -587,7 +381,7 @@
               <w:rPr>
                 <w:noProof/>
               </w:rPr>
-              <w:instrText xml:space="preserve"> PAGEREF _Toc243940836 \h </w:instrText>
+              <w:instrText xml:space="preserve"> PAGEREF _Toc243940936 \h </w:instrText>
             </w:r>
             <w:r>
               <w:rPr>
@@ -604,7 +398,7 @@
               <w:rPr>
                 <w:noProof/>
               </w:rPr>
-              <w:t>iii</w:t>
+              <w:t>ii</w:t>
             </w:r>
             <w:r>
               <w:rPr>
@@ -629,7 +423,7 @@
               <w14:ligatures w14:val="standardContextual"/>
             </w:rPr>
           </w:pPr>
-          <w:hyperlink w:anchor="_Toc243940837" w:history="1">
+          <w:hyperlink w:anchor="_Toc243940937" w:history="1">
             <w:r>
               <w:rPr>
                 <w:rStyle w:val="Hyperlink"/>
@@ -653,7 +447,7 @@
               <w:rPr>
                 <w:noProof/>
               </w:rPr>
-              <w:instrText xml:space="preserve"> PAGEREF _Toc243940837 \h </w:instrText>
+              <w:instrText xml:space="preserve"> PAGEREF _Toc243940937 \h </w:instrText>
             </w:r>
             <w:r>
               <w:rPr>
@@ -670,7 +464,7 @@
               <w:rPr>
                 <w:noProof/>
               </w:rPr>
-              <w:t>iv</w:t>
+              <w:t>iii</w:t>
             </w:r>
             <w:r>
               <w:rPr>
@@ -695,7 +489,7 @@
               <w14:ligatures w14:val="standardContextual"/>
             </w:rPr>
           </w:pPr>
-          <w:hyperlink w:anchor="_Toc243940838" w:history="1">
+          <w:hyperlink w:anchor="_Toc243940938" w:history="1">
             <w:r>
               <w:rPr>
                 <w:rStyle w:val="Hyperlink"/>
@@ -719,7 +513,7 @@
               <w:rPr>
                 <w:noProof/>
               </w:rPr>
-              <w:instrText xml:space="preserve"> PAGEREF _Toc243940838 \h </w:instrText>
+              <w:instrText xml:space="preserve"> PAGEREF _Toc243940938 \h </w:instrText>
             </w:r>
             <w:r>
               <w:rPr>
@@ -736,7 +530,7 @@
               <w:rPr>
                 <w:noProof/>
               </w:rPr>
-              <w:t>vii</w:t>
+              <w:t>vi</w:t>
             </w:r>
             <w:r>
               <w:rPr>
@@ -761,7 +555,7 @@
               <w14:ligatures w14:val="standardContextual"/>
             </w:rPr>
           </w:pPr>
-          <w:hyperlink w:anchor="_Toc243940839" w:history="1">
+          <w:hyperlink w:anchor="_Toc243940939" w:history="1">
             <w:r>
               <w:rPr>
                 <w:rStyle w:val="Hyperlink"/>
@@ -785,7 +579,7 @@
               <w:rPr>
                 <w:noProof/>
               </w:rPr>
-              <w:instrText xml:space="preserve"> PAGEREF _Toc243940839 \h </w:instrText>
+              <w:instrText xml:space="preserve"> PAGEREF _Toc243940939 \h </w:instrText>
             </w:r>
             <w:r>
               <w:rPr>
@@ -802,7 +596,7 @@
               <w:rPr>
                 <w:noProof/>
               </w:rPr>
-              <w:t>vii</w:t>
+              <w:t>vi</w:t>
             </w:r>
             <w:r>
               <w:rPr>
@@ -827,7 +621,7 @@
               <w14:ligatures w14:val="standardContextual"/>
             </w:rPr>
           </w:pPr>
-          <w:hyperlink w:anchor="_Toc243940840" w:history="1">
+          <w:hyperlink w:anchor="_Toc243940940" w:history="1">
             <w:r>
               <w:rPr>
                 <w:rStyle w:val="Hyperlink"/>
@@ -851,7 +645,7 @@
               <w:rPr>
                 <w:noProof/>
               </w:rPr>
-              <w:instrText xml:space="preserve"> PAGEREF _Toc243940840 \h </w:instrText>
+              <w:instrText xml:space="preserve"> PAGEREF _Toc243940940 \h </w:instrText>
             </w:r>
             <w:r>
               <w:rPr>
@@ -893,7 +687,7 @@
               <w14:ligatures w14:val="standardContextual"/>
             </w:rPr>
           </w:pPr>
-          <w:hyperlink w:anchor="_Toc243940841" w:history="1">
+          <w:hyperlink w:anchor="_Toc243940941" w:history="1">
             <w:r>
               <w:rPr>
                 <w:rStyle w:val="Hyperlink"/>
@@ -917,7 +711,7 @@
               <w:rPr>
                 <w:noProof/>
               </w:rPr>
-              <w:instrText xml:space="preserve"> PAGEREF _Toc243940841 \h </w:instrText>
+              <w:instrText xml:space="preserve"> PAGEREF _Toc243940941 \h </w:instrText>
             </w:r>
             <w:r>
               <w:rPr>
@@ -959,7 +753,7 @@
               <w14:ligatures w14:val="standardContextual"/>
             </w:rPr>
           </w:pPr>
-          <w:hyperlink w:anchor="_Toc243940842" w:history="1">
+          <w:hyperlink w:anchor="_Toc243940942" w:history="1">
             <w:r>
               <w:rPr>
                 <w:rStyle w:val="Hyperlink"/>
@@ -983,7 +777,7 @@
               <w:rPr>
                 <w:noProof/>
               </w:rPr>
-              <w:instrText xml:space="preserve"> PAGEREF _Toc243940842 \h </w:instrText>
+              <w:instrText xml:space="preserve"> PAGEREF _Toc243940942 \h </w:instrText>
             </w:r>
             <w:r>
               <w:rPr>
@@ -1025,7 +819,7 @@
               <w14:ligatures w14:val="standardContextual"/>
             </w:rPr>
           </w:pPr>
-          <w:hyperlink w:anchor="_Toc243940843" w:history="1">
+          <w:hyperlink w:anchor="_Toc243940943" w:history="1">
             <w:r>
               <w:rPr>
                 <w:rStyle w:val="Hyperlink"/>
@@ -1049,7 +843,7 @@
               <w:rPr>
                 <w:noProof/>
               </w:rPr>
-              <w:instrText xml:space="preserve"> PAGEREF _Toc243940843 \h </w:instrText>
+              <w:instrText xml:space="preserve"> PAGEREF _Toc243940943 \h </w:instrText>
             </w:r>
             <w:r>
               <w:rPr>
@@ -1091,7 +885,7 @@
               <w14:ligatures w14:val="standardContextual"/>
             </w:rPr>
           </w:pPr>
-          <w:hyperlink w:anchor="_Toc243940844" w:history="1">
+          <w:hyperlink w:anchor="_Toc243940944" w:history="1">
             <w:r>
               <w:rPr>
                 <w:rStyle w:val="Hyperlink"/>
@@ -1115,7 +909,7 @@
               <w:rPr>
                 <w:noProof/>
               </w:rPr>
-              <w:instrText xml:space="preserve"> PAGEREF _Toc243940844 \h </w:instrText>
+              <w:instrText xml:space="preserve"> PAGEREF _Toc243940944 \h </w:instrText>
             </w:r>
             <w:r>
               <w:rPr>
@@ -1157,7 +951,7 @@
               <w14:ligatures w14:val="standardContextual"/>
             </w:rPr>
           </w:pPr>
-          <w:hyperlink w:anchor="_Toc243940845" w:history="1">
+          <w:hyperlink w:anchor="_Toc243940945" w:history="1">
             <w:r>
               <w:rPr>
                 <w:rStyle w:val="Hyperlink"/>
@@ -1181,7 +975,7 @@
               <w:rPr>
                 <w:noProof/>
               </w:rPr>
-              <w:instrText xml:space="preserve"> PAGEREF _Toc243940845 \h </w:instrText>
+              <w:instrText xml:space="preserve"> PAGEREF _Toc243940945 \h </w:instrText>
             </w:r>
             <w:r>
               <w:rPr>
@@ -1223,7 +1017,7 @@
               <w14:ligatures w14:val="standardContextual"/>
             </w:rPr>
           </w:pPr>
-          <w:hyperlink w:anchor="_Toc243940846" w:history="1">
+          <w:hyperlink w:anchor="_Toc243940946" w:history="1">
             <w:r>
               <w:rPr>
                 <w:rStyle w:val="Hyperlink"/>
@@ -1247,7 +1041,7 @@
               <w:rPr>
                 <w:noProof/>
               </w:rPr>
-              <w:instrText xml:space="preserve"> PAGEREF _Toc243940846 \h </w:instrText>
+              <w:instrText xml:space="preserve"> PAGEREF _Toc243940946 \h </w:instrText>
             </w:r>
             <w:r>
               <w:rPr>
@@ -1289,7 +1083,7 @@
               <w14:ligatures w14:val="standardContextual"/>
             </w:rPr>
           </w:pPr>
-          <w:hyperlink w:anchor="_Toc243940847" w:history="1">
+          <w:hyperlink w:anchor="_Toc243940947" w:history="1">
             <w:r>
               <w:rPr>
                 <w:rStyle w:val="Hyperlink"/>
@@ -1313,7 +1107,7 @@
               <w:rPr>
                 <w:noProof/>
               </w:rPr>
-              <w:instrText xml:space="preserve"> PAGEREF _Toc243940847 \h </w:instrText>
+              <w:instrText xml:space="preserve"> PAGEREF _Toc243940947 \h </w:instrText>
             </w:r>
             <w:r>
               <w:rPr>
@@ -1355,7 +1149,7 @@
               <w14:ligatures w14:val="standardContextual"/>
             </w:rPr>
           </w:pPr>
-          <w:hyperlink w:anchor="_Toc243940848" w:history="1">
+          <w:hyperlink w:anchor="_Toc243940948" w:history="1">
             <w:r>
               <w:rPr>
                 <w:rStyle w:val="Hyperlink"/>
@@ -1379,7 +1173,7 @@
               <w:rPr>
                 <w:noProof/>
               </w:rPr>
-              <w:instrText xml:space="preserve"> PAGEREF _Toc243940848 \h </w:instrText>
+              <w:instrText xml:space="preserve"> PAGEREF _Toc243940948 \h </w:instrText>
             </w:r>
             <w:r>
               <w:rPr>
@@ -1421,7 +1215,7 @@
               <w14:ligatures w14:val="standardContextual"/>
             </w:rPr>
           </w:pPr>
-          <w:hyperlink w:anchor="_Toc243940849" w:history="1">
+          <w:hyperlink w:anchor="_Toc243940949" w:history="1">
             <w:r>
               <w:rPr>
                 <w:rStyle w:val="Hyperlink"/>
@@ -1445,7 +1239,7 @@
               <w:rPr>
                 <w:noProof/>
               </w:rPr>
-              <w:instrText xml:space="preserve"> PAGEREF _Toc243940849 \h </w:instrText>
+              <w:instrText xml:space="preserve"> PAGEREF _Toc243940949 \h </w:instrText>
             </w:r>
             <w:r>
               <w:rPr>
@@ -1487,7 +1281,7 @@
               <w14:ligatures w14:val="standardContextual"/>
             </w:rPr>
           </w:pPr>
-          <w:hyperlink w:anchor="_Toc243940850" w:history="1">
+          <w:hyperlink w:anchor="_Toc243940950" w:history="1">
             <w:r>
               <w:rPr>
                 <w:rStyle w:val="Hyperlink"/>
@@ -1511,7 +1305,7 @@
               <w:rPr>
                 <w:noProof/>
               </w:rPr>
-              <w:instrText xml:space="preserve"> PAGEREF _Toc243940850 \h </w:instrText>
+              <w:instrText xml:space="preserve"> PAGEREF _Toc243940950 \h </w:instrText>
             </w:r>
             <w:r>
               <w:rPr>
@@ -1553,7 +1347,7 @@
               <w14:ligatures w14:val="standardContextual"/>
             </w:rPr>
           </w:pPr>
-          <w:hyperlink w:anchor="_Toc243940851" w:history="1">
+          <w:hyperlink w:anchor="_Toc243940951" w:history="1">
             <w:r>
               <w:rPr>
                 <w:rStyle w:val="Hyperlink"/>
@@ -1577,7 +1371,7 @@
               <w:rPr>
                 <w:noProof/>
               </w:rPr>
-              <w:instrText xml:space="preserve"> PAGEREF _Toc243940851 \h </w:instrText>
+              <w:instrText xml:space="preserve"> PAGEREF _Toc243940951 \h </w:instrText>
             </w:r>
             <w:r>
               <w:rPr>
@@ -1619,7 +1413,7 @@
               <w14:ligatures w14:val="standardContextual"/>
             </w:rPr>
           </w:pPr>
-          <w:hyperlink w:anchor="_Toc243940852" w:history="1">
+          <w:hyperlink w:anchor="_Toc243940952" w:history="1">
             <w:r>
               <w:rPr>
                 <w:rStyle w:val="Hyperlink"/>
@@ -1643,7 +1437,7 @@
               <w:rPr>
                 <w:noProof/>
               </w:rPr>
-              <w:instrText xml:space="preserve"> PAGEREF _Toc243940852 \h </w:instrText>
+              <w:instrText xml:space="preserve"> PAGEREF _Toc243940952 \h </w:instrText>
             </w:r>
             <w:r>
               <w:rPr>
@@ -1685,7 +1479,7 @@
               <w14:ligatures w14:val="standardContextual"/>
             </w:rPr>
           </w:pPr>
-          <w:hyperlink w:anchor="_Toc243940853" w:history="1">
+          <w:hyperlink w:anchor="_Toc243940953" w:history="1">
             <w:r>
               <w:rPr>
                 <w:rStyle w:val="Hyperlink"/>
@@ -1709,7 +1503,7 @@
               <w:rPr>
                 <w:noProof/>
               </w:rPr>
-              <w:instrText xml:space="preserve"> PAGEREF _Toc243940853 \h </w:instrText>
+              <w:instrText xml:space="preserve"> PAGEREF _Toc243940953 \h </w:instrText>
             </w:r>
             <w:r>
               <w:rPr>
@@ -1751,7 +1545,7 @@
               <w14:ligatures w14:val="standardContextual"/>
             </w:rPr>
           </w:pPr>
-          <w:hyperlink w:anchor="_Toc243940854" w:history="1">
+          <w:hyperlink w:anchor="_Toc243940954" w:history="1">
             <w:r>
               <w:rPr>
                 <w:rStyle w:val="Hyperlink"/>
@@ -1775,7 +1569,7 @@
               <w:rPr>
                 <w:noProof/>
               </w:rPr>
-              <w:instrText xml:space="preserve"> PAGEREF _Toc243940854 \h </w:instrText>
+              <w:instrText xml:space="preserve"> PAGEREF _Toc243940954 \h </w:instrText>
             </w:r>
             <w:r>
               <w:rPr>
@@ -1817,7 +1611,7 @@
               <w14:ligatures w14:val="standardContextual"/>
             </w:rPr>
           </w:pPr>
-          <w:hyperlink w:anchor="_Toc243940855" w:history="1">
+          <w:hyperlink w:anchor="_Toc243940955" w:history="1">
             <w:r>
               <w:rPr>
                 <w:rStyle w:val="Hyperlink"/>
@@ -1841,7 +1635,7 @@
               <w:rPr>
                 <w:noProof/>
               </w:rPr>
-              <w:instrText xml:space="preserve"> PAGEREF _Toc243940855 \h </w:instrText>
+              <w:instrText xml:space="preserve"> PAGEREF _Toc243940955 \h </w:instrText>
             </w:r>
             <w:r>
               <w:rPr>
@@ -1883,7 +1677,7 @@
               <w14:ligatures w14:val="standardContextual"/>
             </w:rPr>
           </w:pPr>
-          <w:hyperlink w:anchor="_Toc243940856" w:history="1">
+          <w:hyperlink w:anchor="_Toc243940956" w:history="1">
             <w:r>
               <w:rPr>
                 <w:rStyle w:val="Hyperlink"/>
@@ -1907,7 +1701,7 @@
               <w:rPr>
                 <w:noProof/>
               </w:rPr>
-              <w:instrText xml:space="preserve"> PAGEREF _Toc243940856 \h </w:instrText>
+              <w:instrText xml:space="preserve"> PAGEREF _Toc243940956 \h </w:instrText>
             </w:r>
             <w:r>
               <w:rPr>
@@ -1949,7 +1743,7 @@
               <w14:ligatures w14:val="standardContextual"/>
             </w:rPr>
           </w:pPr>
-          <w:hyperlink w:anchor="_Toc243940857" w:history="1">
+          <w:hyperlink w:anchor="_Toc243940957" w:history="1">
             <w:r>
               <w:rPr>
                 <w:rStyle w:val="Hyperlink"/>
@@ -1973,7 +1767,7 @@
               <w:rPr>
                 <w:noProof/>
               </w:rPr>
-              <w:instrText xml:space="preserve"> PAGEREF _Toc243940857 \h </w:instrText>
+              <w:instrText xml:space="preserve"> PAGEREF _Toc243940957 \h </w:instrText>
             </w:r>
             <w:r>
               <w:rPr>
@@ -2015,7 +1809,7 @@
               <w14:ligatures w14:val="standardContextual"/>
             </w:rPr>
           </w:pPr>
-          <w:hyperlink w:anchor="_Toc243940858" w:history="1">
+          <w:hyperlink w:anchor="_Toc243940958" w:history="1">
             <w:r>
               <w:rPr>
                 <w:rStyle w:val="Hyperlink"/>
@@ -2039,7 +1833,7 @@
               <w:rPr>
                 <w:noProof/>
               </w:rPr>
-              <w:instrText xml:space="preserve"> PAGEREF _Toc243940858 \h </w:instrText>
+              <w:instrText xml:space="preserve"> PAGEREF _Toc243940958 \h </w:instrText>
             </w:r>
             <w:r>
               <w:rPr>
@@ -2081,7 +1875,7 @@
               <w14:ligatures w14:val="standardContextual"/>
             </w:rPr>
           </w:pPr>
-          <w:hyperlink w:anchor="_Toc243940859" w:history="1">
+          <w:hyperlink w:anchor="_Toc243940959" w:history="1">
             <w:r>
               <w:rPr>
                 <w:rStyle w:val="Hyperlink"/>
@@ -2105,7 +1899,7 @@
               <w:rPr>
                 <w:noProof/>
               </w:rPr>
-              <w:instrText xml:space="preserve"> PAGEREF _Toc243940859 \h </w:instrText>
+              <w:instrText xml:space="preserve"> PAGEREF _Toc243940959 \h </w:instrText>
             </w:r>
             <w:r>
               <w:rPr>
@@ -2147,7 +1941,7 @@
               <w14:ligatures w14:val="standardContextual"/>
             </w:rPr>
           </w:pPr>
-          <w:hyperlink w:anchor="_Toc243940860" w:history="1">
+          <w:hyperlink w:anchor="_Toc243940960" w:history="1">
             <w:r>
               <w:rPr>
                 <w:rStyle w:val="Hyperlink"/>
@@ -2171,7 +1965,7 @@
               <w:rPr>
                 <w:noProof/>
               </w:rPr>
-              <w:instrText xml:space="preserve"> PAGEREF _Toc243940860 \h </w:instrText>
+              <w:instrText xml:space="preserve"> PAGEREF _Toc243940960 \h </w:instrText>
             </w:r>
             <w:r>
               <w:rPr>
@@ -2213,7 +2007,7 @@
               <w14:ligatures w14:val="standardContextual"/>
             </w:rPr>
           </w:pPr>
-          <w:hyperlink w:anchor="_Toc243940861" w:history="1">
+          <w:hyperlink w:anchor="_Toc243940961" w:history="1">
             <w:r>
               <w:rPr>
                 <w:rStyle w:val="Hyperlink"/>
@@ -2237,7 +2031,7 @@
               <w:rPr>
                 <w:noProof/>
               </w:rPr>
-              <w:instrText xml:space="preserve"> PAGEREF _Toc243940861 \h </w:instrText>
+              <w:instrText xml:space="preserve"> PAGEREF _Toc243940961 \h </w:instrText>
             </w:r>
             <w:r>
               <w:rPr>
@@ -2279,7 +2073,7 @@
               <w14:ligatures w14:val="standardContextual"/>
             </w:rPr>
           </w:pPr>
-          <w:hyperlink w:anchor="_Toc243940862" w:history="1">
+          <w:hyperlink w:anchor="_Toc243940962" w:history="1">
             <w:r>
               <w:rPr>
                 <w:rStyle w:val="Hyperlink"/>
@@ -2303,7 +2097,7 @@
               <w:rPr>
                 <w:noProof/>
               </w:rPr>
-              <w:instrText xml:space="preserve"> PAGEREF _Toc243940862 \h </w:instrText>
+              <w:instrText xml:space="preserve"> PAGEREF _Toc243940962 \h </w:instrText>
             </w:r>
             <w:r>
               <w:rPr>
@@ -2345,7 +2139,7 @@
               <w14:ligatures w14:val="standardContextual"/>
             </w:rPr>
           </w:pPr>
-          <w:hyperlink w:anchor="_Toc243940863" w:history="1">
+          <w:hyperlink w:anchor="_Toc243940963" w:history="1">
             <w:r>
               <w:rPr>
                 <w:rStyle w:val="Hyperlink"/>
@@ -2369,7 +2163,7 @@
               <w:rPr>
                 <w:noProof/>
               </w:rPr>
-              <w:instrText xml:space="preserve"> PAGEREF _Toc243940863 \h </w:instrText>
+              <w:instrText xml:space="preserve"> PAGEREF _Toc243940963 \h </w:instrText>
             </w:r>
             <w:r>
               <w:rPr>
@@ -2411,7 +2205,7 @@
               <w14:ligatures w14:val="standardContextual"/>
             </w:rPr>
           </w:pPr>
-          <w:hyperlink w:anchor="_Toc243940864" w:history="1">
+          <w:hyperlink w:anchor="_Toc243940964" w:history="1">
             <w:r>
               <w:rPr>
                 <w:rStyle w:val="Hyperlink"/>
@@ -2435,7 +2229,7 @@
               <w:rPr>
                 <w:noProof/>
               </w:rPr>
-              <w:instrText xml:space="preserve"> PAGEREF _Toc243940864 \h </w:instrText>
+              <w:instrText xml:space="preserve"> PAGEREF _Toc243940964 \h </w:instrText>
             </w:r>
             <w:r>
               <w:rPr>
@@ -2477,7 +2271,7 @@
               <w14:ligatures w14:val="standardContextual"/>
             </w:rPr>
           </w:pPr>
-          <w:hyperlink w:anchor="_Toc243940865" w:history="1">
+          <w:hyperlink w:anchor="_Toc243940965" w:history="1">
             <w:r>
               <w:rPr>
                 <w:rStyle w:val="Hyperlink"/>
@@ -2501,7 +2295,7 @@
               <w:rPr>
                 <w:noProof/>
               </w:rPr>
-              <w:instrText xml:space="preserve"> PAGEREF _Toc243940865 \h </w:instrText>
+              <w:instrText xml:space="preserve"> PAGEREF _Toc243940965 \h </w:instrText>
             </w:r>
             <w:r>
               <w:rPr>
@@ -2543,7 +2337,7 @@
               <w14:ligatures w14:val="standardContextual"/>
             </w:rPr>
           </w:pPr>
-          <w:hyperlink w:anchor="_Toc243940866" w:history="1">
+          <w:hyperlink w:anchor="_Toc243940966" w:history="1">
             <w:r>
               <w:rPr>
                 <w:rStyle w:val="Hyperlink"/>
@@ -2567,7 +2361,7 @@
               <w:rPr>
                 <w:noProof/>
               </w:rPr>
-              <w:instrText xml:space="preserve"> PAGEREF _Toc243940866 \h </w:instrText>
+              <w:instrText xml:space="preserve"> PAGEREF _Toc243940966 \h </w:instrText>
             </w:r>
             <w:r>
               <w:rPr>
@@ -2609,7 +2403,7 @@
               <w14:ligatures w14:val="standardContextual"/>
             </w:rPr>
           </w:pPr>
-          <w:hyperlink w:anchor="_Toc243940867" w:history="1">
+          <w:hyperlink w:anchor="_Toc243940967" w:history="1">
             <w:r>
               <w:rPr>
                 <w:rStyle w:val="Hyperlink"/>
@@ -2633,7 +2427,7 @@
               <w:rPr>
                 <w:noProof/>
               </w:rPr>
-              <w:instrText xml:space="preserve"> PAGEREF _Toc243940867 \h </w:instrText>
+              <w:instrText xml:space="preserve"> PAGEREF _Toc243940967 \h </w:instrText>
             </w:r>
             <w:r>
               <w:rPr>
@@ -2675,7 +2469,7 @@
               <w14:ligatures w14:val="standardContextual"/>
             </w:rPr>
           </w:pPr>
-          <w:hyperlink w:anchor="_Toc243940868" w:history="1">
+          <w:hyperlink w:anchor="_Toc243940968" w:history="1">
             <w:r>
               <w:rPr>
                 <w:rStyle w:val="Hyperlink"/>
@@ -2699,7 +2493,7 @@
               <w:rPr>
                 <w:noProof/>
               </w:rPr>
-              <w:instrText xml:space="preserve"> PAGEREF _Toc243940868 \h </w:instrText>
+              <w:instrText xml:space="preserve"> PAGEREF _Toc243940968 \h </w:instrText>
             </w:r>
             <w:r>
               <w:rPr>
@@ -2741,7 +2535,7 @@
               <w14:ligatures w14:val="standardContextual"/>
             </w:rPr>
           </w:pPr>
-          <w:hyperlink w:anchor="_Toc243940869" w:history="1">
+          <w:hyperlink w:anchor="_Toc243940969" w:history="1">
             <w:r>
               <w:rPr>
                 <w:rStyle w:val="Hyperlink"/>
@@ -2765,7 +2559,7 @@
               <w:rPr>
                 <w:noProof/>
               </w:rPr>
-              <w:instrText xml:space="preserve"> PAGEREF _Toc243940869 \h </w:instrText>
+              <w:instrText xml:space="preserve"> PAGEREF _Toc243940969 \h </w:instrText>
             </w:r>
             <w:r>
               <w:rPr>
@@ -2807,7 +2601,7 @@
               <w14:ligatures w14:val="standardContextual"/>
             </w:rPr>
           </w:pPr>
-          <w:hyperlink w:anchor="_Toc243940870" w:history="1">
+          <w:hyperlink w:anchor="_Toc243940970" w:history="1">
             <w:r>
               <w:rPr>
                 <w:rStyle w:val="Hyperlink"/>
@@ -2831,7 +2625,7 @@
               <w:rPr>
                 <w:noProof/>
               </w:rPr>
-              <w:instrText xml:space="preserve"> PAGEREF _Toc243940870 \h </w:instrText>
+              <w:instrText xml:space="preserve"> PAGEREF _Toc243940970 \h </w:instrText>
             </w:r>
             <w:r>
               <w:rPr>
@@ -2873,7 +2667,7 @@
               <w14:ligatures w14:val="standardContextual"/>
             </w:rPr>
           </w:pPr>
-          <w:hyperlink w:anchor="_Toc243940871" w:history="1">
+          <w:hyperlink w:anchor="_Toc243940971" w:history="1">
             <w:r>
               <w:rPr>
                 <w:rStyle w:val="Hyperlink"/>
@@ -2897,7 +2691,7 @@
               <w:rPr>
                 <w:noProof/>
               </w:rPr>
-              <w:instrText xml:space="preserve"> PAGEREF _Toc243940871 \h </w:instrText>
+              <w:instrText xml:space="preserve"> PAGEREF _Toc243940971 \h </w:instrText>
             </w:r>
             <w:r>
               <w:rPr>
@@ -2939,7 +2733,7 @@
               <w14:ligatures w14:val="standardContextual"/>
             </w:rPr>
           </w:pPr>
-          <w:hyperlink w:anchor="_Toc243940872" w:history="1">
+          <w:hyperlink w:anchor="_Toc243940972" w:history="1">
             <w:r>
               <w:rPr>
                 <w:rStyle w:val="Hyperlink"/>
@@ -2963,7 +2757,7 @@
               <w:rPr>
                 <w:noProof/>
               </w:rPr>
-              <w:instrText xml:space="preserve"> PAGEREF _Toc243940872 \h </w:instrText>
+              <w:instrText xml:space="preserve"> PAGEREF _Toc243940972 \h </w:instrText>
             </w:r>
             <w:r>
               <w:rPr>
@@ -3005,7 +2799,7 @@
               <w14:ligatures w14:val="standardContextual"/>
             </w:rPr>
           </w:pPr>
-          <w:hyperlink w:anchor="_Toc243940873" w:history="1">
+          <w:hyperlink w:anchor="_Toc243940973" w:history="1">
             <w:r>
               <w:rPr>
                 <w:rStyle w:val="Hyperlink"/>
@@ -3029,7 +2823,7 @@
               <w:rPr>
                 <w:noProof/>
               </w:rPr>
-              <w:instrText xml:space="preserve"> PAGEREF _Toc243940873 \h </w:instrText>
+              <w:instrText xml:space="preserve"> PAGEREF _Toc243940973 \h </w:instrText>
             </w:r>
             <w:r>
               <w:rPr>
@@ -3071,7 +2865,7 @@
               <w14:ligatures w14:val="standardContextual"/>
             </w:rPr>
           </w:pPr>
-          <w:hyperlink w:anchor="_Toc243940874" w:history="1">
+          <w:hyperlink w:anchor="_Toc243940974" w:history="1">
             <w:r>
               <w:rPr>
                 <w:rStyle w:val="Hyperlink"/>
@@ -3095,7 +2889,7 @@
               <w:rPr>
                 <w:noProof/>
               </w:rPr>
-              <w:instrText xml:space="preserve"> PAGEREF _Toc243940874 \h </w:instrText>
+              <w:instrText xml:space="preserve"> PAGEREF _Toc243940974 \h </w:instrText>
             </w:r>
             <w:r>
               <w:rPr>
@@ -3137,7 +2931,7 @@
               <w14:ligatures w14:val="standardContextual"/>
             </w:rPr>
           </w:pPr>
-          <w:hyperlink w:anchor="_Toc243940875" w:history="1">
+          <w:hyperlink w:anchor="_Toc243940975" w:history="1">
             <w:r>
               <w:rPr>
                 <w:rStyle w:val="Hyperlink"/>
@@ -3161,7 +2955,7 @@
               <w:rPr>
                 <w:noProof/>
               </w:rPr>
-              <w:instrText xml:space="preserve"> PAGEREF _Toc243940875 \h </w:instrText>
+              <w:instrText xml:space="preserve"> PAGEREF _Toc243940975 \h </w:instrText>
             </w:r>
             <w:r>
               <w:rPr>
@@ -3203,7 +2997,7 @@
               <w14:ligatures w14:val="standardContextual"/>
             </w:rPr>
           </w:pPr>
-          <w:hyperlink w:anchor="_Toc243940876" w:history="1">
+          <w:hyperlink w:anchor="_Toc243940976" w:history="1">
             <w:r>
               <w:rPr>
                 <w:rStyle w:val="Hyperlink"/>
@@ -3227,7 +3021,7 @@
               <w:rPr>
                 <w:noProof/>
               </w:rPr>
-              <w:instrText xml:space="preserve"> PAGEREF _Toc243940876 \h </w:instrText>
+              <w:instrText xml:space="preserve"> PAGEREF _Toc243940976 \h </w:instrText>
             </w:r>
             <w:r>
               <w:rPr>
@@ -3269,7 +3063,7 @@
               <w14:ligatures w14:val="standardContextual"/>
             </w:rPr>
           </w:pPr>
-          <w:hyperlink w:anchor="_Toc243940877" w:history="1">
+          <w:hyperlink w:anchor="_Toc243940977" w:history="1">
             <w:r>
               <w:rPr>
                 <w:rStyle w:val="Hyperlink"/>
@@ -3293,7 +3087,7 @@
               <w:rPr>
                 <w:noProof/>
               </w:rPr>
-              <w:instrText xml:space="preserve"> PAGEREF _Toc243940877 \h </w:instrText>
+              <w:instrText xml:space="preserve"> PAGEREF _Toc243940977 \h </w:instrText>
             </w:r>
             <w:r>
               <w:rPr>
@@ -3335,7 +3129,7 @@
               <w14:ligatures w14:val="standardContextual"/>
             </w:rPr>
           </w:pPr>
-          <w:hyperlink w:anchor="_Toc243940878" w:history="1">
+          <w:hyperlink w:anchor="_Toc243940978" w:history="1">
             <w:r>
               <w:rPr>
                 <w:rStyle w:val="Hyperlink"/>
@@ -3359,7 +3153,7 @@
               <w:rPr>
                 <w:noProof/>
               </w:rPr>
-              <w:instrText xml:space="preserve"> PAGEREF _Toc243940878 \h </w:instrText>
+              <w:instrText xml:space="preserve"> PAGEREF _Toc243940978 \h </w:instrText>
             </w:r>
             <w:r>
               <w:rPr>
@@ -3401,7 +3195,7 @@
               <w14:ligatures w14:val="standardContextual"/>
             </w:rPr>
           </w:pPr>
-          <w:hyperlink w:anchor="_Toc243940879" w:history="1">
+          <w:hyperlink w:anchor="_Toc243940979" w:history="1">
             <w:r>
               <w:rPr>
                 <w:rStyle w:val="Hyperlink"/>
@@ -3425,7 +3219,7 @@
               <w:rPr>
                 <w:noProof/>
               </w:rPr>
-              <w:instrText xml:space="preserve"> PAGEREF _Toc243940879 \h </w:instrText>
+              <w:instrText xml:space="preserve"> PAGEREF _Toc243940979 \h </w:instrText>
             </w:r>
             <w:r>
               <w:rPr>
@@ -3467,7 +3261,7 @@
               <w14:ligatures w14:val="standardContextual"/>
             </w:rPr>
           </w:pPr>
-          <w:hyperlink w:anchor="_Toc243940880" w:history="1">
+          <w:hyperlink w:anchor="_Toc243940980" w:history="1">
             <w:r>
               <w:rPr>
                 <w:rStyle w:val="Hyperlink"/>
@@ -3491,7 +3285,7 @@
               <w:rPr>
                 <w:noProof/>
               </w:rPr>
-              <w:instrText xml:space="preserve"> PAGEREF _Toc243940880 \h </w:instrText>
+              <w:instrText xml:space="preserve"> PAGEREF _Toc243940980 \h </w:instrText>
             </w:r>
             <w:r>
               <w:rPr>
@@ -3533,7 +3327,7 @@
               <w14:ligatures w14:val="standardContextual"/>
             </w:rPr>
           </w:pPr>
-          <w:hyperlink w:anchor="_Toc243940881" w:history="1">
+          <w:hyperlink w:anchor="_Toc243940981" w:history="1">
             <w:r>
               <w:rPr>
                 <w:rStyle w:val="Hyperlink"/>
@@ -3557,7 +3351,7 @@
               <w:rPr>
                 <w:noProof/>
               </w:rPr>
-              <w:instrText xml:space="preserve"> PAGEREF _Toc243940881 \h </w:instrText>
+              <w:instrText xml:space="preserve"> PAGEREF _Toc243940981 \h </w:instrText>
             </w:r>
             <w:r>
               <w:rPr>
@@ -3599,7 +3393,7 @@
               <w14:ligatures w14:val="standardContextual"/>
             </w:rPr>
           </w:pPr>
-          <w:hyperlink w:anchor="_Toc243940882" w:history="1">
+          <w:hyperlink w:anchor="_Toc243940982" w:history="1">
             <w:r>
               <w:rPr>
                 <w:rStyle w:val="Hyperlink"/>
@@ -3623,7 +3417,7 @@
               <w:rPr>
                 <w:noProof/>
               </w:rPr>
-              <w:instrText xml:space="preserve"> PAGEREF _Toc243940882 \h </w:instrText>
+              <w:instrText xml:space="preserve"> PAGEREF _Toc243940982 \h </w:instrText>
             </w:r>
             <w:r>
               <w:rPr>
@@ -3665,7 +3459,7 @@
               <w14:ligatures w14:val="standardContextual"/>
             </w:rPr>
           </w:pPr>
-          <w:hyperlink w:anchor="_Toc243940883" w:history="1">
+          <w:hyperlink w:anchor="_Toc243940983" w:history="1">
             <w:r>
               <w:rPr>
                 <w:rStyle w:val="Hyperlink"/>
@@ -3689,7 +3483,7 @@
               <w:rPr>
                 <w:noProof/>
               </w:rPr>
-              <w:instrText xml:space="preserve"> PAGEREF _Toc243940883 \h </w:instrText>
+              <w:instrText xml:space="preserve"> PAGEREF _Toc243940983 \h </w:instrText>
             </w:r>
             <w:r>
               <w:rPr>
@@ -3731,7 +3525,7 @@
               <w14:ligatures w14:val="standardContextual"/>
             </w:rPr>
           </w:pPr>
-          <w:hyperlink w:anchor="_Toc243940884" w:history="1">
+          <w:hyperlink w:anchor="_Toc243940984" w:history="1">
             <w:r>
               <w:rPr>
                 <w:rStyle w:val="Hyperlink"/>
@@ -3755,7 +3549,7 @@
               <w:rPr>
                 <w:noProof/>
               </w:rPr>
-              <w:instrText xml:space="preserve"> PAGEREF _Toc243940884 \h </w:instrText>
+              <w:instrText xml:space="preserve"> PAGEREF _Toc243940984 \h </w:instrText>
             </w:r>
             <w:r>
               <w:rPr>
@@ -3797,7 +3591,7 @@
               <w14:ligatures w14:val="standardContextual"/>
             </w:rPr>
           </w:pPr>
-          <w:hyperlink w:anchor="_Toc243940885" w:history="1">
+          <w:hyperlink w:anchor="_Toc243940985" w:history="1">
             <w:r>
               <w:rPr>
                 <w:rStyle w:val="Hyperlink"/>
@@ -3821,7 +3615,7 @@
               <w:rPr>
                 <w:noProof/>
               </w:rPr>
-              <w:instrText xml:space="preserve"> PAGEREF _Toc243940885 \h </w:instrText>
+              <w:instrText xml:space="preserve"> PAGEREF _Toc243940985 \h </w:instrText>
             </w:r>
             <w:r>
               <w:rPr>
@@ -3863,7 +3657,7 @@
               <w14:ligatures w14:val="standardContextual"/>
             </w:rPr>
           </w:pPr>
-          <w:hyperlink w:anchor="_Toc243940886" w:history="1">
+          <w:hyperlink w:anchor="_Toc243940986" w:history="1">
             <w:r>
               <w:rPr>
                 <w:rStyle w:val="Hyperlink"/>
@@ -3887,7 +3681,7 @@
               <w:rPr>
                 <w:noProof/>
               </w:rPr>
-              <w:instrText xml:space="preserve"> PAGEREF _Toc243940886 \h </w:instrText>
+              <w:instrText xml:space="preserve"> PAGEREF _Toc243940986 \h </w:instrText>
             </w:r>
             <w:r>
               <w:rPr>
@@ -3929,7 +3723,7 @@
               <w14:ligatures w14:val="standardContextual"/>
             </w:rPr>
           </w:pPr>
-          <w:hyperlink w:anchor="_Toc243940887" w:history="1">
+          <w:hyperlink w:anchor="_Toc243940987" w:history="1">
             <w:r>
               <w:rPr>
                 <w:rStyle w:val="Hyperlink"/>
@@ -3953,7 +3747,7 @@
               <w:rPr>
                 <w:noProof/>
               </w:rPr>
-              <w:instrText xml:space="preserve"> PAGEREF _Toc243940887 \h </w:instrText>
+              <w:instrText xml:space="preserve"> PAGEREF _Toc243940987 \h </w:instrText>
             </w:r>
             <w:r>
               <w:rPr>
@@ -3995,7 +3789,7 @@
               <w14:ligatures w14:val="standardContextual"/>
             </w:rPr>
           </w:pPr>
-          <w:hyperlink w:anchor="_Toc243940888" w:history="1">
+          <w:hyperlink w:anchor="_Toc243940988" w:history="1">
             <w:r>
               <w:rPr>
                 <w:rStyle w:val="Hyperlink"/>
@@ -4019,7 +3813,7 @@
               <w:rPr>
                 <w:noProof/>
               </w:rPr>
-              <w:instrText xml:space="preserve"> PAGEREF _Toc243940888 \h </w:instrText>
+              <w:instrText xml:space="preserve"> PAGEREF _Toc243940988 \h </w:instrText>
             </w:r>
             <w:r>
               <w:rPr>
@@ -4061,7 +3855,7 @@
               <w14:ligatures w14:val="standardContextual"/>
             </w:rPr>
           </w:pPr>
-          <w:hyperlink w:anchor="_Toc243940889" w:history="1">
+          <w:hyperlink w:anchor="_Toc243940989" w:history="1">
             <w:r>
               <w:rPr>
                 <w:rStyle w:val="Hyperlink"/>
@@ -4085,7 +3879,7 @@
               <w:rPr>
                 <w:noProof/>
               </w:rPr>
-              <w:instrText xml:space="preserve"> PAGEREF _Toc243940889 \h </w:instrText>
+              <w:instrText xml:space="preserve"> PAGEREF _Toc243940989 \h </w:instrText>
             </w:r>
             <w:r>
               <w:rPr>
@@ -4127,7 +3921,7 @@
               <w14:ligatures w14:val="standardContextual"/>
             </w:rPr>
           </w:pPr>
-          <w:hyperlink w:anchor="_Toc243940890" w:history="1">
+          <w:hyperlink w:anchor="_Toc243940990" w:history="1">
             <w:r>
               <w:rPr>
                 <w:rStyle w:val="Hyperlink"/>
@@ -4151,7 +3945,7 @@
               <w:rPr>
                 <w:noProof/>
               </w:rPr>
-              <w:instrText xml:space="preserve"> PAGEREF _Toc243940890 \h </w:instrText>
+              <w:instrText xml:space="preserve"> PAGEREF _Toc243940990 \h </w:instrText>
             </w:r>
             <w:r>
               <w:rPr>
@@ -4193,7 +3987,7 @@
               <w14:ligatures w14:val="standardContextual"/>
             </w:rPr>
           </w:pPr>
-          <w:hyperlink w:anchor="_Toc243940891" w:history="1">
+          <w:hyperlink w:anchor="_Toc243940991" w:history="1">
             <w:r>
               <w:rPr>
                 <w:rStyle w:val="Hyperlink"/>
@@ -4217,7 +4011,7 @@
               <w:rPr>
                 <w:noProof/>
               </w:rPr>
-              <w:instrText xml:space="preserve"> PAGEREF _Toc243940891 \h </w:instrText>
+              <w:instrText xml:space="preserve"> PAGEREF _Toc243940991 \h </w:instrText>
             </w:r>
             <w:r>
               <w:rPr>
@@ -4259,7 +4053,7 @@
               <w14:ligatures w14:val="standardContextual"/>
             </w:rPr>
           </w:pPr>
-          <w:hyperlink w:anchor="_Toc243940892" w:history="1">
+          <w:hyperlink w:anchor="_Toc243940992" w:history="1">
             <w:r>
               <w:rPr>
                 <w:rStyle w:val="Hyperlink"/>
@@ -4283,7 +4077,7 @@
               <w:rPr>
                 <w:noProof/>
               </w:rPr>
-              <w:instrText xml:space="preserve"> PAGEREF _Toc243940892 \h </w:instrText>
+              <w:instrText xml:space="preserve"> PAGEREF _Toc243940992 \h </w:instrText>
             </w:r>
             <w:r>
               <w:rPr>
@@ -4325,7 +4119,7 @@
               <w14:ligatures w14:val="standardContextual"/>
             </w:rPr>
           </w:pPr>
-          <w:hyperlink w:anchor="_Toc243940893" w:history="1">
+          <w:hyperlink w:anchor="_Toc243940993" w:history="1">
             <w:r>
               <w:rPr>
                 <w:rStyle w:val="Hyperlink"/>
@@ -4349,7 +4143,7 @@
               <w:rPr>
                 <w:noProof/>
               </w:rPr>
-              <w:instrText xml:space="preserve"> PAGEREF _Toc243940893 \h </w:instrText>
+              <w:instrText xml:space="preserve"> PAGEREF _Toc243940993 \h </w:instrText>
             </w:r>
             <w:r>
               <w:rPr>
@@ -4391,7 +4185,7 @@
               <w14:ligatures w14:val="standardContextual"/>
             </w:rPr>
           </w:pPr>
-          <w:hyperlink w:anchor="_Toc243940894" w:history="1">
+          <w:hyperlink w:anchor="_Toc243940994" w:history="1">
             <w:r>
               <w:rPr>
                 <w:rStyle w:val="Hyperlink"/>
@@ -4415,7 +4209,7 @@
               <w:rPr>
                 <w:noProof/>
               </w:rPr>
-              <w:instrText xml:space="preserve"> PAGEREF _Toc243940894 \h </w:instrText>
+              <w:instrText xml:space="preserve"> PAGEREF _Toc243940994 \h </w:instrText>
             </w:r>
             <w:r>
               <w:rPr>
@@ -4457,7 +4251,7 @@
               <w14:ligatures w14:val="standardContextual"/>
             </w:rPr>
           </w:pPr>
-          <w:hyperlink w:anchor="_Toc243940895" w:history="1">
+          <w:hyperlink w:anchor="_Toc243940995" w:history="1">
             <w:r>
               <w:rPr>
                 <w:rStyle w:val="Hyperlink"/>
@@ -4481,7 +4275,7 @@
               <w:rPr>
                 <w:noProof/>
               </w:rPr>
-              <w:instrText xml:space="preserve"> PAGEREF _Toc243940895 \h </w:instrText>
+              <w:instrText xml:space="preserve"> PAGEREF _Toc243940995 \h </w:instrText>
             </w:r>
             <w:r>
               <w:rPr>
@@ -4523,7 +4317,7 @@
               <w14:ligatures w14:val="standardContextual"/>
             </w:rPr>
           </w:pPr>
-          <w:hyperlink w:anchor="_Toc243940896" w:history="1">
+          <w:hyperlink w:anchor="_Toc243940996" w:history="1">
             <w:r>
               <w:rPr>
                 <w:rStyle w:val="Hyperlink"/>
@@ -4547,7 +4341,7 @@
               <w:rPr>
                 <w:noProof/>
               </w:rPr>
-              <w:instrText xml:space="preserve"> PAGEREF _Toc243940896 \h </w:instrText>
+              <w:instrText xml:space="preserve"> PAGEREF _Toc243940996 \h </w:instrText>
             </w:r>
             <w:r>
               <w:rPr>
@@ -4589,7 +4383,7 @@
               <w14:ligatures w14:val="standardContextual"/>
             </w:rPr>
           </w:pPr>
-          <w:hyperlink w:anchor="_Toc243940897" w:history="1">
+          <w:hyperlink w:anchor="_Toc243940997" w:history="1">
             <w:r>
               <w:rPr>
                 <w:rStyle w:val="Hyperlink"/>
@@ -4613,7 +4407,7 @@
               <w:rPr>
                 <w:noProof/>
               </w:rPr>
-              <w:instrText xml:space="preserve"> PAGEREF _Toc243940897 \h </w:instrText>
+              <w:instrText xml:space="preserve"> PAGEREF _Toc243940997 \h </w:instrText>
             </w:r>
             <w:r>
               <w:rPr>
@@ -4655,7 +4449,7 @@
               <w14:ligatures w14:val="standardContextual"/>
             </w:rPr>
           </w:pPr>
-          <w:hyperlink w:anchor="_Toc243940898" w:history="1">
+          <w:hyperlink w:anchor="_Toc243940998" w:history="1">
             <w:r>
               <w:rPr>
                 <w:rStyle w:val="Hyperlink"/>
@@ -4679,7 +4473,7 @@
               <w:rPr>
                 <w:noProof/>
               </w:rPr>
-              <w:instrText xml:space="preserve"> PAGEREF _Toc243940898 \h </w:instrText>
+              <w:instrText xml:space="preserve"> PAGEREF _Toc243940998 \h </w:instrText>
             </w:r>
             <w:r>
               <w:rPr>
@@ -4721,7 +4515,7 @@
               <w14:ligatures w14:val="standardContextual"/>
             </w:rPr>
           </w:pPr>
-          <w:hyperlink w:anchor="_Toc243940899" w:history="1">
+          <w:hyperlink w:anchor="_Toc243940999" w:history="1">
             <w:r>
               <w:rPr>
                 <w:rStyle w:val="Hyperlink"/>
@@ -4745,7 +4539,7 @@
               <w:rPr>
                 <w:noProof/>
               </w:rPr>
-              <w:instrText xml:space="preserve"> PAGEREF _Toc243940899 \h </w:instrText>
+              <w:instrText xml:space="preserve"> PAGEREF _Toc243940999 \h </w:instrText>
             </w:r>
             <w:r>
               <w:rPr>
@@ -4787,7 +4581,7 @@
               <w14:ligatures w14:val="standardContextual"/>
             </w:rPr>
           </w:pPr>
-          <w:hyperlink w:anchor="_Toc243940900" w:history="1">
+          <w:hyperlink w:anchor="_Toc243941000" w:history="1">
             <w:r>
               <w:rPr>
                 <w:rStyle w:val="Hyperlink"/>
@@ -4811,7 +4605,7 @@
               <w:rPr>
                 <w:noProof/>
               </w:rPr>
-              <w:instrText xml:space="preserve"> PAGEREF _Toc243940900 \h </w:instrText>
+              <w:instrText xml:space="preserve"> PAGEREF _Toc243941000 \h </w:instrText>
             </w:r>
             <w:r>
               <w:rPr>
@@ -4853,7 +4647,7 @@
               <w14:ligatures w14:val="standardContextual"/>
             </w:rPr>
           </w:pPr>
-          <w:hyperlink w:anchor="_Toc243940901" w:history="1">
+          <w:hyperlink w:anchor="_Toc243941001" w:history="1">
             <w:r>
               <w:rPr>
                 <w:rStyle w:val="Hyperlink"/>
@@ -4877,7 +4671,7 @@
               <w:rPr>
                 <w:noProof/>
               </w:rPr>
-              <w:instrText xml:space="preserve"> PAGEREF _Toc243940901 \h </w:instrText>
+              <w:instrText xml:space="preserve"> PAGEREF _Toc243941001 \h </w:instrText>
             </w:r>
             <w:r>
               <w:rPr>
@@ -4916,7 +4710,7 @@
         <w:pStyle w:val="Heading1"/>
         <w:pageBreakBefore/>
       </w:pPr>
-      <w:bookmarkStart w:id="3" w:name="_Toc243940838"/>
+      <w:bookmarkStart w:id="3" w:name="_Toc243940938"/>
       <w:r>
         <w:lastRenderedPageBreak/>
         <w:t>LIST OF FIGURES</w:t>
@@ -4926,7 +4720,7 @@
     <w:sdt>
       <w:sdtPr>
         <w:alias w:val="List of Figures"/>
-        <w:id w:val="512968171"/>
+        <w:id w:val="-1504589822"/>
       </w:sdtPr>
       <w:sdtEndPr/>
       <w:sdtContent>
@@ -4949,7 +4743,7 @@
           <w:r>
             <w:fldChar w:fldCharType="separate"/>
           </w:r>
-          <w:hyperlink w:anchor="_Toc243940743" w:history="1">
+          <w:hyperlink w:anchor="_Toc243940843" w:history="1">
             <w:r>
               <w:rPr>
                 <w:rStyle w:val="Hyperlink"/>
@@ -4973,7 +4767,7 @@
               <w:rPr>
                 <w:noProof/>
               </w:rPr>
-              <w:instrText xml:space="preserve"> PAGEREF _Toc243940743 \h </w:instrText>
+              <w:instrText xml:space="preserve"> PAGEREF _Toc243940843 \h </w:instrText>
             </w:r>
             <w:r>
               <w:rPr>
@@ -5010,7 +4804,7 @@
               <w:noProof/>
             </w:rPr>
           </w:pPr>
-          <w:hyperlink w:anchor="_Toc243940744" w:history="1">
+          <w:hyperlink w:anchor="_Toc243940844" w:history="1">
             <w:r>
               <w:rPr>
                 <w:rStyle w:val="Hyperlink"/>
@@ -5034,7 +4828,7 @@
               <w:rPr>
                 <w:noProof/>
               </w:rPr>
-              <w:instrText xml:space="preserve"> PAGEREF _Toc243940744 \h </w:instrText>
+              <w:instrText xml:space="preserve"> PAGEREF _Toc243940844 \h </w:instrText>
             </w:r>
             <w:r>
               <w:rPr>
@@ -5071,7 +4865,7 @@
               <w:noProof/>
             </w:rPr>
           </w:pPr>
-          <w:hyperlink w:anchor="_Toc243940745" w:history="1">
+          <w:hyperlink w:anchor="_Toc243940845" w:history="1">
             <w:r>
               <w:rPr>
                 <w:rStyle w:val="Hyperlink"/>
@@ -5095,7 +4889,7 @@
               <w:rPr>
                 <w:noProof/>
               </w:rPr>
-              <w:instrText xml:space="preserve"> PAGEREF _Toc243940745 \h </w:instrText>
+              <w:instrText xml:space="preserve"> PAGEREF _Toc243940845 \h </w:instrText>
             </w:r>
             <w:r>
               <w:rPr>
@@ -5132,7 +4926,7 @@
               <w:noProof/>
             </w:rPr>
           </w:pPr>
-          <w:hyperlink w:anchor="_Toc243940746" w:history="1">
+          <w:hyperlink w:anchor="_Toc243940846" w:history="1">
             <w:r>
               <w:rPr>
                 <w:rStyle w:val="Hyperlink"/>
@@ -5156,7 +4950,7 @@
               <w:rPr>
                 <w:noProof/>
               </w:rPr>
-              <w:instrText xml:space="preserve"> PAGEREF _Toc243940746 \h </w:instrText>
+              <w:instrText xml:space="preserve"> PAGEREF _Toc243940846 \h </w:instrText>
             </w:r>
             <w:r>
               <w:rPr>
@@ -5193,7 +4987,7 @@
               <w:noProof/>
             </w:rPr>
           </w:pPr>
-          <w:hyperlink w:anchor="_Toc243940747" w:history="1">
+          <w:hyperlink w:anchor="_Toc243940847" w:history="1">
             <w:r>
               <w:rPr>
                 <w:rStyle w:val="Hyperlink"/>
@@ -5217,7 +5011,7 @@
               <w:rPr>
                 <w:noProof/>
               </w:rPr>
-              <w:instrText xml:space="preserve"> PAGEREF _Toc243940747 \h </w:instrText>
+              <w:instrText xml:space="preserve"> PAGEREF _Toc243940847 \h </w:instrText>
             </w:r>
             <w:r>
               <w:rPr>
@@ -5254,7 +5048,7 @@
               <w:noProof/>
             </w:rPr>
           </w:pPr>
-          <w:hyperlink w:anchor="_Toc243940748" w:history="1">
+          <w:hyperlink w:anchor="_Toc243940848" w:history="1">
             <w:r>
               <w:rPr>
                 <w:rStyle w:val="Hyperlink"/>
@@ -5278,7 +5072,7 @@
               <w:rPr>
                 <w:noProof/>
               </w:rPr>
-              <w:instrText xml:space="preserve"> PAGEREF _Toc243940748 \h </w:instrText>
+              <w:instrText xml:space="preserve"> PAGEREF _Toc243940848 \h </w:instrText>
             </w:r>
             <w:r>
               <w:rPr>
@@ -5315,7 +5109,7 @@
               <w:noProof/>
             </w:rPr>
           </w:pPr>
-          <w:hyperlink w:anchor="_Toc243940749" w:history="1">
+          <w:hyperlink w:anchor="_Toc243940849" w:history="1">
             <w:r>
               <w:rPr>
                 <w:rStyle w:val="Hyperlink"/>
@@ -5339,7 +5133,7 @@
               <w:rPr>
                 <w:noProof/>
               </w:rPr>
-              <w:instrText xml:space="preserve"> PAGEREF _Toc243940749 \h </w:instrText>
+              <w:instrText xml:space="preserve"> PAGEREF _Toc243940849 \h </w:instrText>
             </w:r>
             <w:r>
               <w:rPr>
@@ -5376,7 +5170,7 @@
               <w:noProof/>
             </w:rPr>
           </w:pPr>
-          <w:hyperlink w:anchor="_Toc243940750" w:history="1">
+          <w:hyperlink w:anchor="_Toc243940850" w:history="1">
             <w:r>
               <w:rPr>
                 <w:rStyle w:val="Hyperlink"/>
@@ -5400,7 +5194,7 @@
               <w:rPr>
                 <w:noProof/>
               </w:rPr>
-              <w:instrText xml:space="preserve"> PAGEREF _Toc243940750 \h </w:instrText>
+              <w:instrText xml:space="preserve"> PAGEREF _Toc243940850 \h </w:instrText>
             </w:r>
             <w:r>
               <w:rPr>
@@ -5437,7 +5231,7 @@
               <w:noProof/>
             </w:rPr>
           </w:pPr>
-          <w:hyperlink w:anchor="_Toc243940751" w:history="1">
+          <w:hyperlink w:anchor="_Toc243940851" w:history="1">
             <w:r>
               <w:rPr>
                 <w:rStyle w:val="Hyperlink"/>
@@ -5461,7 +5255,7 @@
               <w:rPr>
                 <w:noProof/>
               </w:rPr>
-              <w:instrText xml:space="preserve"> PAGEREF _Toc243940751 \h </w:instrText>
+              <w:instrText xml:space="preserve"> PAGEREF _Toc243940851 \h </w:instrText>
             </w:r>
             <w:r>
               <w:rPr>
@@ -5498,7 +5292,7 @@
               <w:noProof/>
             </w:rPr>
           </w:pPr>
-          <w:hyperlink w:anchor="_Toc243940752" w:history="1">
+          <w:hyperlink w:anchor="_Toc243940852" w:history="1">
             <w:r>
               <w:rPr>
                 <w:rStyle w:val="Hyperlink"/>
@@ -5522,7 +5316,7 @@
               <w:rPr>
                 <w:noProof/>
               </w:rPr>
-              <w:instrText xml:space="preserve"> PAGEREF _Toc243940752 \h </w:instrText>
+              <w:instrText xml:space="preserve"> PAGEREF _Toc243940852 \h </w:instrText>
             </w:r>
             <w:r>
               <w:rPr>
@@ -5559,7 +5353,7 @@
               <w:noProof/>
             </w:rPr>
           </w:pPr>
-          <w:hyperlink w:anchor="_Toc243940753" w:history="1">
+          <w:hyperlink w:anchor="_Toc243940853" w:history="1">
             <w:r>
               <w:rPr>
                 <w:rStyle w:val="Hyperlink"/>
@@ -5583,7 +5377,7 @@
               <w:rPr>
                 <w:noProof/>
               </w:rPr>
-              <w:instrText xml:space="preserve"> PAGEREF _Toc243940753 \h </w:instrText>
+              <w:instrText xml:space="preserve"> PAGEREF _Toc243940853 \h </w:instrText>
             </w:r>
             <w:r>
               <w:rPr>
@@ -5620,7 +5414,7 @@
               <w:noProof/>
             </w:rPr>
           </w:pPr>
-          <w:hyperlink w:anchor="_Toc243940754" w:history="1">
+          <w:hyperlink w:anchor="_Toc243940854" w:history="1">
             <w:r>
               <w:rPr>
                 <w:rStyle w:val="Hyperlink"/>
@@ -5644,7 +5438,7 @@
               <w:rPr>
                 <w:noProof/>
               </w:rPr>
-              <w:instrText xml:space="preserve"> PAGEREF _Toc243940754 \h </w:instrText>
+              <w:instrText xml:space="preserve"> PAGEREF _Toc243940854 \h </w:instrText>
             </w:r>
             <w:r>
               <w:rPr>
@@ -5681,7 +5475,7 @@
               <w:noProof/>
             </w:rPr>
           </w:pPr>
-          <w:hyperlink w:anchor="_Toc243940755" w:history="1">
+          <w:hyperlink w:anchor="_Toc243940855" w:history="1">
             <w:r>
               <w:rPr>
                 <w:rStyle w:val="Hyperlink"/>
@@ -5705,7 +5499,7 @@
               <w:rPr>
                 <w:noProof/>
               </w:rPr>
-              <w:instrText xml:space="preserve"> PAGEREF _Toc243940755 \h </w:instrText>
+              <w:instrText xml:space="preserve"> PAGEREF _Toc243940855 \h </w:instrText>
             </w:r>
             <w:r>
               <w:rPr>
@@ -5742,7 +5536,7 @@
               <w:noProof/>
             </w:rPr>
           </w:pPr>
-          <w:hyperlink w:anchor="_Toc243940756" w:history="1">
+          <w:hyperlink w:anchor="_Toc243940856" w:history="1">
             <w:r>
               <w:rPr>
                 <w:rStyle w:val="Hyperlink"/>
@@ -5766,7 +5560,7 @@
               <w:rPr>
                 <w:noProof/>
               </w:rPr>
-              <w:instrText xml:space="preserve"> PAGEREF _Toc243940756 \h </w:instrText>
+              <w:instrText xml:space="preserve"> PAGEREF _Toc243940856 \h </w:instrText>
             </w:r>
             <w:r>
               <w:rPr>
@@ -5803,7 +5597,7 @@
               <w:noProof/>
             </w:rPr>
           </w:pPr>
-          <w:hyperlink w:anchor="_Toc243940757" w:history="1">
+          <w:hyperlink w:anchor="_Toc243940857" w:history="1">
             <w:r>
               <w:rPr>
                 <w:rStyle w:val="Hyperlink"/>
@@ -5827,7 +5621,7 @@
               <w:rPr>
                 <w:noProof/>
               </w:rPr>
-              <w:instrText xml:space="preserve"> PAGEREF _Toc243940757 \h </w:instrText>
+              <w:instrText xml:space="preserve"> PAGEREF _Toc243940857 \h </w:instrText>
             </w:r>
             <w:r>
               <w:rPr>
@@ -5864,7 +5658,7 @@
               <w:noProof/>
             </w:rPr>
           </w:pPr>
-          <w:hyperlink w:anchor="_Toc243940758" w:history="1">
+          <w:hyperlink w:anchor="_Toc243940858" w:history="1">
             <w:r>
               <w:rPr>
                 <w:rStyle w:val="Hyperlink"/>
@@ -5888,7 +5682,7 @@
               <w:rPr>
                 <w:noProof/>
               </w:rPr>
-              <w:instrText xml:space="preserve"> PAGEREF _Toc243940758 \h </w:instrText>
+              <w:instrText xml:space="preserve"> PAGEREF _Toc243940858 \h </w:instrText>
             </w:r>
             <w:r>
               <w:rPr>
@@ -5925,7 +5719,7 @@
               <w:noProof/>
             </w:rPr>
           </w:pPr>
-          <w:hyperlink w:anchor="_Toc243940759" w:history="1">
+          <w:hyperlink w:anchor="_Toc243940859" w:history="1">
             <w:r>
               <w:rPr>
                 <w:rStyle w:val="Hyperlink"/>
@@ -5949,7 +5743,7 @@
               <w:rPr>
                 <w:noProof/>
               </w:rPr>
-              <w:instrText xml:space="preserve"> PAGEREF _Toc243940759 \h </w:instrText>
+              <w:instrText xml:space="preserve"> PAGEREF _Toc243940859 \h </w:instrText>
             </w:r>
             <w:r>
               <w:rPr>
@@ -5986,7 +5780,7 @@
               <w:noProof/>
             </w:rPr>
           </w:pPr>
-          <w:hyperlink w:anchor="_Toc243940760" w:history="1">
+          <w:hyperlink w:anchor="_Toc243940860" w:history="1">
             <w:r>
               <w:rPr>
                 <w:rStyle w:val="Hyperlink"/>
@@ -6010,7 +5804,7 @@
               <w:rPr>
                 <w:noProof/>
               </w:rPr>
-              <w:instrText xml:space="preserve"> PAGEREF _Toc243940760 \h </w:instrText>
+              <w:instrText xml:space="preserve"> PAGEREF _Toc243940860 \h </w:instrText>
             </w:r>
             <w:r>
               <w:rPr>
@@ -6048,7 +5842,7 @@
       <w:pPr>
         <w:pStyle w:val="Heading2"/>
       </w:pPr>
-      <w:bookmarkStart w:id="4" w:name="_Toc243940839"/>
+      <w:bookmarkStart w:id="4" w:name="_Toc243940939"/>
       <w:r>
         <w:t>LIST OF TABLES</w:t>
       </w:r>
@@ -6057,7 +5851,7 @@
     <w:sdt>
       <w:sdtPr>
         <w:alias w:val="List of Tables"/>
-        <w:id w:val="-1498335637"/>
+        <w:id w:val="1266581827"/>
       </w:sdtPr>
       <w:sdtEndPr/>
       <w:sdtContent>
@@ -6085,7 +5879,7 @@
           <w:r>
             <w:fldChar w:fldCharType="separate"/>
           </w:r>
-          <w:hyperlink w:anchor="_Toc243940761" w:history="1">
+          <w:hyperlink w:anchor="_Toc243940861" w:history="1">
             <w:r>
               <w:rPr>
                 <w:rStyle w:val="Hyperlink"/>
@@ -6109,7 +5903,7 @@
               <w:rPr>
                 <w:noProof/>
               </w:rPr>
-              <w:instrText xml:space="preserve"> PAGEREF _Toc243940761 \h </w:instrText>
+              <w:instrText xml:space="preserve"> PAGEREF _Toc243940861 \h </w:instrText>
             </w:r>
             <w:r>
               <w:rPr>
@@ -6151,7 +5945,7 @@
               <w14:ligatures w14:val="standardContextual"/>
             </w:rPr>
           </w:pPr>
-          <w:hyperlink w:anchor="_Toc243940762" w:history="1">
+          <w:hyperlink w:anchor="_Toc243940862" w:history="1">
             <w:r>
               <w:rPr>
                 <w:rStyle w:val="Hyperlink"/>
@@ -6175,7 +5969,7 @@
               <w:rPr>
                 <w:noProof/>
               </w:rPr>
-              <w:instrText xml:space="preserve"> PAGEREF _Toc243940762 \h </w:instrText>
+              <w:instrText xml:space="preserve"> PAGEREF _Toc243940862 \h </w:instrText>
             </w:r>
             <w:r>
               <w:rPr>
@@ -6217,7 +6011,7 @@
               <w14:ligatures w14:val="standardContextual"/>
             </w:rPr>
           </w:pPr>
-          <w:hyperlink w:anchor="_Toc243940763" w:history="1">
+          <w:hyperlink w:anchor="_Toc243940863" w:history="1">
             <w:r>
               <w:rPr>
                 <w:rStyle w:val="Hyperlink"/>
@@ -6241,7 +6035,7 @@
               <w:rPr>
                 <w:noProof/>
               </w:rPr>
-              <w:instrText xml:space="preserve"> PAGEREF _Toc243940763 \h </w:instrText>
+              <w:instrText xml:space="preserve"> PAGEREF _Toc243940863 \h </w:instrText>
             </w:r>
             <w:r>
               <w:rPr>
@@ -6283,7 +6077,7 @@
               <w14:ligatures w14:val="standardContextual"/>
             </w:rPr>
           </w:pPr>
-          <w:hyperlink w:anchor="_Toc243940764" w:history="1">
+          <w:hyperlink w:anchor="_Toc243940864" w:history="1">
             <w:r>
               <w:rPr>
                 <w:rStyle w:val="Hyperlink"/>
@@ -6307,7 +6101,7 @@
               <w:rPr>
                 <w:noProof/>
               </w:rPr>
-              <w:instrText xml:space="preserve"> PAGEREF _Toc243940764 \h </w:instrText>
+              <w:instrText xml:space="preserve"> PAGEREF _Toc243940864 \h </w:instrText>
             </w:r>
             <w:r>
               <w:rPr>
@@ -6349,7 +6143,7 @@
               <w14:ligatures w14:val="standardContextual"/>
             </w:rPr>
           </w:pPr>
-          <w:hyperlink w:anchor="_Toc243940765" w:history="1">
+          <w:hyperlink w:anchor="_Toc243940865" w:history="1">
             <w:r>
               <w:rPr>
                 <w:rStyle w:val="Hyperlink"/>
@@ -6373,7 +6167,7 @@
               <w:rPr>
                 <w:noProof/>
               </w:rPr>
-              <w:instrText xml:space="preserve"> PAGEREF _Toc243940765 \h </w:instrText>
+              <w:instrText xml:space="preserve"> PAGEREF _Toc243940865 \h </w:instrText>
             </w:r>
             <w:r>
               <w:rPr>
@@ -6415,7 +6209,7 @@
               <w14:ligatures w14:val="standardContextual"/>
             </w:rPr>
           </w:pPr>
-          <w:hyperlink w:anchor="_Toc243940766" w:history="1">
+          <w:hyperlink w:anchor="_Toc243940866" w:history="1">
             <w:r>
               <w:rPr>
                 <w:rStyle w:val="Hyperlink"/>
@@ -6439,7 +6233,7 @@
               <w:rPr>
                 <w:noProof/>
               </w:rPr>
-              <w:instrText xml:space="preserve"> PAGEREF _Toc243940766 \h </w:instrText>
+              <w:instrText xml:space="preserve"> PAGEREF _Toc243940866 \h </w:instrText>
             </w:r>
             <w:r>
               <w:rPr>
@@ -6481,7 +6275,7 @@
               <w14:ligatures w14:val="standardContextual"/>
             </w:rPr>
           </w:pPr>
-          <w:hyperlink w:anchor="_Toc243940767" w:history="1">
+          <w:hyperlink w:anchor="_Toc243940867" w:history="1">
             <w:r>
               <w:rPr>
                 <w:rStyle w:val="Hyperlink"/>
@@ -6505,7 +6299,7 @@
               <w:rPr>
                 <w:noProof/>
               </w:rPr>
-              <w:instrText xml:space="preserve"> PAGEREF _Toc243940767 \h </w:instrText>
+              <w:instrText xml:space="preserve"> PAGEREF _Toc243940867 \h </w:instrText>
             </w:r>
             <w:r>
               <w:rPr>
@@ -6542,13 +6336,11 @@
     <w:p>
       <w:pPr>
         <w:sectPr>
-          <w:footerReference w:type="default" r:id="rId7"/>
-          <w:footerReference w:type="first" r:id="rId8"/>
+          <w:footerReference w:type="default" r:id="rId8"/>
           <w:pgSz w:w="11906" w:h="16838"/>
           <w:pgMar w:top="1440" w:right="1440" w:bottom="1440" w:left="1800" w:header="708" w:footer="600" w:gutter="0"/>
           <w:pgNumType w:fmt="lowerRoman" w:start="1"/>
           <w:cols w:space="720"/>
-          <w:titlePg/>
           <w:docGrid w:linePitch="360"/>
         </w:sectPr>
       </w:pPr>
@@ -6557,7 +6349,7 @@
       <w:pPr>
         <w:pStyle w:val="Heading1"/>
       </w:pPr>
-      <w:bookmarkStart w:id="5" w:name="_Toc243940840"/>
+      <w:bookmarkStart w:id="5" w:name="_Toc243940940"/>
       <w:r>
         <w:lastRenderedPageBreak/>
         <w:t>1. INTRODUCTION</w:t>
@@ -6568,7 +6360,7 @@
       <w:pPr>
         <w:pStyle w:val="Heading2"/>
       </w:pPr>
-      <w:bookmarkStart w:id="6" w:name="_Toc243940841"/>
+      <w:bookmarkStart w:id="6" w:name="_Toc243940941"/>
       <w:r>
         <w:t>1.1 Background</w:t>
       </w:r>
@@ -6646,7 +6438,7 @@
       <w:pPr>
         <w:pStyle w:val="Heading2"/>
       </w:pPr>
-      <w:bookmarkStart w:id="7" w:name="_Toc243940842"/>
+      <w:bookmarkStart w:id="7" w:name="_Toc243940942"/>
       <w:r>
         <w:t>1.2 Problem Statement</w:t>
       </w:r>
@@ -6665,7 +6457,7 @@
       <w:pPr>
         <w:pStyle w:val="Heading2"/>
       </w:pPr>
-      <w:bookmarkStart w:id="8" w:name="_Toc243940843"/>
+      <w:bookmarkStart w:id="8" w:name="_Toc243940943"/>
       <w:r>
         <w:t>1.3 Objectives</w:t>
       </w:r>
@@ -6774,7 +6566,7 @@
       <w:pPr>
         <w:pStyle w:val="Heading2"/>
       </w:pPr>
-      <w:bookmarkStart w:id="9" w:name="_Toc243940844"/>
+      <w:bookmarkStart w:id="9" w:name="_Toc243940944"/>
       <w:r>
         <w:t>1.4 Scope of the Project</w:t>
       </w:r>
@@ -6794,7 +6586,7 @@
         <w:pStyle w:val="Heading1"/>
         <w:pageBreakBefore/>
       </w:pPr>
-      <w:bookmarkStart w:id="10" w:name="_Toc243940845"/>
+      <w:bookmarkStart w:id="10" w:name="_Toc243940945"/>
       <w:r>
         <w:lastRenderedPageBreak/>
         <w:t>2. THEORETICAL BACKGROUND</w:t>
@@ -6814,7 +6606,7 @@
       <w:pPr>
         <w:pStyle w:val="Heading2"/>
       </w:pPr>
-      <w:bookmarkStart w:id="11" w:name="_Toc243940846"/>
+      <w:bookmarkStart w:id="11" w:name="_Toc243940946"/>
       <w:r>
         <w:t>2.1 Images as Two-Dimensional Signals</w:t>
       </w:r>
@@ -6875,7 +6667,7 @@
       <w:pPr>
         <w:pStyle w:val="Heading2"/>
       </w:pPr>
-      <w:bookmarkStart w:id="12" w:name="_Toc243940847"/>
+      <w:bookmarkStart w:id="12" w:name="_Toc243940947"/>
       <w:r>
         <w:t>2.2 Median Filtering</w:t>
       </w:r>
@@ -6894,7 +6686,7 @@
       <w:pPr>
         <w:pStyle w:val="Heading2"/>
       </w:pPr>
-      <w:bookmarkStart w:id="13" w:name="_Toc243940848"/>
+      <w:bookmarkStart w:id="13" w:name="_Toc243940948"/>
       <w:r>
         <w:t>2.3 Otsu Thresholding</w:t>
       </w:r>
@@ -6985,7 +6777,7 @@
       <w:pPr>
         <w:pStyle w:val="Heading2"/>
       </w:pPr>
-      <w:bookmarkStart w:id="14" w:name="_Toc243940849"/>
+      <w:bookmarkStart w:id="14" w:name="_Toc243940949"/>
       <w:r>
         <w:t>2.4 Discrete Fourier Transform</w:t>
       </w:r>
@@ -7018,7 +6810,7 @@
       <w:pPr>
         <w:pStyle w:val="Heading2"/>
       </w:pPr>
-      <w:bookmarkStart w:id="15" w:name="_Toc243940850"/>
+      <w:bookmarkStart w:id="15" w:name="_Toc243940950"/>
       <w:r>
         <w:t>2.5 Discrete Wavelet Transform (Haar)</w:t>
       </w:r>
@@ -7037,7 +6829,7 @@
       <w:pPr>
         <w:pStyle w:val="Heading2"/>
       </w:pPr>
-      <w:bookmarkStart w:id="16" w:name="_Toc243940851"/>
+      <w:bookmarkStart w:id="16" w:name="_Toc243940951"/>
       <w:r>
         <w:t>2.6 Normalised Cross-Correlation</w:t>
       </w:r>
@@ -7078,7 +6870,7 @@
       <w:pPr>
         <w:pStyle w:val="Heading2"/>
       </w:pPr>
-      <w:bookmarkStart w:id="17" w:name="_Toc243940852"/>
+      <w:bookmarkStart w:id="17" w:name="_Toc243940952"/>
       <w:r>
         <w:t>2.7 Statistical Moments and Hu Invariants</w:t>
       </w:r>
@@ -7107,7 +6899,7 @@
       <w:pPr>
         <w:pStyle w:val="Heading2"/>
       </w:pPr>
-      <w:bookmarkStart w:id="18" w:name="_Toc243940853"/>
+      <w:bookmarkStart w:id="18" w:name="_Toc243940953"/>
       <w:r>
         <w:t>2.8 Logistic Regression</w:t>
       </w:r>
@@ -7137,7 +6929,7 @@
         <w:pStyle w:val="Heading1"/>
         <w:pageBreakBefore/>
       </w:pPr>
-      <w:bookmarkStart w:id="19" w:name="_Toc243940854"/>
+      <w:bookmarkStart w:id="19" w:name="_Toc243940954"/>
       <w:r>
         <w:lastRenderedPageBreak/>
         <w:t>3. SYSTEM DESIGN AND ARCHITECTURE</w:t>
@@ -7148,7 +6940,7 @@
       <w:pPr>
         <w:pStyle w:val="Heading2"/>
       </w:pPr>
-      <w:bookmarkStart w:id="20" w:name="_Toc243940855"/>
+      <w:bookmarkStart w:id="20" w:name="_Toc243940955"/>
       <w:r>
         <w:t>3.1 Overall Architecture</w:t>
       </w:r>
@@ -7194,7 +6986,7 @@
           <w:noProof/>
         </w:rPr>
         <w:drawing>
-          <wp:inline distT="0" distB="0" distL="0" distR="0" wp14:anchorId="6EB3BE52" wp14:editId="00993013">
+          <wp:inline distT="0" distB="0" distL="0" distR="0" wp14:anchorId="1EF97A4A" wp14:editId="63D5268C">
             <wp:extent cx="5486400" cy="1647825"/>
             <wp:effectExtent l="0" t="0" r="0" b="0"/>
             <wp:docPr id="1" name="Picture 1"/>
@@ -7239,7 +7031,7 @@
         <w:spacing w:after="200"/>
         <w:jc w:val="center"/>
       </w:pPr>
-      <w:bookmarkStart w:id="21" w:name="_Toc243940743"/>
+      <w:bookmarkStart w:id="21" w:name="_Toc243940843"/>
       <w:r>
         <w:t xml:space="preserve">Figure </w:t>
       </w:r>
@@ -7270,7 +7062,7 @@
       <w:pPr>
         <w:pStyle w:val="Heading2"/>
       </w:pPr>
-      <w:bookmarkStart w:id="22" w:name="_Toc243940856"/>
+      <w:bookmarkStart w:id="22" w:name="_Toc243940956"/>
       <w:r>
         <w:t>3.2 Module Organisation</w:t>
       </w:r>
@@ -7292,7 +7084,7 @@
         <w:spacing w:before="160" w:after="80"/>
         <w:jc w:val="center"/>
       </w:pPr>
-      <w:bookmarkStart w:id="23" w:name="_Toc243940761"/>
+      <w:bookmarkStart w:id="23" w:name="_Toc243940861"/>
       <w:r>
         <w:t xml:space="preserve">Table </w:t>
       </w:r>
@@ -8086,7 +7878,7 @@
       <w:pPr>
         <w:pStyle w:val="Heading2"/>
       </w:pPr>
-      <w:bookmarkStart w:id="24" w:name="_Toc243940857"/>
+      <w:bookmarkStart w:id="24" w:name="_Toc243940957"/>
       <w:r>
         <w:t>3.3 Dataset</w:t>
       </w:r>
@@ -8170,7 +7962,7 @@
         <w:spacing w:before="160" w:after="80"/>
         <w:jc w:val="center"/>
       </w:pPr>
-      <w:bookmarkStart w:id="25" w:name="_Toc243940762"/>
+      <w:bookmarkStart w:id="25" w:name="_Toc243940862"/>
       <w:r>
         <w:t xml:space="preserve">Table </w:t>
       </w:r>
@@ -8715,7 +8507,7 @@
       <w:pPr>
         <w:pStyle w:val="Heading2"/>
       </w:pPr>
-      <w:bookmarkStart w:id="26" w:name="_Toc243940858"/>
+      <w:bookmarkStart w:id="26" w:name="_Toc243940958"/>
       <w:r>
         <w:t>3.4 Data Stored per Account</w:t>
       </w:r>
@@ -8767,7 +8559,7 @@
         <w:pStyle w:val="Heading1"/>
         <w:pageBreakBefore/>
       </w:pPr>
-      <w:bookmarkStart w:id="27" w:name="_Toc243940859"/>
+      <w:bookmarkStart w:id="27" w:name="_Toc243940959"/>
       <w:r>
         <w:lastRenderedPageBreak/>
         <w:t>4. PREPROCESSING</w:t>
@@ -8805,7 +8597,7 @@
           <w:noProof/>
         </w:rPr>
         <w:drawing>
-          <wp:inline distT="0" distB="0" distL="0" distR="0" wp14:anchorId="0FD60C1E" wp14:editId="219B8BC1">
+          <wp:inline distT="0" distB="0" distL="0" distR="0" wp14:anchorId="0334B582" wp14:editId="1823FE3E">
             <wp:extent cx="5486400" cy="2381250"/>
             <wp:effectExtent l="0" t="0" r="0" b="0"/>
             <wp:docPr id="2" name="Picture 2"/>
@@ -8850,7 +8642,7 @@
         <w:spacing w:after="200"/>
         <w:jc w:val="center"/>
       </w:pPr>
-      <w:bookmarkStart w:id="28" w:name="_Toc243940744"/>
+      <w:bookmarkStart w:id="28" w:name="_Toc243940844"/>
       <w:r>
         <w:t xml:space="preserve">Figure </w:t>
       </w:r>
@@ -8881,7 +8673,7 @@
       <w:pPr>
         <w:pStyle w:val="Heading2"/>
       </w:pPr>
-      <w:bookmarkStart w:id="29" w:name="_Toc243940860"/>
+      <w:bookmarkStart w:id="29" w:name="_Toc243940960"/>
       <w:r>
         <w:t>4.1 Grayscale Conversion and Format Handling</w:t>
       </w:r>
@@ -8900,7 +8692,7 @@
       <w:pPr>
         <w:pStyle w:val="Heading2"/>
       </w:pPr>
-      <w:bookmarkStart w:id="30" w:name="_Toc243940861"/>
+      <w:bookmarkStart w:id="30" w:name="_Toc243940961"/>
       <w:r>
         <w:t>4.2 Median Filtering and Contrast Stretch</w:t>
       </w:r>
@@ -8919,7 +8711,7 @@
       <w:pPr>
         <w:pStyle w:val="Heading2"/>
       </w:pPr>
-      <w:bookmarkStart w:id="31" w:name="_Toc243940862"/>
+      <w:bookmarkStart w:id="31" w:name="_Toc243940962"/>
       <w:r>
         <w:t>4.3 Otsu Binarisation and Polarity Correction</w:t>
       </w:r>
@@ -8938,7 +8730,7 @@
       <w:pPr>
         <w:pStyle w:val="Heading2"/>
       </w:pPr>
-      <w:bookmarkStart w:id="32" w:name="_Toc243940863"/>
+      <w:bookmarkStart w:id="32" w:name="_Toc243940963"/>
       <w:r>
         <w:lastRenderedPageBreak/>
         <w:t>4.4 Despeckling and Gap Bridging</w:t>
@@ -8958,7 +8750,7 @@
       <w:pPr>
         <w:pStyle w:val="Heading2"/>
       </w:pPr>
-      <w:bookmarkStart w:id="33" w:name="_Toc243940864"/>
+      <w:bookmarkStart w:id="33" w:name="_Toc243940964"/>
       <w:r>
         <w:t>4.5 Deskewing by Principal Axis</w:t>
       </w:r>
@@ -8999,7 +8791,7 @@
       <w:pPr>
         <w:pStyle w:val="Heading2"/>
       </w:pPr>
-      <w:bookmarkStart w:id="34" w:name="_Toc243940865"/>
+      <w:bookmarkStart w:id="34" w:name="_Toc243940965"/>
       <w:r>
         <w:t>4.6 Cropping and Size Normalisation</w:t>
       </w:r>
@@ -9746,7 +9538,7 @@
         <w:pStyle w:val="Heading1"/>
         <w:pageBreakBefore/>
       </w:pPr>
-      <w:bookmarkStart w:id="35" w:name="_Toc243940866"/>
+      <w:bookmarkStart w:id="35" w:name="_Toc243940966"/>
       <w:r>
         <w:lastRenderedPageBreak/>
         <w:t>5. FEATURE EXTRACTION</w:t>
@@ -9784,7 +9576,7 @@
           <w:noProof/>
         </w:rPr>
         <w:drawing>
-          <wp:inline distT="0" distB="0" distL="0" distR="0" wp14:anchorId="674D3A93" wp14:editId="18CCF83A">
+          <wp:inline distT="0" distB="0" distL="0" distR="0" wp14:anchorId="37DD44FA" wp14:editId="3EABFAFE">
             <wp:extent cx="5486400" cy="1895475"/>
             <wp:effectExtent l="0" t="0" r="0" b="0"/>
             <wp:docPr id="3" name="Picture 3"/>
@@ -9829,7 +9621,7 @@
         <w:spacing w:after="200"/>
         <w:jc w:val="center"/>
       </w:pPr>
-      <w:bookmarkStart w:id="36" w:name="_Toc243940745"/>
+      <w:bookmarkStart w:id="36" w:name="_Toc243940845"/>
       <w:r>
         <w:t xml:space="preserve">Figure </w:t>
       </w:r>
@@ -9863,7 +9655,7 @@
         <w:spacing w:before="160" w:after="80"/>
         <w:jc w:val="center"/>
       </w:pPr>
-      <w:bookmarkStart w:id="37" w:name="_Toc243940763"/>
+      <w:bookmarkStart w:id="37" w:name="_Toc243940863"/>
       <w:r>
         <w:t xml:space="preserve">Table </w:t>
       </w:r>
@@ -10828,7 +10620,7 @@
       <w:pPr>
         <w:pStyle w:val="Heading2"/>
       </w:pPr>
-      <w:bookmarkStart w:id="38" w:name="_Toc243940867"/>
+      <w:bookmarkStart w:id="38" w:name="_Toc243940967"/>
       <w:r>
         <w:lastRenderedPageBreak/>
         <w:t>5.1 Projection Profiles as 1-D Signals</w:t>
@@ -10868,7 +10660,7 @@
       <w:pPr>
         <w:pStyle w:val="Heading2"/>
       </w:pPr>
-      <w:bookmarkStart w:id="39" w:name="_Toc243940868"/>
+      <w:bookmarkStart w:id="39" w:name="_Toc243940968"/>
       <w:r>
         <w:t>5.2 Energy, Entropy and Spectral Features</w:t>
       </w:r>
@@ -10894,7 +10686,7 @@
           <w:noProof/>
         </w:rPr>
         <w:drawing>
-          <wp:inline distT="0" distB="0" distL="0" distR="0" wp14:anchorId="0A5B8A90" wp14:editId="74DF6058">
+          <wp:inline distT="0" distB="0" distL="0" distR="0" wp14:anchorId="66C8C9BF" wp14:editId="3FF09EAC">
             <wp:extent cx="5486400" cy="2924175"/>
             <wp:effectExtent l="0" t="0" r="0" b="0"/>
             <wp:docPr id="4" name="Picture 4"/>
@@ -10939,7 +10731,7 @@
         <w:spacing w:after="200"/>
         <w:jc w:val="center"/>
       </w:pPr>
-      <w:bookmarkStart w:id="40" w:name="_Toc243940746"/>
+      <w:bookmarkStart w:id="40" w:name="_Toc243940846"/>
       <w:r>
         <w:t xml:space="preserve">Figure </w:t>
       </w:r>
@@ -10970,7 +10762,7 @@
       <w:pPr>
         <w:pStyle w:val="Heading2"/>
       </w:pPr>
-      <w:bookmarkStart w:id="41" w:name="_Toc243940869"/>
+      <w:bookmarkStart w:id="41" w:name="_Toc243940969"/>
       <w:r>
         <w:t>5.3 Two-Dimensional Spectrum</w:t>
       </w:r>
@@ -10993,7 +10785,7 @@
       <w:pPr>
         <w:pStyle w:val="Heading2"/>
       </w:pPr>
-      <w:bookmarkStart w:id="42" w:name="_Toc243940870"/>
+      <w:bookmarkStart w:id="42" w:name="_Toc243940970"/>
       <w:r>
         <w:t>5.4 Haar Wavelet Decomposition</w:t>
       </w:r>
@@ -11261,7 +11053,7 @@
       <w:pPr>
         <w:pStyle w:val="Heading2"/>
       </w:pPr>
-      <w:bookmarkStart w:id="43" w:name="_Toc243940871"/>
+      <w:bookmarkStart w:id="43" w:name="_Toc243940971"/>
       <w:r>
         <w:t>5.5 Contour Signals</w:t>
       </w:r>
@@ -11281,7 +11073,7 @@
         <w:pStyle w:val="Heading1"/>
         <w:pageBreakBefore/>
       </w:pPr>
-      <w:bookmarkStart w:id="44" w:name="_Toc243940872"/>
+      <w:bookmarkStart w:id="44" w:name="_Toc243940972"/>
       <w:r>
         <w:lastRenderedPageBreak/>
         <w:t>6. MATCHING AND SCORING</w:t>
@@ -11301,7 +11093,7 @@
       <w:pPr>
         <w:pStyle w:val="Heading2"/>
       </w:pPr>
-      <w:bookmarkStart w:id="45" w:name="_Toc243940873"/>
+      <w:bookmarkStart w:id="45" w:name="_Toc243940973"/>
       <w:r>
         <w:t>6.1 Writer-Normalised Feature Distance</w:t>
       </w:r>
@@ -11394,7 +11186,7 @@
       <w:pPr>
         <w:pStyle w:val="Heading2"/>
       </w:pPr>
-      <w:bookmarkStart w:id="46" w:name="_Toc243940874"/>
+      <w:bookmarkStart w:id="46" w:name="_Toc243940974"/>
       <w:r>
         <w:t>6.2 Peak Normalised Cross-Correlation</w:t>
       </w:r>
@@ -11691,7 +11483,7 @@
       <w:pPr>
         <w:pStyle w:val="Heading2"/>
       </w:pPr>
-      <w:bookmarkStart w:id="47" w:name="_Toc243940875"/>
+      <w:bookmarkStart w:id="47" w:name="_Toc243940975"/>
       <w:r>
         <w:lastRenderedPageBreak/>
         <w:t>6.3 DSP Score Fusion</w:t>
@@ -12117,7 +11909,7 @@
       <w:pPr>
         <w:pStyle w:val="Heading2"/>
       </w:pPr>
-      <w:bookmarkStart w:id="48" w:name="_Toc243940876"/>
+      <w:bookmarkStart w:id="48" w:name="_Toc243940976"/>
       <w:r>
         <w:t>6.4 Writer-Independent Classifier</w:t>
       </w:r>
@@ -12165,7 +11957,7 @@
       <w:pPr>
         <w:pStyle w:val="Heading2"/>
       </w:pPr>
-      <w:bookmarkStart w:id="49" w:name="_Toc243940877"/>
+      <w:bookmarkStart w:id="49" w:name="_Toc243940977"/>
       <w:r>
         <w:lastRenderedPageBreak/>
         <w:t>6.5 Scoring Modes</w:t>
@@ -12179,7 +11971,7 @@
         <w:spacing w:before="160" w:after="80"/>
         <w:jc w:val="center"/>
       </w:pPr>
-      <w:bookmarkStart w:id="50" w:name="_Toc243940764"/>
+      <w:bookmarkStart w:id="50" w:name="_Toc243940864"/>
       <w:r>
         <w:t xml:space="preserve">Table </w:t>
       </w:r>
@@ -12485,7 +12277,7 @@
         <w:pStyle w:val="Heading1"/>
         <w:pageBreakBefore/>
       </w:pPr>
-      <w:bookmarkStart w:id="51" w:name="_Toc243940878"/>
+      <w:bookmarkStart w:id="51" w:name="_Toc243940978"/>
       <w:r>
         <w:lastRenderedPageBreak/>
         <w:t>7. THRESHOLD CALIBRATION AND PARAMETER TUNING</w:t>
@@ -12496,7 +12288,7 @@
       <w:pPr>
         <w:pStyle w:val="Heading2"/>
       </w:pPr>
-      <w:bookmarkStart w:id="52" w:name="_Toc243940879"/>
+      <w:bookmarkStart w:id="52" w:name="_Toc243940979"/>
       <w:r>
         <w:t>7.1 Per-Writer Threshold by Leave-One-Out</w:t>
       </w:r>
@@ -13015,7 +12807,7 @@
           <w:noProof/>
         </w:rPr>
         <w:drawing>
-          <wp:inline distT="0" distB="0" distL="0" distR="0" wp14:anchorId="38800C5A" wp14:editId="2366A041">
+          <wp:inline distT="0" distB="0" distL="0" distR="0" wp14:anchorId="0D03F0BF" wp14:editId="6B379511">
             <wp:extent cx="5486400" cy="1895475"/>
             <wp:effectExtent l="0" t="0" r="0" b="0"/>
             <wp:docPr id="5" name="Picture 5"/>
@@ -13060,7 +12852,7 @@
         <w:spacing w:after="200"/>
         <w:jc w:val="center"/>
       </w:pPr>
-      <w:bookmarkStart w:id="53" w:name="_Toc243940747"/>
+      <w:bookmarkStart w:id="53" w:name="_Toc243940847"/>
       <w:r>
         <w:t xml:space="preserve">Figure </w:t>
       </w:r>
@@ -13091,7 +12883,7 @@
       <w:pPr>
         <w:pStyle w:val="Heading2"/>
       </w:pPr>
-      <w:bookmarkStart w:id="54" w:name="_Toc243940880"/>
+      <w:bookmarkStart w:id="54" w:name="_Toc243940980"/>
       <w:r>
         <w:t>7.2 Global Parameter Tuning</w:t>
       </w:r>
@@ -13224,7 +13016,7 @@
         </w:rPr>
         <w:lastRenderedPageBreak/>
         <w:drawing>
-          <wp:inline distT="0" distB="0" distL="0" distR="0" wp14:anchorId="331EA2FF" wp14:editId="395FF21F">
+          <wp:inline distT="0" distB="0" distL="0" distR="0" wp14:anchorId="4E5EAA88" wp14:editId="20C0F8E7">
             <wp:extent cx="5048250" cy="2124075"/>
             <wp:effectExtent l="0" t="0" r="0" b="0"/>
             <wp:docPr id="6" name="Picture 6"/>
@@ -13269,7 +13061,7 @@
         <w:spacing w:after="200"/>
         <w:jc w:val="center"/>
       </w:pPr>
-      <w:bookmarkStart w:id="55" w:name="_Toc243940748"/>
+      <w:bookmarkStart w:id="55" w:name="_Toc243940848"/>
       <w:r>
         <w:t xml:space="preserve">Figure </w:t>
       </w:r>
@@ -13303,7 +13095,7 @@
         <w:spacing w:before="160" w:after="80"/>
         <w:jc w:val="center"/>
       </w:pPr>
-      <w:bookmarkStart w:id="56" w:name="_Toc243940765"/>
+      <w:bookmarkStart w:id="56" w:name="_Toc243940865"/>
       <w:r>
         <w:t xml:space="preserve">Table </w:t>
       </w:r>
@@ -13791,7 +13583,7 @@
       <w:pPr>
         <w:pStyle w:val="Heading2"/>
       </w:pPr>
-      <w:bookmarkStart w:id="57" w:name="_Toc243940881"/>
+      <w:bookmarkStart w:id="57" w:name="_Toc243940981"/>
       <w:r>
         <w:t>7.3 Classifier Training and Validation</w:t>
       </w:r>
@@ -13828,7 +13620,7 @@
         </w:rPr>
         <w:lastRenderedPageBreak/>
         <w:drawing>
-          <wp:inline distT="0" distB="0" distL="0" distR="0" wp14:anchorId="30D84ECD" wp14:editId="7553E982">
+          <wp:inline distT="0" distB="0" distL="0" distR="0" wp14:anchorId="26197310" wp14:editId="395FE8AE">
             <wp:extent cx="2743200" cy="2105025"/>
             <wp:effectExtent l="0" t="0" r="0" b="0"/>
             <wp:docPr id="7" name="Picture 7"/>
@@ -13873,7 +13665,7 @@
         <w:spacing w:after="200"/>
         <w:jc w:val="center"/>
       </w:pPr>
-      <w:bookmarkStart w:id="58" w:name="_Toc243940749"/>
+      <w:bookmarkStart w:id="58" w:name="_Toc243940849"/>
       <w:r>
         <w:t xml:space="preserve">Figure </w:t>
       </w:r>
@@ -13905,7 +13697,7 @@
         <w:pStyle w:val="Heading1"/>
         <w:pageBreakBefore/>
       </w:pPr>
-      <w:bookmarkStart w:id="59" w:name="_Toc243940882"/>
+      <w:bookmarkStart w:id="59" w:name="_Toc243940982"/>
       <w:r>
         <w:lastRenderedPageBreak/>
         <w:t>8. GRAPHICAL USER INTERFACE</w:t>
@@ -13969,7 +13761,7 @@
       <w:pPr>
         <w:pStyle w:val="Heading2"/>
       </w:pPr>
-      <w:bookmarkStart w:id="60" w:name="_Toc243940883"/>
+      <w:bookmarkStart w:id="60" w:name="_Toc243940983"/>
       <w:r>
         <w:t>8.1 Layout</w:t>
       </w:r>
@@ -13991,7 +13783,7 @@
       <w:pPr>
         <w:pStyle w:val="Heading2"/>
       </w:pPr>
-      <w:bookmarkStart w:id="61" w:name="_Toc243940884"/>
+      <w:bookmarkStart w:id="61" w:name="_Toc243940984"/>
       <w:r>
         <w:t>8.2 Activity Log</w:t>
       </w:r>
@@ -14024,7 +13816,7 @@
       <w:pPr>
         <w:pStyle w:val="Heading2"/>
       </w:pPr>
-      <w:bookmarkStart w:id="62" w:name="_Toc243940885"/>
+      <w:bookmarkStart w:id="62" w:name="_Toc243940985"/>
       <w:r>
         <w:t>8.3 Loading States</w:t>
       </w:r>
@@ -14109,7 +13901,7 @@
               </w:rPr>
               <w:lastRenderedPageBreak/>
               <w:drawing>
-                <wp:inline distT="0" distB="0" distL="0" distR="0" wp14:anchorId="2F3214AB" wp14:editId="2F4FA217">
+                <wp:inline distT="0" distB="0" distL="0" distR="0" wp14:anchorId="2F6E3A12" wp14:editId="32B69CBB">
                   <wp:extent cx="2667000" cy="2047875"/>
                   <wp:effectExtent l="0" t="0" r="0" b="0"/>
                   <wp:docPr id="8" name="Picture 8"/>
@@ -14154,7 +13946,7 @@
               <w:spacing w:after="120"/>
               <w:jc w:val="center"/>
             </w:pPr>
-            <w:bookmarkStart w:id="63" w:name="_Toc243940750"/>
+            <w:bookmarkStart w:id="63" w:name="_Toc243940850"/>
             <w:r>
               <w:t xml:space="preserve">Figure </w:t>
             </w:r>
@@ -14206,7 +13998,7 @@
                 <w:noProof/>
               </w:rPr>
               <w:drawing>
-                <wp:inline distT="0" distB="0" distL="0" distR="0" wp14:anchorId="1D0A0827" wp14:editId="24E771B3">
+                <wp:inline distT="0" distB="0" distL="0" distR="0" wp14:anchorId="22A783C2" wp14:editId="0F766A71">
                   <wp:extent cx="2667000" cy="2047875"/>
                   <wp:effectExtent l="0" t="0" r="0" b="0"/>
                   <wp:docPr id="9" name="Picture 9"/>
@@ -14251,7 +14043,7 @@
               <w:spacing w:after="120"/>
               <w:jc w:val="center"/>
             </w:pPr>
-            <w:bookmarkStart w:id="64" w:name="_Toc243940751"/>
+            <w:bookmarkStart w:id="64" w:name="_Toc243940851"/>
             <w:r>
               <w:t xml:space="preserve">Figure </w:t>
             </w:r>
@@ -14290,7 +14082,7 @@
       <w:pPr>
         <w:pStyle w:val="Heading2"/>
       </w:pPr>
-      <w:bookmarkStart w:id="65" w:name="_Toc243940886"/>
+      <w:bookmarkStart w:id="65" w:name="_Toc243940986"/>
       <w:r>
         <w:t>8.4 Enrolment and Verification</w:t>
       </w:r>
@@ -14355,7 +14147,7 @@
                 <w:noProof/>
               </w:rPr>
               <w:drawing>
-                <wp:inline distT="0" distB="0" distL="0" distR="0" wp14:anchorId="5E0195F9" wp14:editId="7DE36944">
+                <wp:inline distT="0" distB="0" distL="0" distR="0" wp14:anchorId="4CDE3709" wp14:editId="03F220C6">
                   <wp:extent cx="2667000" cy="2047875"/>
                   <wp:effectExtent l="0" t="0" r="0" b="0"/>
                   <wp:docPr id="10" name="Picture 10"/>
@@ -14400,7 +14192,7 @@
               <w:spacing w:after="120"/>
               <w:jc w:val="center"/>
             </w:pPr>
-            <w:bookmarkStart w:id="66" w:name="_Toc243940752"/>
+            <w:bookmarkStart w:id="66" w:name="_Toc243940852"/>
             <w:r>
               <w:t xml:space="preserve">Figure </w:t>
             </w:r>
@@ -14452,7 +14244,7 @@
                 <w:noProof/>
               </w:rPr>
               <w:drawing>
-                <wp:inline distT="0" distB="0" distL="0" distR="0" wp14:anchorId="184A408E" wp14:editId="739B3BF5">
+                <wp:inline distT="0" distB="0" distL="0" distR="0" wp14:anchorId="7AE010DC" wp14:editId="00F3CC53">
                   <wp:extent cx="2667000" cy="2047875"/>
                   <wp:effectExtent l="0" t="0" r="0" b="0"/>
                   <wp:docPr id="11" name="Picture 11"/>
@@ -14497,7 +14289,7 @@
               <w:spacing w:after="120"/>
               <w:jc w:val="center"/>
             </w:pPr>
-            <w:bookmarkStart w:id="67" w:name="_Toc243940753"/>
+            <w:bookmarkStart w:id="67" w:name="_Toc243940853"/>
             <w:r>
               <w:t xml:space="preserve">Figure </w:t>
             </w:r>
@@ -14536,7 +14328,7 @@
       <w:pPr>
         <w:pStyle w:val="Heading2"/>
       </w:pPr>
-      <w:bookmarkStart w:id="68" w:name="_Toc243940887"/>
+      <w:bookmarkStart w:id="68" w:name="_Toc243940987"/>
       <w:r>
         <w:t>8.5 Error and Warning States</w:t>
       </w:r>
@@ -14622,7 +14414,7 @@
                 <w:noProof/>
               </w:rPr>
               <w:drawing>
-                <wp:inline distT="0" distB="0" distL="0" distR="0" wp14:anchorId="255824EF" wp14:editId="418DB346">
+                <wp:inline distT="0" distB="0" distL="0" distR="0" wp14:anchorId="23F23E22" wp14:editId="1F4657C0">
                   <wp:extent cx="2667000" cy="2047875"/>
                   <wp:effectExtent l="0" t="0" r="0" b="0"/>
                   <wp:docPr id="12" name="Picture 12"/>
@@ -14667,7 +14459,7 @@
               <w:spacing w:after="120"/>
               <w:jc w:val="center"/>
             </w:pPr>
-            <w:bookmarkStart w:id="69" w:name="_Toc243940754"/>
+            <w:bookmarkStart w:id="69" w:name="_Toc243940854"/>
             <w:r>
               <w:t xml:space="preserve">Figure </w:t>
             </w:r>
@@ -14719,7 +14511,7 @@
                 <w:noProof/>
               </w:rPr>
               <w:drawing>
-                <wp:inline distT="0" distB="0" distL="0" distR="0" wp14:anchorId="74236516" wp14:editId="0CE9E2F9">
+                <wp:inline distT="0" distB="0" distL="0" distR="0" wp14:anchorId="68A124F8" wp14:editId="091439D7">
                   <wp:extent cx="2667000" cy="2047875"/>
                   <wp:effectExtent l="0" t="0" r="0" b="0"/>
                   <wp:docPr id="13" name="Picture 13"/>
@@ -14764,7 +14556,7 @@
               <w:spacing w:after="120"/>
               <w:jc w:val="center"/>
             </w:pPr>
-            <w:bookmarkStart w:id="70" w:name="_Toc243940755"/>
+            <w:bookmarkStart w:id="70" w:name="_Toc243940855"/>
             <w:r>
               <w:t xml:space="preserve">Figure </w:t>
             </w:r>
@@ -15313,7 +15105,7 @@
       <w:pPr>
         <w:pStyle w:val="Heading2"/>
       </w:pPr>
-      <w:bookmarkStart w:id="71" w:name="_Toc243940888"/>
+      <w:bookmarkStart w:id="71" w:name="_Toc243940988"/>
       <w:r>
         <w:lastRenderedPageBreak/>
         <w:t>8.6 DSP Analysis Figure</w:t>
@@ -15334,7 +15126,7 @@
         <w:pStyle w:val="Heading1"/>
         <w:pageBreakBefore/>
       </w:pPr>
-      <w:bookmarkStart w:id="72" w:name="_Toc243940889"/>
+      <w:bookmarkStart w:id="72" w:name="_Toc243940989"/>
       <w:r>
         <w:lastRenderedPageBreak/>
         <w:t>9. RESULTS AND EVALUATION</w:t>
@@ -15345,7 +15137,7 @@
       <w:pPr>
         <w:pStyle w:val="Heading2"/>
       </w:pPr>
-      <w:bookmarkStart w:id="73" w:name="_Toc243940890"/>
+      <w:bookmarkStart w:id="73" w:name="_Toc243940990"/>
       <w:r>
         <w:t>9.1 Evaluation Metrics</w:t>
       </w:r>
@@ -15448,7 +15240,7 @@
       <w:pPr>
         <w:pStyle w:val="Heading2"/>
       </w:pPr>
-      <w:bookmarkStart w:id="74" w:name="_Toc243940891"/>
+      <w:bookmarkStart w:id="74" w:name="_Toc243940991"/>
       <w:r>
         <w:t>9.2 Results on Held-Out Writers</w:t>
       </w:r>
@@ -15470,7 +15262,7 @@
         <w:spacing w:before="160" w:after="80"/>
         <w:jc w:val="center"/>
       </w:pPr>
-      <w:bookmarkStart w:id="75" w:name="_Toc243940766"/>
+      <w:bookmarkStart w:id="75" w:name="_Toc243940866"/>
       <w:r>
         <w:t xml:space="preserve">Table </w:t>
       </w:r>
@@ -16143,7 +15935,7 @@
         </w:rPr>
         <w:lastRenderedPageBreak/>
         <w:drawing>
-          <wp:inline distT="0" distB="0" distL="0" distR="0" wp14:anchorId="03B5262E" wp14:editId="57865D45">
+          <wp:inline distT="0" distB="0" distL="0" distR="0" wp14:anchorId="67FBB2F0" wp14:editId="3E0C861E">
             <wp:extent cx="5486400" cy="2085975"/>
             <wp:effectExtent l="0" t="0" r="0" b="0"/>
             <wp:docPr id="14" name="Picture 14"/>
@@ -16188,7 +15980,7 @@
         <w:spacing w:after="200"/>
         <w:jc w:val="center"/>
       </w:pPr>
-      <w:bookmarkStart w:id="76" w:name="_Toc243940756"/>
+      <w:bookmarkStart w:id="76" w:name="_Toc243940856"/>
       <w:r>
         <w:t xml:space="preserve">Figure </w:t>
       </w:r>
@@ -16219,7 +16011,7 @@
       <w:pPr>
         <w:pStyle w:val="Heading2"/>
       </w:pPr>
-      <w:bookmarkStart w:id="77" w:name="_Toc243940892"/>
+      <w:bookmarkStart w:id="77" w:name="_Toc243940992"/>
       <w:r>
         <w:t>9.3 Score Distributions and ROC</w:t>
       </w:r>
@@ -16245,7 +16037,7 @@
           <w:noProof/>
         </w:rPr>
         <w:drawing>
-          <wp:inline distT="0" distB="0" distL="0" distR="0" wp14:anchorId="58B5007F" wp14:editId="32E0FF93">
+          <wp:inline distT="0" distB="0" distL="0" distR="0" wp14:anchorId="0181FA14" wp14:editId="7263882F">
             <wp:extent cx="3400425" cy="2047875"/>
             <wp:effectExtent l="0" t="0" r="0" b="0"/>
             <wp:docPr id="15" name="Picture 15"/>
@@ -16290,7 +16082,7 @@
         <w:spacing w:after="200"/>
         <w:jc w:val="center"/>
       </w:pPr>
-      <w:bookmarkStart w:id="78" w:name="_Toc243940757"/>
+      <w:bookmarkStart w:id="78" w:name="_Toc243940857"/>
       <w:r>
         <w:t xml:space="preserve">Figure </w:t>
       </w:r>
@@ -16329,7 +16121,7 @@
         </w:rPr>
         <w:lastRenderedPageBreak/>
         <w:drawing>
-          <wp:inline distT="0" distB="0" distL="0" distR="0" wp14:anchorId="7CB97268" wp14:editId="7166EEF9">
+          <wp:inline distT="0" distB="0" distL="0" distR="0" wp14:anchorId="6F6C78BF" wp14:editId="2F611E90">
             <wp:extent cx="5486400" cy="2305050"/>
             <wp:effectExtent l="0" t="0" r="0" b="0"/>
             <wp:docPr id="16" name="Picture 16"/>
@@ -16374,7 +16166,7 @@
         <w:spacing w:after="200"/>
         <w:jc w:val="center"/>
       </w:pPr>
-      <w:bookmarkStart w:id="79" w:name="_Toc243940758"/>
+      <w:bookmarkStart w:id="79" w:name="_Toc243940858"/>
       <w:r>
         <w:t xml:space="preserve">Figure </w:t>
       </w:r>
@@ -16405,7 +16197,7 @@
       <w:pPr>
         <w:pStyle w:val="Heading2"/>
       </w:pPr>
-      <w:bookmarkStart w:id="80" w:name="_Toc243940893"/>
+      <w:bookmarkStart w:id="80" w:name="_Toc243940993"/>
       <w:r>
         <w:t>9.4 Discussion</w:t>
       </w:r>
@@ -16541,7 +16333,7 @@
       <w:pPr>
         <w:pStyle w:val="Heading2"/>
       </w:pPr>
-      <w:bookmarkStart w:id="81" w:name="_Toc243940894"/>
+      <w:bookmarkStart w:id="81" w:name="_Toc243940994"/>
       <w:r>
         <w:t>9.5 Example Decisions</w:t>
       </w:r>
@@ -16607,7 +16399,7 @@
                 <w:noProof/>
               </w:rPr>
               <w:drawing>
-                <wp:inline distT="0" distB="0" distL="0" distR="0" wp14:anchorId="14EAB594" wp14:editId="0B44B0A2">
+                <wp:inline distT="0" distB="0" distL="0" distR="0" wp14:anchorId="3BDE58CC" wp14:editId="5C0165D2">
                   <wp:extent cx="2667000" cy="1504950"/>
                   <wp:effectExtent l="0" t="0" r="0" b="0"/>
                   <wp:docPr id="17" name="Picture 17"/>
@@ -16652,7 +16444,7 @@
               <w:spacing w:after="120"/>
               <w:jc w:val="center"/>
             </w:pPr>
-            <w:bookmarkStart w:id="82" w:name="_Toc243940759"/>
+            <w:bookmarkStart w:id="82" w:name="_Toc243940859"/>
             <w:r>
               <w:t xml:space="preserve">Figure </w:t>
             </w:r>
@@ -16704,7 +16496,7 @@
                 <w:noProof/>
               </w:rPr>
               <w:drawing>
-                <wp:inline distT="0" distB="0" distL="0" distR="0" wp14:anchorId="6538DD5D" wp14:editId="5191208F">
+                <wp:inline distT="0" distB="0" distL="0" distR="0" wp14:anchorId="3CAC0FB7" wp14:editId="2FE3C4EF">
                   <wp:extent cx="2667000" cy="1504950"/>
                   <wp:effectExtent l="0" t="0" r="0" b="0"/>
                   <wp:docPr id="18" name="Picture 18"/>
@@ -16749,7 +16541,7 @@
               <w:spacing w:after="120"/>
               <w:jc w:val="center"/>
             </w:pPr>
-            <w:bookmarkStart w:id="83" w:name="_Toc243940760"/>
+            <w:bookmarkStart w:id="83" w:name="_Toc243940860"/>
             <w:r>
               <w:t xml:space="preserve">Figure </w:t>
             </w:r>
@@ -16789,7 +16581,7 @@
         <w:pStyle w:val="Heading1"/>
         <w:pageBreakBefore/>
       </w:pPr>
-      <w:bookmarkStart w:id="84" w:name="_Toc243940895"/>
+      <w:bookmarkStart w:id="84" w:name="_Toc243940995"/>
       <w:r>
         <w:lastRenderedPageBreak/>
         <w:t>10. APPLICATIONS</w:t>
@@ -16969,7 +16761,7 @@
         <w:pStyle w:val="Heading1"/>
         <w:spacing w:before="480"/>
       </w:pPr>
-      <w:bookmarkStart w:id="85" w:name="_Toc243940896"/>
+      <w:bookmarkStart w:id="85" w:name="_Toc243940996"/>
       <w:r>
         <w:t>11. FUTURE SCOPE</w:t>
       </w:r>
@@ -17180,7 +16972,7 @@
         <w:pStyle w:val="Heading1"/>
         <w:spacing w:before="480"/>
       </w:pPr>
-      <w:bookmarkStart w:id="86" w:name="_Toc243940897"/>
+      <w:bookmarkStart w:id="86" w:name="_Toc243940997"/>
       <w:r>
         <w:t>12. CONCLUSION</w:t>
       </w:r>
@@ -17228,7 +17020,7 @@
         <w:pStyle w:val="Heading1"/>
         <w:pageBreakBefore/>
       </w:pPr>
-      <w:bookmarkStart w:id="87" w:name="_Toc243940898"/>
+      <w:bookmarkStart w:id="87" w:name="_Toc243940998"/>
       <w:r>
         <w:lastRenderedPageBreak/>
         <w:t>REFERENCES</w:t>
@@ -17480,7 +17272,7 @@
         <w:pStyle w:val="Heading1"/>
         <w:pageBreakBefore/>
       </w:pPr>
-      <w:bookmarkStart w:id="88" w:name="_Toc243940899"/>
+      <w:bookmarkStart w:id="88" w:name="_Toc243940999"/>
       <w:r>
         <w:lastRenderedPageBreak/>
         <w:t>APPENDIX A: PROJECT FILE LISTING</w:t>
@@ -17503,7 +17295,7 @@
         <w:spacing w:before="160" w:after="80"/>
         <w:jc w:val="center"/>
       </w:pPr>
-      <w:bookmarkStart w:id="89" w:name="_Toc243940767"/>
+      <w:bookmarkStart w:id="89" w:name="_Toc243940867"/>
       <w:r>
         <w:t xml:space="preserve">Table </w:t>
       </w:r>
@@ -19189,7 +18981,7 @@
         <w:pStyle w:val="Heading1"/>
         <w:spacing w:before="360"/>
       </w:pPr>
-      <w:bookmarkStart w:id="90" w:name="_Toc243940900"/>
+      <w:bookmarkStart w:id="90" w:name="_Toc243941000"/>
       <w:r>
         <w:t>APPENDIX B: HOW TO RUN AND REPRODUCE</w:t>
       </w:r>
@@ -19526,7 +19318,7 @@
         <w:pStyle w:val="Heading1"/>
         <w:spacing w:before="360"/>
       </w:pPr>
-      <w:bookmarkStart w:id="91" w:name="_Toc243940901"/>
+      <w:bookmarkStart w:id="91" w:name="_Toc243941001"/>
       <w:r>
         <w:t>APPENDIX C: SAMPLE ACTIVITY LOG</w:t>
       </w:r>
@@ -19846,7 +19638,7 @@
         <w:sz w:val="24"/>
         <w:szCs w:val="24"/>
       </w:rPr>
-      <w:t>ii</w:t>
+      <w:t>i</w:t>
     </w:r>
     <w:r>
       <w:rPr>
@@ -19860,12 +19652,6 @@
 </file>
 
 <file path=word/footer2.xml><?xml version="1.0" encoding="utf-8"?>
-<w:ftr xmlns:wpc="http://schemas.microsoft.com/office/word/2010/wordprocessingCanvas" xmlns:cx="http://schemas.microsoft.com/office/drawing/2014/chartex" xmlns:cx1="http://schemas.microsoft.com/office/drawing/2015/9/8/chartex" xmlns:cx2="http://schemas.microsoft.com/office/drawing/2015/10/21/chartex" xmlns:cx3="http://schemas.microsoft.com/office/drawing/2016/5/9/chartex" xmlns:cx4="http://schemas.microsoft.com/office/drawing/2016/5/10/chartex" xmlns:cx5="http://schemas.microsoft.com/office/drawing/2016/5/11/chartex" xmlns:cx6="http://schemas.microsoft.com/office/drawing/2016/5/12/chartex" xmlns:cx7="http://schemas.microsoft.com/office/drawing/2016/5/13/chartex" xmlns:cx8="http://schemas.microsoft.com/office/drawing/2016/5/14/chartex" xmlns:mc="http://schemas.openxmlformats.org/markup-compatibility/2006" xmlns:aink="http://schemas.microsoft.com/office/drawing/2016/ink" xmlns:am3d="http://schemas.microsoft.com/office/drawing/2017/model3d" xmlns:o="urn:schemas-microsoft-com:office:office" xmlns:oel="http://schemas.microsoft.com/office/2019/extlst" xmlns:r="http://schemas.openxmlformats.org/officeDocument/2006/relationships" xmlns:m="http://schemas.openxmlformats.org/officeDocument/2006/math" xmlns:v="urn:schemas-microsoft-com:vml" xmlns:wp14="http://schemas.microsoft.com/office/word/2010/wordprocessingDrawing" xmlns:wp="http://schemas.openxmlformats.org/drawingml/2006/wordprocessingDrawing" xmlns:w10="urn:schemas-microsoft-com:office:word" xmlns:w="http://schemas.openxmlformats.org/wordprocessingml/2006/main" xmlns:w14="http://schemas.microsoft.com/office/word/2010/wordml" xmlns:w15="http://schemas.microsoft.com/office/word/2012/wordml" xmlns:w16cex="http://schemas.microsoft.com/office/word/2018/wordml/cex" xmlns:w16cid="http://schemas.microsoft.com/office/word/2016/wordml/cid" xmlns:w16="http://schemas.microsoft.com/office/word/2018/wordml" xmlns:w16du="http://schemas.microsoft.com/office/word/2023/wordml/word16du" xmlns:w16sdtdh="http://schemas.microsoft.com/office/word/2020/wordml/sdtdatahash" xmlns:w16sdtfl="http://schemas.microsoft.com/office/word/2024/wordml/sdtformatlock" xmlns:w16se="http://schemas.microsoft.com/office/word/2015/wordml/symex" xmlns:wpg="http://schemas.microsoft.com/office/word/2010/wordprocessingGroup" xmlns:wpi="http://schemas.microsoft.com/office/word/2010/wordprocessingInk" xmlns:wne="http://schemas.microsoft.com/office/word/2006/wordml" xmlns:wps="http://schemas.microsoft.com/office/word/2010/wordprocessingShape" mc:Ignorable="w14 w15 w16se w16cid w16 w16cex w16sdtdh w16sdtfl w16du wp14">
-  <w:p/>
-</w:ftr>
-</file>
-
-<file path=word/footer3.xml><?xml version="1.0" encoding="utf-8"?>
 <w:ftr xmlns:wpc="http://schemas.microsoft.com/office/word/2010/wordprocessingCanvas" xmlns:cx="http://schemas.microsoft.com/office/drawing/2014/chartex" xmlns:cx1="http://schemas.microsoft.com/office/drawing/2015/9/8/chartex" xmlns:cx2="http://schemas.microsoft.com/office/drawing/2015/10/21/chartex" xmlns:cx3="http://schemas.microsoft.com/office/drawing/2016/5/9/chartex" xmlns:cx4="http://schemas.microsoft.com/office/drawing/2016/5/10/chartex" xmlns:cx5="http://schemas.microsoft.com/office/drawing/2016/5/11/chartex" xmlns:cx6="http://schemas.microsoft.com/office/drawing/2016/5/12/chartex" xmlns:cx7="http://schemas.microsoft.com/office/drawing/2016/5/13/chartex" xmlns:cx8="http://schemas.microsoft.com/office/drawing/2016/5/14/chartex" xmlns:mc="http://schemas.openxmlformats.org/markup-compatibility/2006" xmlns:aink="http://schemas.microsoft.com/office/drawing/2016/ink" xmlns:am3d="http://schemas.microsoft.com/office/drawing/2017/model3d" xmlns:o="urn:schemas-microsoft-com:office:office" xmlns:oel="http://schemas.microsoft.com/office/2019/extlst" xmlns:r="http://schemas.openxmlformats.org/officeDocument/2006/relationships" xmlns:m="http://schemas.openxmlformats.org/officeDocument/2006/math" xmlns:v="urn:schemas-microsoft-com:vml" xmlns:wp14="http://schemas.microsoft.com/office/word/2010/wordprocessingDrawing" xmlns:wp="http://schemas.openxmlformats.org/drawingml/2006/wordprocessingDrawing" xmlns:w10="urn:schemas-microsoft-com:office:word" xmlns:w="http://schemas.openxmlformats.org/wordprocessingml/2006/main" xmlns:w14="http://schemas.microsoft.com/office/word/2010/wordml" xmlns:w15="http://schemas.microsoft.com/office/word/2012/wordml" xmlns:w16cex="http://schemas.microsoft.com/office/word/2018/wordml/cex" xmlns:w16cid="http://schemas.microsoft.com/office/word/2016/wordml/cid" xmlns:w16="http://schemas.microsoft.com/office/word/2018/wordml" xmlns:w16du="http://schemas.microsoft.com/office/word/2023/wordml/word16du" xmlns:w16sdtdh="http://schemas.microsoft.com/office/word/2020/wordml/sdtdatahash" xmlns:w16sdtfl="http://schemas.microsoft.com/office/word/2024/wordml/sdtformatlock" xmlns:w16se="http://schemas.microsoft.com/office/word/2015/wordml/symex" xmlns:wpg="http://schemas.microsoft.com/office/word/2010/wordprocessingGroup" xmlns:wpi="http://schemas.microsoft.com/office/word/2010/wordprocessingInk" xmlns:wne="http://schemas.microsoft.com/office/word/2006/wordml" xmlns:wps="http://schemas.microsoft.com/office/word/2010/wordprocessingShape" mc:Ignorable="w14 w15 w16se w16cid w16 w16cex w16sdtdh w16sdtfl w16du wp14">
   <w:p>
     <w:pPr>
@@ -19933,150 +19719,118 @@
 <file path=word/numbering.xml><?xml version="1.0" encoding="utf-8"?>
 <w:numbering xmlns:wpc="http://schemas.microsoft.com/office/word/2010/wordprocessingCanvas" xmlns:cx="http://schemas.microsoft.com/office/drawing/2014/chartex" xmlns:cx1="http://schemas.microsoft.com/office/drawing/2015/9/8/chartex" xmlns:cx2="http://schemas.microsoft.com/office/drawing/2015/10/21/chartex" xmlns:cx3="http://schemas.microsoft.com/office/drawing/2016/5/9/chartex" xmlns:cx4="http://schemas.microsoft.com/office/drawing/2016/5/10/chartex" xmlns:cx5="http://schemas.microsoft.com/office/drawing/2016/5/11/chartex" xmlns:cx6="http://schemas.microsoft.com/office/drawing/2016/5/12/chartex" xmlns:cx7="http://schemas.microsoft.com/office/drawing/2016/5/13/chartex" xmlns:cx8="http://schemas.microsoft.com/office/drawing/2016/5/14/chartex" xmlns:mc="http://schemas.openxmlformats.org/markup-compatibility/2006" xmlns:aink="http://schemas.microsoft.com/office/drawing/2016/ink" xmlns:am3d="http://schemas.microsoft.com/office/drawing/2017/model3d" xmlns:o="urn:schemas-microsoft-com:office:office" xmlns:oel="http://schemas.microsoft.com/office/2019/extlst" xmlns:r="http://schemas.openxmlformats.org/officeDocument/2006/relationships" xmlns:m="http://schemas.openxmlformats.org/officeDocument/2006/math" xmlns:v="urn:schemas-microsoft-com:vml" xmlns:wp14="http://schemas.microsoft.com/office/word/2010/wordprocessingDrawing" xmlns:wp="http://schemas.openxmlformats.org/drawingml/2006/wordprocessingDrawing" xmlns:w10="urn:schemas-microsoft-com:office:word" xmlns:w="http://schemas.openxmlformats.org/wordprocessingml/2006/main" xmlns:w14="http://schemas.microsoft.com/office/word/2010/wordml" xmlns:w15="http://schemas.microsoft.com/office/word/2012/wordml" xmlns:w16cex="http://schemas.microsoft.com/office/word/2018/wordml/cex" xmlns:w16cid="http://schemas.microsoft.com/office/word/2016/wordml/cid" xmlns:w16="http://schemas.microsoft.com/office/word/2018/wordml" xmlns:w16du="http://schemas.microsoft.com/office/word/2023/wordml/word16du" xmlns:w16sdtdh="http://schemas.microsoft.com/office/word/2020/wordml/sdtdatahash" xmlns:w16sdtfl="http://schemas.microsoft.com/office/word/2024/wordml/sdtformatlock" xmlns:w16se="http://schemas.microsoft.com/office/word/2015/wordml/symex" xmlns:wpg="http://schemas.microsoft.com/office/word/2010/wordprocessingGroup" xmlns:wpi="http://schemas.microsoft.com/office/word/2010/wordprocessingInk" xmlns:wne="http://schemas.microsoft.com/office/word/2006/wordml" xmlns:wps="http://schemas.microsoft.com/office/word/2010/wordprocessingShape" mc:Ignorable="w14 w15 w16se w16cid w16 w16cex w16sdtdh w16sdtfl w16du wp14">
   <w:abstractNum w:abstractNumId="0" w15:restartNumberingAfterBreak="0">
-    <w:nsid w:val="34CE0C2C"/>
+    <w:nsid w:val="1311338B"/>
     <w:multiLevelType w:val="hybridMultilevel"/>
-    <w:tmpl w:val="5FC0E3DE"/>
-    <w:lvl w:ilvl="0" w:tplc="4036D8C4">
+    <w:tmpl w:val="217E4E7A"/>
+    <w:lvl w:ilvl="0" w:tplc="F648D80C" w:tentative="1">
       <w:start w:val="1"/>
       <w:numFmt w:val="decimal"/>
-      <w:lvlText w:val="[%1]"/>
+      <w:lvlText w:val="%1."/>
       <w:lvlJc w:val="left"/>
       <w:pPr>
-        <w:ind w:left="720" w:hanging="540"/>
+        <w:ind w:left="720" w:hanging="360"/>
       </w:pPr>
     </w:lvl>
-    <w:lvl w:ilvl="1" w:tplc="8A3EE6FE">
+    <w:lvl w:ilvl="1" w:tplc="F02A31CE">
       <w:numFmt w:val="decimal"/>
       <w:lvlText w:val=""/>
       <w:lvlJc w:val="left"/>
     </w:lvl>
-    <w:lvl w:ilvl="2" w:tplc="4DD69C8E">
+    <w:lvl w:ilvl="2" w:tplc="12220D62">
       <w:numFmt w:val="decimal"/>
       <w:lvlText w:val=""/>
       <w:lvlJc w:val="left"/>
     </w:lvl>
-    <w:lvl w:ilvl="3" w:tplc="59B87048">
+    <w:lvl w:ilvl="3" w:tplc="C59800FC">
       <w:numFmt w:val="decimal"/>
       <w:lvlText w:val=""/>
       <w:lvlJc w:val="left"/>
     </w:lvl>
-    <w:lvl w:ilvl="4" w:tplc="FA64722C">
+    <w:lvl w:ilvl="4" w:tplc="2236C5CC">
       <w:numFmt w:val="decimal"/>
       <w:lvlText w:val=""/>
       <w:lvlJc w:val="left"/>
     </w:lvl>
-    <w:lvl w:ilvl="5" w:tplc="623E6FAA">
+    <w:lvl w:ilvl="5" w:tplc="9800BDC0">
       <w:numFmt w:val="decimal"/>
       <w:lvlText w:val=""/>
       <w:lvlJc w:val="left"/>
     </w:lvl>
-    <w:lvl w:ilvl="6" w:tplc="6126575C">
+    <w:lvl w:ilvl="6" w:tplc="094C280C">
       <w:numFmt w:val="decimal"/>
       <w:lvlText w:val=""/>
       <w:lvlJc w:val="left"/>
     </w:lvl>
-    <w:lvl w:ilvl="7" w:tplc="F5D6B888">
+    <w:lvl w:ilvl="7" w:tplc="DE2CF578">
       <w:numFmt w:val="decimal"/>
       <w:lvlText w:val=""/>
       <w:lvlJc w:val="left"/>
     </w:lvl>
-    <w:lvl w:ilvl="8" w:tplc="C90AFF6A">
+    <w:lvl w:ilvl="8" w:tplc="B23AEA3E">
       <w:numFmt w:val="decimal"/>
       <w:lvlText w:val=""/>
       <w:lvlJc w:val="left"/>
     </w:lvl>
   </w:abstractNum>
   <w:abstractNum w:abstractNumId="1" w15:restartNumberingAfterBreak="0">
-    <w:nsid w:val="3AC60423"/>
+    <w:nsid w:val="343166AC"/>
     <w:multiLevelType w:val="hybridMultilevel"/>
-    <w:tmpl w:val="E8303B66"/>
-    <w:lvl w:ilvl="0" w:tplc="11148D46" w:tentative="1">
+    <w:tmpl w:val="2BA0112C"/>
+    <w:lvl w:ilvl="0" w:tplc="45FAFB6A">
       <w:start w:val="1"/>
-      <w:numFmt w:val="bullet"/>
-      <w:lvlText w:val="●"/>
+      <w:numFmt w:val="decimal"/>
+      <w:lvlText w:val="[%1]"/>
       <w:lvlJc w:val="left"/>
       <w:pPr>
-        <w:ind w:left="720" w:hanging="360"/>
+        <w:ind w:left="720" w:hanging="540"/>
       </w:pPr>
     </w:lvl>
-    <w:lvl w:ilvl="1" w:tplc="5BA89DFE" w:tentative="1">
-      <w:start w:val="1"/>
-      <w:numFmt w:val="bullet"/>
-      <w:lvlText w:val="○"/>
+    <w:lvl w:ilvl="1" w:tplc="B7DE6B00">
+      <w:numFmt w:val="decimal"/>
+      <w:lvlText w:val=""/>
       <w:lvlJc w:val="left"/>
-      <w:pPr>
-        <w:ind w:left="1440" w:hanging="360"/>
-      </w:pPr>
     </w:lvl>
-    <w:lvl w:ilvl="2" w:tplc="8E303DC2" w:tentative="1">
-      <w:start w:val="1"/>
-      <w:numFmt w:val="bullet"/>
-      <w:lvlText w:val="■"/>
+    <w:lvl w:ilvl="2" w:tplc="3D44B3FA">
+      <w:numFmt w:val="decimal"/>
+      <w:lvlText w:val=""/>
       <w:lvlJc w:val="left"/>
-      <w:pPr>
-        <w:ind w:left="2160" w:hanging="360"/>
-      </w:pPr>
     </w:lvl>
-    <w:lvl w:ilvl="3" w:tplc="A4A83CBC" w:tentative="1">
-      <w:start w:val="1"/>
-      <w:numFmt w:val="bullet"/>
-      <w:lvlText w:val="●"/>
+    <w:lvl w:ilvl="3" w:tplc="2D4C2E18">
+      <w:numFmt w:val="decimal"/>
+      <w:lvlText w:val=""/>
       <w:lvlJc w:val="left"/>
-      <w:pPr>
-        <w:ind w:left="2880" w:hanging="360"/>
-      </w:pPr>
     </w:lvl>
-    <w:lvl w:ilvl="4" w:tplc="67246B60" w:tentative="1">
-      <w:start w:val="1"/>
-      <w:numFmt w:val="bullet"/>
-      <w:lvlText w:val="○"/>
+    <w:lvl w:ilvl="4" w:tplc="D8560018">
+      <w:numFmt w:val="decimal"/>
+      <w:lvlText w:val=""/>
       <w:lvlJc w:val="left"/>
-      <w:pPr>
-        <w:ind w:left="3600" w:hanging="360"/>
-      </w:pPr>
     </w:lvl>
-    <w:lvl w:ilvl="5" w:tplc="9926B0A0" w:tentative="1">
-      <w:start w:val="1"/>
-      <w:numFmt w:val="bullet"/>
-      <w:lvlText w:val="■"/>
+    <w:lvl w:ilvl="5" w:tplc="108874F4">
+      <w:numFmt w:val="decimal"/>
+      <w:lvlText w:val=""/>
       <w:lvlJc w:val="left"/>
-      <w:pPr>
-        <w:ind w:left="4320" w:hanging="360"/>
-      </w:pPr>
     </w:lvl>
-    <w:lvl w:ilvl="6" w:tplc="9CC0FC0C" w:tentative="1">
-      <w:start w:val="1"/>
-      <w:numFmt w:val="bullet"/>
-      <w:lvlText w:val="●"/>
+    <w:lvl w:ilvl="6" w:tplc="47DAF9AC">
+      <w:numFmt w:val="decimal"/>
+      <w:lvlText w:val=""/>
       <w:lvlJc w:val="left"/>
-      <w:pPr>
-        <w:ind w:left="5040" w:hanging="360"/>
-      </w:pPr>
     </w:lvl>
-    <w:lvl w:ilvl="7" w:tplc="07A004EC" w:tentative="1">
-      <w:start w:val="1"/>
-      <w:numFmt w:val="bullet"/>
-      <w:lvlText w:val="●"/>
+    <w:lvl w:ilvl="7" w:tplc="DF30AECA">
+      <w:numFmt w:val="decimal"/>
+      <w:lvlText w:val=""/>
       <w:lvlJc w:val="left"/>
-      <w:pPr>
-        <w:ind w:left="5760" w:hanging="360"/>
-      </w:pPr>
     </w:lvl>
-    <w:lvl w:ilvl="8" w:tplc="40E87514" w:tentative="1">
-      <w:start w:val="1"/>
-      <w:numFmt w:val="bullet"/>
-      <w:lvlText w:val="●"/>
+    <w:lvl w:ilvl="8" w:tplc="E850F4B8">
+      <w:numFmt w:val="decimal"/>
+      <w:lvlText w:val=""/>
       <w:lvlJc w:val="left"/>
-      <w:pPr>
-        <w:ind w:left="6480" w:hanging="360"/>
-      </w:pPr>
     </w:lvl>
   </w:abstractNum>
   <w:abstractNum w:abstractNumId="2" w15:restartNumberingAfterBreak="0">
-    <w:nsid w:val="3D831632"/>
+    <w:nsid w:val="542F697A"/>
     <w:multiLevelType w:val="hybridMultilevel"/>
-    <w:tmpl w:val="63807BFC"/>
-    <w:lvl w:ilvl="0" w:tplc="17BE42C0">
+    <w:tmpl w:val="6436FB52"/>
+    <w:lvl w:ilvl="0" w:tplc="39FE1B78">
       <w:start w:val="1"/>
       <w:numFmt w:val="bullet"/>
       <w:lvlText w:val="•"/>
@@ -20085,7 +19839,7 @@
         <w:ind w:left="720" w:hanging="360"/>
       </w:pPr>
     </w:lvl>
-    <w:lvl w:ilvl="1" w:tplc="2A72DD58" w:tentative="1">
+    <w:lvl w:ilvl="1" w:tplc="50D42B72" w:tentative="1">
       <w:start w:val="1"/>
       <w:numFmt w:val="bullet"/>
       <w:lvlText w:val="◦"/>
@@ -20094,103 +19848,135 @@
         <w:ind w:left="1440" w:hanging="360"/>
       </w:pPr>
     </w:lvl>
-    <w:lvl w:ilvl="2" w:tplc="0890EC4A">
+    <w:lvl w:ilvl="2" w:tplc="357066D2">
       <w:numFmt w:val="decimal"/>
       <w:lvlText w:val=""/>
       <w:lvlJc w:val="left"/>
     </w:lvl>
-    <w:lvl w:ilvl="3" w:tplc="7EBA1858">
+    <w:lvl w:ilvl="3" w:tplc="FAE26396">
       <w:numFmt w:val="decimal"/>
       <w:lvlText w:val=""/>
       <w:lvlJc w:val="left"/>
     </w:lvl>
-    <w:lvl w:ilvl="4" w:tplc="3C9ECA0A">
+    <w:lvl w:ilvl="4" w:tplc="DBD04BEC">
       <w:numFmt w:val="decimal"/>
       <w:lvlText w:val=""/>
       <w:lvlJc w:val="left"/>
     </w:lvl>
-    <w:lvl w:ilvl="5" w:tplc="8ABCD676">
+    <w:lvl w:ilvl="5" w:tplc="0CEE55DA">
       <w:numFmt w:val="decimal"/>
       <w:lvlText w:val=""/>
       <w:lvlJc w:val="left"/>
     </w:lvl>
-    <w:lvl w:ilvl="6" w:tplc="EEF8269E">
+    <w:lvl w:ilvl="6" w:tplc="124A1B60">
       <w:numFmt w:val="decimal"/>
       <w:lvlText w:val=""/>
       <w:lvlJc w:val="left"/>
     </w:lvl>
-    <w:lvl w:ilvl="7" w:tplc="FA227390">
+    <w:lvl w:ilvl="7" w:tplc="A9D044C4">
       <w:numFmt w:val="decimal"/>
       <w:lvlText w:val=""/>
       <w:lvlJc w:val="left"/>
     </w:lvl>
-    <w:lvl w:ilvl="8" w:tplc="EAC4EAF0">
+    <w:lvl w:ilvl="8" w:tplc="87B8FDA0">
       <w:numFmt w:val="decimal"/>
       <w:lvlText w:val=""/>
       <w:lvlJc w:val="left"/>
     </w:lvl>
   </w:abstractNum>
   <w:abstractNum w:abstractNumId="3" w15:restartNumberingAfterBreak="0">
-    <w:nsid w:val="72226055"/>
+    <w:nsid w:val="57AC2493"/>
     <w:multiLevelType w:val="hybridMultilevel"/>
-    <w:tmpl w:val="F0884EE4"/>
-    <w:lvl w:ilvl="0" w:tplc="1108A470" w:tentative="1">
+    <w:tmpl w:val="ED8C9C80"/>
+    <w:lvl w:ilvl="0" w:tplc="5EBE3250" w:tentative="1">
       <w:start w:val="1"/>
-      <w:numFmt w:val="decimal"/>
-      <w:lvlText w:val="%1."/>
+      <w:numFmt w:val="bullet"/>
+      <w:lvlText w:val="●"/>
       <w:lvlJc w:val="left"/>
       <w:pPr>
         <w:ind w:left="720" w:hanging="360"/>
       </w:pPr>
     </w:lvl>
-    <w:lvl w:ilvl="1" w:tplc="D69E0520">
-      <w:numFmt w:val="decimal"/>
-      <w:lvlText w:val=""/>
+    <w:lvl w:ilvl="1" w:tplc="B26A4108" w:tentative="1">
+      <w:start w:val="1"/>
+      <w:numFmt w:val="bullet"/>
+      <w:lvlText w:val="○"/>
       <w:lvlJc w:val="left"/>
+      <w:pPr>
+        <w:ind w:left="1440" w:hanging="360"/>
+      </w:pPr>
     </w:lvl>
-    <w:lvl w:ilvl="2" w:tplc="FB687BCA">
-      <w:numFmt w:val="decimal"/>
-      <w:lvlText w:val=""/>
+    <w:lvl w:ilvl="2" w:tplc="2924D7BA" w:tentative="1">
+      <w:start w:val="1"/>
+      <w:numFmt w:val="bullet"/>
+      <w:lvlText w:val="■"/>
       <w:lvlJc w:val="left"/>
+      <w:pPr>
+        <w:ind w:left="2160" w:hanging="360"/>
+      </w:pPr>
     </w:lvl>
-    <w:lvl w:ilvl="3" w:tplc="9A228502">
-      <w:numFmt w:val="decimal"/>
-      <w:lvlText w:val=""/>
+    <w:lvl w:ilvl="3" w:tplc="97A88486" w:tentative="1">
+      <w:start w:val="1"/>
+      <w:numFmt w:val="bullet"/>
+      <w:lvlText w:val="●"/>
       <w:lvlJc w:val="left"/>
+      <w:pPr>
+        <w:ind w:left="2880" w:hanging="360"/>
+      </w:pPr>
     </w:lvl>
-    <w:lvl w:ilvl="4" w:tplc="29DEA81E">
-      <w:numFmt w:val="decimal"/>
-      <w:lvlText w:val=""/>
+    <w:lvl w:ilvl="4" w:tplc="9B8E1DDA" w:tentative="1">
+      <w:start w:val="1"/>
+      <w:numFmt w:val="bullet"/>
+      <w:lvlText w:val="○"/>
       <w:lvlJc w:val="left"/>
+      <w:pPr>
+        <w:ind w:left="3600" w:hanging="360"/>
+      </w:pPr>
     </w:lvl>
-    <w:lvl w:ilvl="5" w:tplc="37A05814">
-      <w:numFmt w:val="decimal"/>
-      <w:lvlText w:val=""/>
+    <w:lvl w:ilvl="5" w:tplc="B4860176" w:tentative="1">
+      <w:start w:val="1"/>
+      <w:numFmt w:val="bullet"/>
+      <w:lvlText w:val="■"/>
       <w:lvlJc w:val="left"/>
+      <w:pPr>
+        <w:ind w:left="4320" w:hanging="360"/>
+      </w:pPr>
     </w:lvl>
-    <w:lvl w:ilvl="6" w:tplc="84287CBC">
-      <w:numFmt w:val="decimal"/>
-      <w:lvlText w:val=""/>
+    <w:lvl w:ilvl="6" w:tplc="51083AEE" w:tentative="1">
+      <w:start w:val="1"/>
+      <w:numFmt w:val="bullet"/>
+      <w:lvlText w:val="●"/>
       <w:lvlJc w:val="left"/>
+      <w:pPr>
+        <w:ind w:left="5040" w:hanging="360"/>
+      </w:pPr>
     </w:lvl>
-    <w:lvl w:ilvl="7" w:tplc="C5C4943A">
-      <w:numFmt w:val="decimal"/>
-      <w:lvlText w:val=""/>
+    <w:lvl w:ilvl="7" w:tplc="18D03792" w:tentative="1">
+      <w:start w:val="1"/>
+      <w:numFmt w:val="bullet"/>
+      <w:lvlText w:val="●"/>
       <w:lvlJc w:val="left"/>
+      <w:pPr>
+        <w:ind w:left="5760" w:hanging="360"/>
+      </w:pPr>
     </w:lvl>
-    <w:lvl w:ilvl="8" w:tplc="D8003274">
-      <w:numFmt w:val="decimal"/>
-      <w:lvlText w:val=""/>
+    <w:lvl w:ilvl="8" w:tplc="312CCA6E" w:tentative="1">
+      <w:start w:val="1"/>
+      <w:numFmt w:val="bullet"/>
+      <w:lvlText w:val="●"/>
       <w:lvlJc w:val="left"/>
+      <w:pPr>
+        <w:ind w:left="6480" w:hanging="360"/>
+      </w:pPr>
     </w:lvl>
   </w:abstractNum>
-  <w:num w:numId="1" w16cid:durableId="1945070604">
-    <w:abstractNumId w:val="1"/>
+  <w:num w:numId="1" w16cid:durableId="1989245298">
+    <w:abstractNumId w:val="3"/>
     <w:lvlOverride w:ilvl="0">
       <w:startOverride w:val="1"/>
     </w:lvlOverride>
   </w:num>
-  <w:num w:numId="2" w16cid:durableId="456026377">
+  <w:num w:numId="2" w16cid:durableId="2141914625">
     <w:abstractNumId w:val="2"/>
     <w:lvlOverride w:ilvl="0">
       <w:startOverride w:val="1"/>
@@ -20199,8 +19985,8 @@
       <w:startOverride w:val="1"/>
     </w:lvlOverride>
   </w:num>
-  <w:num w:numId="3" w16cid:durableId="1910112510">
-    <w:abstractNumId w:val="0"/>
+  <w:num w:numId="3" w16cid:durableId="561214859">
+    <w:abstractNumId w:val="1"/>
     <w:lvlOverride w:ilvl="0">
       <w:startOverride w:val="1"/>
     </w:lvlOverride>
@@ -20969,7 +20755,7 @@
     <w:next w:val="Normal"/>
     <w:uiPriority w:val="99"/>
     <w:unhideWhenUsed/>
-    <w:rsid w:val="0041662A"/>
+    <w:rsid w:val="005254DD"/>
   </w:style>
 </w:styles>
 </file>

</xml_diff>

<commit_message>
Acknowledge Dr. Rajeev Gupta and drop student names from acknowledgement
</commit_message>
<xml_diff>
--- a/report/DSP_Signature_Verification_Report.docx
+++ b/report/DSP_Signature_Verification_Report.docx
@@ -16,7 +16,7 @@
           <w:noProof/>
         </w:rPr>
         <w:drawing>
-          <wp:inline distT="0" distB="0" distL="0" distR="0" wp14:anchorId="1224D008" wp14:editId="294D8BD0">
+          <wp:inline distT="0" distB="0" distL="0" distR="0" wp14:anchorId="58BAE4C8" wp14:editId="14E7B329">
             <wp:extent cx="7553325" cy="10648950"/>
             <wp:effectExtent l="0" t="0" r="0" b="0"/>
             <wp:docPr id="19" name="Picture 19"/>
@@ -59,7 +59,7 @@
       <w:pPr>
         <w:pStyle w:val="Heading1"/>
       </w:pPr>
-      <w:bookmarkStart w:id="0" w:name="_Toc243940935"/>
+      <w:bookmarkStart w:id="0" w:name="_Toc243941068"/>
       <w:r>
         <w:lastRenderedPageBreak/>
         <w:t>ACKNOWLEDGEMENT</w:t>
@@ -95,7 +95,14 @@
         <w:jc w:val="both"/>
       </w:pPr>
       <w:r>
-        <w:t>1.  Prof. _________________________________________</w:t>
+        <w:t xml:space="preserve">1.  </w:t>
+      </w:r>
+      <w:r>
+        <w:rPr>
+          <w:b/>
+          <w:bCs/>
+        </w:rPr>
+        <w:t>Dr. Rajeev Gupta</w:t>
       </w:r>
     </w:p>
     <w:p>
@@ -104,7 +111,7 @@
         <w:jc w:val="both"/>
       </w:pPr>
       <w:r>
-        <w:t xml:space="preserve">     (Designation, Department)</w:t>
+        <w:t xml:space="preserve">     Department of Electronics and Communication Engineering, MNNIT Allahabad</w:t>
       </w:r>
     </w:p>
     <w:p>
@@ -183,23 +190,10 @@
     </w:p>
     <w:p>
       <w:pPr>
-        <w:spacing w:before="400"/>
-        <w:jc w:val="right"/>
-      </w:pPr>
-      <w:r>
-        <w:rPr>
-          <w:i/>
-          <w:iCs/>
-        </w:rPr>
-        <w:t>Ashish Singh, Ayush Agarwal, Ayush Jadaun, Ayush Kaushal</w:t>
-      </w:r>
-    </w:p>
-    <w:p>
-      <w:pPr>
         <w:pStyle w:val="Heading1"/>
         <w:pageBreakBefore/>
       </w:pPr>
-      <w:bookmarkStart w:id="1" w:name="_Toc243940936"/>
+      <w:bookmarkStart w:id="1" w:name="_Toc243941069"/>
       <w:r>
         <w:lastRenderedPageBreak/>
         <w:t>PREFACE</w:t>
@@ -253,7 +247,7 @@
         <w:pStyle w:val="Heading1"/>
         <w:pageBreakBefore/>
       </w:pPr>
-      <w:bookmarkStart w:id="2" w:name="_Toc243940937"/>
+      <w:bookmarkStart w:id="2" w:name="_Toc243941070"/>
       <w:r>
         <w:lastRenderedPageBreak/>
         <w:t>INDEX</w:t>
@@ -263,7 +257,7 @@
     <w:sdt>
       <w:sdtPr>
         <w:alias w:val="Index"/>
-        <w:id w:val="1490982605"/>
+        <w:id w:val="-1585370411"/>
       </w:sdtPr>
       <w:sdtEndPr/>
       <w:sdtContent>
@@ -291,7 +285,7 @@
           <w:r>
             <w:fldChar w:fldCharType="separate"/>
           </w:r>
-          <w:hyperlink w:anchor="_Toc243940935" w:history="1">
+          <w:hyperlink w:anchor="_Toc243941068" w:history="1">
             <w:r>
               <w:rPr>
                 <w:rStyle w:val="Hyperlink"/>
@@ -315,7 +309,7 @@
               <w:rPr>
                 <w:noProof/>
               </w:rPr>
-              <w:instrText xml:space="preserve"> PAGEREF _Toc243940935 \h </w:instrText>
+              <w:instrText xml:space="preserve"> PAGEREF _Toc243941068 \h </w:instrText>
             </w:r>
             <w:r>
               <w:rPr>
@@ -357,7 +351,7 @@
               <w14:ligatures w14:val="standardContextual"/>
             </w:rPr>
           </w:pPr>
-          <w:hyperlink w:anchor="_Toc243940936" w:history="1">
+          <w:hyperlink w:anchor="_Toc243941069" w:history="1">
             <w:r>
               <w:rPr>
                 <w:rStyle w:val="Hyperlink"/>
@@ -381,7 +375,7 @@
               <w:rPr>
                 <w:noProof/>
               </w:rPr>
-              <w:instrText xml:space="preserve"> PAGEREF _Toc243940936 \h </w:instrText>
+              <w:instrText xml:space="preserve"> PAGEREF _Toc243941069 \h </w:instrText>
             </w:r>
             <w:r>
               <w:rPr>
@@ -423,7 +417,7 @@
               <w14:ligatures w14:val="standardContextual"/>
             </w:rPr>
           </w:pPr>
-          <w:hyperlink w:anchor="_Toc243940937" w:history="1">
+          <w:hyperlink w:anchor="_Toc243941070" w:history="1">
             <w:r>
               <w:rPr>
                 <w:rStyle w:val="Hyperlink"/>
@@ -447,7 +441,7 @@
               <w:rPr>
                 <w:noProof/>
               </w:rPr>
-              <w:instrText xml:space="preserve"> PAGEREF _Toc243940937 \h </w:instrText>
+              <w:instrText xml:space="preserve"> PAGEREF _Toc243941070 \h </w:instrText>
             </w:r>
             <w:r>
               <w:rPr>
@@ -489,7 +483,7 @@
               <w14:ligatures w14:val="standardContextual"/>
             </w:rPr>
           </w:pPr>
-          <w:hyperlink w:anchor="_Toc243940938" w:history="1">
+          <w:hyperlink w:anchor="_Toc243941071" w:history="1">
             <w:r>
               <w:rPr>
                 <w:rStyle w:val="Hyperlink"/>
@@ -513,7 +507,7 @@
               <w:rPr>
                 <w:noProof/>
               </w:rPr>
-              <w:instrText xml:space="preserve"> PAGEREF _Toc243940938 \h </w:instrText>
+              <w:instrText xml:space="preserve"> PAGEREF _Toc243941071 \h </w:instrText>
             </w:r>
             <w:r>
               <w:rPr>
@@ -555,7 +549,7 @@
               <w14:ligatures w14:val="standardContextual"/>
             </w:rPr>
           </w:pPr>
-          <w:hyperlink w:anchor="_Toc243940939" w:history="1">
+          <w:hyperlink w:anchor="_Toc243941072" w:history="1">
             <w:r>
               <w:rPr>
                 <w:rStyle w:val="Hyperlink"/>
@@ -579,7 +573,7 @@
               <w:rPr>
                 <w:noProof/>
               </w:rPr>
-              <w:instrText xml:space="preserve"> PAGEREF _Toc243940939 \h </w:instrText>
+              <w:instrText xml:space="preserve"> PAGEREF _Toc243941072 \h </w:instrText>
             </w:r>
             <w:r>
               <w:rPr>
@@ -621,7 +615,7 @@
               <w14:ligatures w14:val="standardContextual"/>
             </w:rPr>
           </w:pPr>
-          <w:hyperlink w:anchor="_Toc243940940" w:history="1">
+          <w:hyperlink w:anchor="_Toc243941073" w:history="1">
             <w:r>
               <w:rPr>
                 <w:rStyle w:val="Hyperlink"/>
@@ -645,7 +639,7 @@
               <w:rPr>
                 <w:noProof/>
               </w:rPr>
-              <w:instrText xml:space="preserve"> PAGEREF _Toc243940940 \h </w:instrText>
+              <w:instrText xml:space="preserve"> PAGEREF _Toc243941073 \h </w:instrText>
             </w:r>
             <w:r>
               <w:rPr>
@@ -687,7 +681,7 @@
               <w14:ligatures w14:val="standardContextual"/>
             </w:rPr>
           </w:pPr>
-          <w:hyperlink w:anchor="_Toc243940941" w:history="1">
+          <w:hyperlink w:anchor="_Toc243941074" w:history="1">
             <w:r>
               <w:rPr>
                 <w:rStyle w:val="Hyperlink"/>
@@ -711,7 +705,7 @@
               <w:rPr>
                 <w:noProof/>
               </w:rPr>
-              <w:instrText xml:space="preserve"> PAGEREF _Toc243940941 \h </w:instrText>
+              <w:instrText xml:space="preserve"> PAGEREF _Toc243941074 \h </w:instrText>
             </w:r>
             <w:r>
               <w:rPr>
@@ -753,7 +747,7 @@
               <w14:ligatures w14:val="standardContextual"/>
             </w:rPr>
           </w:pPr>
-          <w:hyperlink w:anchor="_Toc243940942" w:history="1">
+          <w:hyperlink w:anchor="_Toc243941075" w:history="1">
             <w:r>
               <w:rPr>
                 <w:rStyle w:val="Hyperlink"/>
@@ -777,7 +771,7 @@
               <w:rPr>
                 <w:noProof/>
               </w:rPr>
-              <w:instrText xml:space="preserve"> PAGEREF _Toc243940942 \h </w:instrText>
+              <w:instrText xml:space="preserve"> PAGEREF _Toc243941075 \h </w:instrText>
             </w:r>
             <w:r>
               <w:rPr>
@@ -819,7 +813,7 @@
               <w14:ligatures w14:val="standardContextual"/>
             </w:rPr>
           </w:pPr>
-          <w:hyperlink w:anchor="_Toc243940943" w:history="1">
+          <w:hyperlink w:anchor="_Toc243941076" w:history="1">
             <w:r>
               <w:rPr>
                 <w:rStyle w:val="Hyperlink"/>
@@ -843,7 +837,7 @@
               <w:rPr>
                 <w:noProof/>
               </w:rPr>
-              <w:instrText xml:space="preserve"> PAGEREF _Toc243940943 \h </w:instrText>
+              <w:instrText xml:space="preserve"> PAGEREF _Toc243941076 \h </w:instrText>
             </w:r>
             <w:r>
               <w:rPr>
@@ -885,7 +879,7 @@
               <w14:ligatures w14:val="standardContextual"/>
             </w:rPr>
           </w:pPr>
-          <w:hyperlink w:anchor="_Toc243940944" w:history="1">
+          <w:hyperlink w:anchor="_Toc243941077" w:history="1">
             <w:r>
               <w:rPr>
                 <w:rStyle w:val="Hyperlink"/>
@@ -909,7 +903,7 @@
               <w:rPr>
                 <w:noProof/>
               </w:rPr>
-              <w:instrText xml:space="preserve"> PAGEREF _Toc243940944 \h </w:instrText>
+              <w:instrText xml:space="preserve"> PAGEREF _Toc243941077 \h </w:instrText>
             </w:r>
             <w:r>
               <w:rPr>
@@ -951,7 +945,7 @@
               <w14:ligatures w14:val="standardContextual"/>
             </w:rPr>
           </w:pPr>
-          <w:hyperlink w:anchor="_Toc243940945" w:history="1">
+          <w:hyperlink w:anchor="_Toc243941078" w:history="1">
             <w:r>
               <w:rPr>
                 <w:rStyle w:val="Hyperlink"/>
@@ -975,7 +969,7 @@
               <w:rPr>
                 <w:noProof/>
               </w:rPr>
-              <w:instrText xml:space="preserve"> PAGEREF _Toc243940945 \h </w:instrText>
+              <w:instrText xml:space="preserve"> PAGEREF _Toc243941078 \h </w:instrText>
             </w:r>
             <w:r>
               <w:rPr>
@@ -1017,7 +1011,7 @@
               <w14:ligatures w14:val="standardContextual"/>
             </w:rPr>
           </w:pPr>
-          <w:hyperlink w:anchor="_Toc243940946" w:history="1">
+          <w:hyperlink w:anchor="_Toc243941079" w:history="1">
             <w:r>
               <w:rPr>
                 <w:rStyle w:val="Hyperlink"/>
@@ -1041,7 +1035,7 @@
               <w:rPr>
                 <w:noProof/>
               </w:rPr>
-              <w:instrText xml:space="preserve"> PAGEREF _Toc243940946 \h </w:instrText>
+              <w:instrText xml:space="preserve"> PAGEREF _Toc243941079 \h </w:instrText>
             </w:r>
             <w:r>
               <w:rPr>
@@ -1083,7 +1077,7 @@
               <w14:ligatures w14:val="standardContextual"/>
             </w:rPr>
           </w:pPr>
-          <w:hyperlink w:anchor="_Toc243940947" w:history="1">
+          <w:hyperlink w:anchor="_Toc243941080" w:history="1">
             <w:r>
               <w:rPr>
                 <w:rStyle w:val="Hyperlink"/>
@@ -1107,7 +1101,7 @@
               <w:rPr>
                 <w:noProof/>
               </w:rPr>
-              <w:instrText xml:space="preserve"> PAGEREF _Toc243940947 \h </w:instrText>
+              <w:instrText xml:space="preserve"> PAGEREF _Toc243941080 \h </w:instrText>
             </w:r>
             <w:r>
               <w:rPr>
@@ -1149,7 +1143,7 @@
               <w14:ligatures w14:val="standardContextual"/>
             </w:rPr>
           </w:pPr>
-          <w:hyperlink w:anchor="_Toc243940948" w:history="1">
+          <w:hyperlink w:anchor="_Toc243941081" w:history="1">
             <w:r>
               <w:rPr>
                 <w:rStyle w:val="Hyperlink"/>
@@ -1173,7 +1167,7 @@
               <w:rPr>
                 <w:noProof/>
               </w:rPr>
-              <w:instrText xml:space="preserve"> PAGEREF _Toc243940948 \h </w:instrText>
+              <w:instrText xml:space="preserve"> PAGEREF _Toc243941081 \h </w:instrText>
             </w:r>
             <w:r>
               <w:rPr>
@@ -1215,7 +1209,7 @@
               <w14:ligatures w14:val="standardContextual"/>
             </w:rPr>
           </w:pPr>
-          <w:hyperlink w:anchor="_Toc243940949" w:history="1">
+          <w:hyperlink w:anchor="_Toc243941082" w:history="1">
             <w:r>
               <w:rPr>
                 <w:rStyle w:val="Hyperlink"/>
@@ -1239,7 +1233,7 @@
               <w:rPr>
                 <w:noProof/>
               </w:rPr>
-              <w:instrText xml:space="preserve"> PAGEREF _Toc243940949 \h </w:instrText>
+              <w:instrText xml:space="preserve"> PAGEREF _Toc243941082 \h </w:instrText>
             </w:r>
             <w:r>
               <w:rPr>
@@ -1281,7 +1275,7 @@
               <w14:ligatures w14:val="standardContextual"/>
             </w:rPr>
           </w:pPr>
-          <w:hyperlink w:anchor="_Toc243940950" w:history="1">
+          <w:hyperlink w:anchor="_Toc243941083" w:history="1">
             <w:r>
               <w:rPr>
                 <w:rStyle w:val="Hyperlink"/>
@@ -1305,7 +1299,7 @@
               <w:rPr>
                 <w:noProof/>
               </w:rPr>
-              <w:instrText xml:space="preserve"> PAGEREF _Toc243940950 \h </w:instrText>
+              <w:instrText xml:space="preserve"> PAGEREF _Toc243941083 \h </w:instrText>
             </w:r>
             <w:r>
               <w:rPr>
@@ -1347,7 +1341,7 @@
               <w14:ligatures w14:val="standardContextual"/>
             </w:rPr>
           </w:pPr>
-          <w:hyperlink w:anchor="_Toc243940951" w:history="1">
+          <w:hyperlink w:anchor="_Toc243941084" w:history="1">
             <w:r>
               <w:rPr>
                 <w:rStyle w:val="Hyperlink"/>
@@ -1371,7 +1365,7 @@
               <w:rPr>
                 <w:noProof/>
               </w:rPr>
-              <w:instrText xml:space="preserve"> PAGEREF _Toc243940951 \h </w:instrText>
+              <w:instrText xml:space="preserve"> PAGEREF _Toc243941084 \h </w:instrText>
             </w:r>
             <w:r>
               <w:rPr>
@@ -1413,7 +1407,7 @@
               <w14:ligatures w14:val="standardContextual"/>
             </w:rPr>
           </w:pPr>
-          <w:hyperlink w:anchor="_Toc243940952" w:history="1">
+          <w:hyperlink w:anchor="_Toc243941085" w:history="1">
             <w:r>
               <w:rPr>
                 <w:rStyle w:val="Hyperlink"/>
@@ -1437,7 +1431,7 @@
               <w:rPr>
                 <w:noProof/>
               </w:rPr>
-              <w:instrText xml:space="preserve"> PAGEREF _Toc243940952 \h </w:instrText>
+              <w:instrText xml:space="preserve"> PAGEREF _Toc243941085 \h </w:instrText>
             </w:r>
             <w:r>
               <w:rPr>
@@ -1479,7 +1473,7 @@
               <w14:ligatures w14:val="standardContextual"/>
             </w:rPr>
           </w:pPr>
-          <w:hyperlink w:anchor="_Toc243940953" w:history="1">
+          <w:hyperlink w:anchor="_Toc243941086" w:history="1">
             <w:r>
               <w:rPr>
                 <w:rStyle w:val="Hyperlink"/>
@@ -1503,7 +1497,7 @@
               <w:rPr>
                 <w:noProof/>
               </w:rPr>
-              <w:instrText xml:space="preserve"> PAGEREF _Toc243940953 \h </w:instrText>
+              <w:instrText xml:space="preserve"> PAGEREF _Toc243941086 \h </w:instrText>
             </w:r>
             <w:r>
               <w:rPr>
@@ -1545,7 +1539,7 @@
               <w14:ligatures w14:val="standardContextual"/>
             </w:rPr>
           </w:pPr>
-          <w:hyperlink w:anchor="_Toc243940954" w:history="1">
+          <w:hyperlink w:anchor="_Toc243941087" w:history="1">
             <w:r>
               <w:rPr>
                 <w:rStyle w:val="Hyperlink"/>
@@ -1569,7 +1563,7 @@
               <w:rPr>
                 <w:noProof/>
               </w:rPr>
-              <w:instrText xml:space="preserve"> PAGEREF _Toc243940954 \h </w:instrText>
+              <w:instrText xml:space="preserve"> PAGEREF _Toc243941087 \h </w:instrText>
             </w:r>
             <w:r>
               <w:rPr>
@@ -1611,7 +1605,7 @@
               <w14:ligatures w14:val="standardContextual"/>
             </w:rPr>
           </w:pPr>
-          <w:hyperlink w:anchor="_Toc243940955" w:history="1">
+          <w:hyperlink w:anchor="_Toc243941088" w:history="1">
             <w:r>
               <w:rPr>
                 <w:rStyle w:val="Hyperlink"/>
@@ -1635,7 +1629,7 @@
               <w:rPr>
                 <w:noProof/>
               </w:rPr>
-              <w:instrText xml:space="preserve"> PAGEREF _Toc243940955 \h </w:instrText>
+              <w:instrText xml:space="preserve"> PAGEREF _Toc243941088 \h </w:instrText>
             </w:r>
             <w:r>
               <w:rPr>
@@ -1677,7 +1671,7 @@
               <w14:ligatures w14:val="standardContextual"/>
             </w:rPr>
           </w:pPr>
-          <w:hyperlink w:anchor="_Toc243940956" w:history="1">
+          <w:hyperlink w:anchor="_Toc243941089" w:history="1">
             <w:r>
               <w:rPr>
                 <w:rStyle w:val="Hyperlink"/>
@@ -1701,7 +1695,7 @@
               <w:rPr>
                 <w:noProof/>
               </w:rPr>
-              <w:instrText xml:space="preserve"> PAGEREF _Toc243940956 \h </w:instrText>
+              <w:instrText xml:space="preserve"> PAGEREF _Toc243941089 \h </w:instrText>
             </w:r>
             <w:r>
               <w:rPr>
@@ -1743,7 +1737,7 @@
               <w14:ligatures w14:val="standardContextual"/>
             </w:rPr>
           </w:pPr>
-          <w:hyperlink w:anchor="_Toc243940957" w:history="1">
+          <w:hyperlink w:anchor="_Toc243941090" w:history="1">
             <w:r>
               <w:rPr>
                 <w:rStyle w:val="Hyperlink"/>
@@ -1767,7 +1761,7 @@
               <w:rPr>
                 <w:noProof/>
               </w:rPr>
-              <w:instrText xml:space="preserve"> PAGEREF _Toc243940957 \h </w:instrText>
+              <w:instrText xml:space="preserve"> PAGEREF _Toc243941090 \h </w:instrText>
             </w:r>
             <w:r>
               <w:rPr>
@@ -1809,7 +1803,7 @@
               <w14:ligatures w14:val="standardContextual"/>
             </w:rPr>
           </w:pPr>
-          <w:hyperlink w:anchor="_Toc243940958" w:history="1">
+          <w:hyperlink w:anchor="_Toc243941091" w:history="1">
             <w:r>
               <w:rPr>
                 <w:rStyle w:val="Hyperlink"/>
@@ -1833,7 +1827,7 @@
               <w:rPr>
                 <w:noProof/>
               </w:rPr>
-              <w:instrText xml:space="preserve"> PAGEREF _Toc243940958 \h </w:instrText>
+              <w:instrText xml:space="preserve"> PAGEREF _Toc243941091 \h </w:instrText>
             </w:r>
             <w:r>
               <w:rPr>
@@ -1875,7 +1869,7 @@
               <w14:ligatures w14:val="standardContextual"/>
             </w:rPr>
           </w:pPr>
-          <w:hyperlink w:anchor="_Toc243940959" w:history="1">
+          <w:hyperlink w:anchor="_Toc243941092" w:history="1">
             <w:r>
               <w:rPr>
                 <w:rStyle w:val="Hyperlink"/>
@@ -1899,7 +1893,7 @@
               <w:rPr>
                 <w:noProof/>
               </w:rPr>
-              <w:instrText xml:space="preserve"> PAGEREF _Toc243940959 \h </w:instrText>
+              <w:instrText xml:space="preserve"> PAGEREF _Toc243941092 \h </w:instrText>
             </w:r>
             <w:r>
               <w:rPr>
@@ -1941,7 +1935,7 @@
               <w14:ligatures w14:val="standardContextual"/>
             </w:rPr>
           </w:pPr>
-          <w:hyperlink w:anchor="_Toc243940960" w:history="1">
+          <w:hyperlink w:anchor="_Toc243941093" w:history="1">
             <w:r>
               <w:rPr>
                 <w:rStyle w:val="Hyperlink"/>
@@ -1965,7 +1959,7 @@
               <w:rPr>
                 <w:noProof/>
               </w:rPr>
-              <w:instrText xml:space="preserve"> PAGEREF _Toc243940960 \h </w:instrText>
+              <w:instrText xml:space="preserve"> PAGEREF _Toc243941093 \h </w:instrText>
             </w:r>
             <w:r>
               <w:rPr>
@@ -2007,7 +2001,7 @@
               <w14:ligatures w14:val="standardContextual"/>
             </w:rPr>
           </w:pPr>
-          <w:hyperlink w:anchor="_Toc243940961" w:history="1">
+          <w:hyperlink w:anchor="_Toc243941094" w:history="1">
             <w:r>
               <w:rPr>
                 <w:rStyle w:val="Hyperlink"/>
@@ -2031,7 +2025,7 @@
               <w:rPr>
                 <w:noProof/>
               </w:rPr>
-              <w:instrText xml:space="preserve"> PAGEREF _Toc243940961 \h </w:instrText>
+              <w:instrText xml:space="preserve"> PAGEREF _Toc243941094 \h </w:instrText>
             </w:r>
             <w:r>
               <w:rPr>
@@ -2073,7 +2067,7 @@
               <w14:ligatures w14:val="standardContextual"/>
             </w:rPr>
           </w:pPr>
-          <w:hyperlink w:anchor="_Toc243940962" w:history="1">
+          <w:hyperlink w:anchor="_Toc243941095" w:history="1">
             <w:r>
               <w:rPr>
                 <w:rStyle w:val="Hyperlink"/>
@@ -2097,7 +2091,7 @@
               <w:rPr>
                 <w:noProof/>
               </w:rPr>
-              <w:instrText xml:space="preserve"> PAGEREF _Toc243940962 \h </w:instrText>
+              <w:instrText xml:space="preserve"> PAGEREF _Toc243941095 \h </w:instrText>
             </w:r>
             <w:r>
               <w:rPr>
@@ -2139,7 +2133,7 @@
               <w14:ligatures w14:val="standardContextual"/>
             </w:rPr>
           </w:pPr>
-          <w:hyperlink w:anchor="_Toc243940963" w:history="1">
+          <w:hyperlink w:anchor="_Toc243941096" w:history="1">
             <w:r>
               <w:rPr>
                 <w:rStyle w:val="Hyperlink"/>
@@ -2163,7 +2157,7 @@
               <w:rPr>
                 <w:noProof/>
               </w:rPr>
-              <w:instrText xml:space="preserve"> PAGEREF _Toc243940963 \h </w:instrText>
+              <w:instrText xml:space="preserve"> PAGEREF _Toc243941096 \h </w:instrText>
             </w:r>
             <w:r>
               <w:rPr>
@@ -2205,7 +2199,7 @@
               <w14:ligatures w14:val="standardContextual"/>
             </w:rPr>
           </w:pPr>
-          <w:hyperlink w:anchor="_Toc243940964" w:history="1">
+          <w:hyperlink w:anchor="_Toc243941097" w:history="1">
             <w:r>
               <w:rPr>
                 <w:rStyle w:val="Hyperlink"/>
@@ -2229,7 +2223,7 @@
               <w:rPr>
                 <w:noProof/>
               </w:rPr>
-              <w:instrText xml:space="preserve"> PAGEREF _Toc243940964 \h </w:instrText>
+              <w:instrText xml:space="preserve"> PAGEREF _Toc243941097 \h </w:instrText>
             </w:r>
             <w:r>
               <w:rPr>
@@ -2271,7 +2265,7 @@
               <w14:ligatures w14:val="standardContextual"/>
             </w:rPr>
           </w:pPr>
-          <w:hyperlink w:anchor="_Toc243940965" w:history="1">
+          <w:hyperlink w:anchor="_Toc243941098" w:history="1">
             <w:r>
               <w:rPr>
                 <w:rStyle w:val="Hyperlink"/>
@@ -2295,7 +2289,7 @@
               <w:rPr>
                 <w:noProof/>
               </w:rPr>
-              <w:instrText xml:space="preserve"> PAGEREF _Toc243940965 \h </w:instrText>
+              <w:instrText xml:space="preserve"> PAGEREF _Toc243941098 \h </w:instrText>
             </w:r>
             <w:r>
               <w:rPr>
@@ -2337,7 +2331,7 @@
               <w14:ligatures w14:val="standardContextual"/>
             </w:rPr>
           </w:pPr>
-          <w:hyperlink w:anchor="_Toc243940966" w:history="1">
+          <w:hyperlink w:anchor="_Toc243941099" w:history="1">
             <w:r>
               <w:rPr>
                 <w:rStyle w:val="Hyperlink"/>
@@ -2361,7 +2355,7 @@
               <w:rPr>
                 <w:noProof/>
               </w:rPr>
-              <w:instrText xml:space="preserve"> PAGEREF _Toc243940966 \h </w:instrText>
+              <w:instrText xml:space="preserve"> PAGEREF _Toc243941099 \h </w:instrText>
             </w:r>
             <w:r>
               <w:rPr>
@@ -2403,7 +2397,7 @@
               <w14:ligatures w14:val="standardContextual"/>
             </w:rPr>
           </w:pPr>
-          <w:hyperlink w:anchor="_Toc243940967" w:history="1">
+          <w:hyperlink w:anchor="_Toc243941100" w:history="1">
             <w:r>
               <w:rPr>
                 <w:rStyle w:val="Hyperlink"/>
@@ -2427,7 +2421,7 @@
               <w:rPr>
                 <w:noProof/>
               </w:rPr>
-              <w:instrText xml:space="preserve"> PAGEREF _Toc243940967 \h </w:instrText>
+              <w:instrText xml:space="preserve"> PAGEREF _Toc243941100 \h </w:instrText>
             </w:r>
             <w:r>
               <w:rPr>
@@ -2469,7 +2463,7 @@
               <w14:ligatures w14:val="standardContextual"/>
             </w:rPr>
           </w:pPr>
-          <w:hyperlink w:anchor="_Toc243940968" w:history="1">
+          <w:hyperlink w:anchor="_Toc243941101" w:history="1">
             <w:r>
               <w:rPr>
                 <w:rStyle w:val="Hyperlink"/>
@@ -2493,7 +2487,7 @@
               <w:rPr>
                 <w:noProof/>
               </w:rPr>
-              <w:instrText xml:space="preserve"> PAGEREF _Toc243940968 \h </w:instrText>
+              <w:instrText xml:space="preserve"> PAGEREF _Toc243941101 \h </w:instrText>
             </w:r>
             <w:r>
               <w:rPr>
@@ -2535,7 +2529,7 @@
               <w14:ligatures w14:val="standardContextual"/>
             </w:rPr>
           </w:pPr>
-          <w:hyperlink w:anchor="_Toc243940969" w:history="1">
+          <w:hyperlink w:anchor="_Toc243941102" w:history="1">
             <w:r>
               <w:rPr>
                 <w:rStyle w:val="Hyperlink"/>
@@ -2559,7 +2553,7 @@
               <w:rPr>
                 <w:noProof/>
               </w:rPr>
-              <w:instrText xml:space="preserve"> PAGEREF _Toc243940969 \h </w:instrText>
+              <w:instrText xml:space="preserve"> PAGEREF _Toc243941102 \h </w:instrText>
             </w:r>
             <w:r>
               <w:rPr>
@@ -2601,7 +2595,7 @@
               <w14:ligatures w14:val="standardContextual"/>
             </w:rPr>
           </w:pPr>
-          <w:hyperlink w:anchor="_Toc243940970" w:history="1">
+          <w:hyperlink w:anchor="_Toc243941103" w:history="1">
             <w:r>
               <w:rPr>
                 <w:rStyle w:val="Hyperlink"/>
@@ -2625,7 +2619,7 @@
               <w:rPr>
                 <w:noProof/>
               </w:rPr>
-              <w:instrText xml:space="preserve"> PAGEREF _Toc243940970 \h </w:instrText>
+              <w:instrText xml:space="preserve"> PAGEREF _Toc243941103 \h </w:instrText>
             </w:r>
             <w:r>
               <w:rPr>
@@ -2667,7 +2661,7 @@
               <w14:ligatures w14:val="standardContextual"/>
             </w:rPr>
           </w:pPr>
-          <w:hyperlink w:anchor="_Toc243940971" w:history="1">
+          <w:hyperlink w:anchor="_Toc243941104" w:history="1">
             <w:r>
               <w:rPr>
                 <w:rStyle w:val="Hyperlink"/>
@@ -2691,7 +2685,7 @@
               <w:rPr>
                 <w:noProof/>
               </w:rPr>
-              <w:instrText xml:space="preserve"> PAGEREF _Toc243940971 \h </w:instrText>
+              <w:instrText xml:space="preserve"> PAGEREF _Toc243941104 \h </w:instrText>
             </w:r>
             <w:r>
               <w:rPr>
@@ -2733,7 +2727,7 @@
               <w14:ligatures w14:val="standardContextual"/>
             </w:rPr>
           </w:pPr>
-          <w:hyperlink w:anchor="_Toc243940972" w:history="1">
+          <w:hyperlink w:anchor="_Toc243941105" w:history="1">
             <w:r>
               <w:rPr>
                 <w:rStyle w:val="Hyperlink"/>
@@ -2757,7 +2751,7 @@
               <w:rPr>
                 <w:noProof/>
               </w:rPr>
-              <w:instrText xml:space="preserve"> PAGEREF _Toc243940972 \h </w:instrText>
+              <w:instrText xml:space="preserve"> PAGEREF _Toc243941105 \h </w:instrText>
             </w:r>
             <w:r>
               <w:rPr>
@@ -2799,7 +2793,7 @@
               <w14:ligatures w14:val="standardContextual"/>
             </w:rPr>
           </w:pPr>
-          <w:hyperlink w:anchor="_Toc243940973" w:history="1">
+          <w:hyperlink w:anchor="_Toc243941106" w:history="1">
             <w:r>
               <w:rPr>
                 <w:rStyle w:val="Hyperlink"/>
@@ -2823,7 +2817,7 @@
               <w:rPr>
                 <w:noProof/>
               </w:rPr>
-              <w:instrText xml:space="preserve"> PAGEREF _Toc243940973 \h </w:instrText>
+              <w:instrText xml:space="preserve"> PAGEREF _Toc243941106 \h </w:instrText>
             </w:r>
             <w:r>
               <w:rPr>
@@ -2865,7 +2859,7 @@
               <w14:ligatures w14:val="standardContextual"/>
             </w:rPr>
           </w:pPr>
-          <w:hyperlink w:anchor="_Toc243940974" w:history="1">
+          <w:hyperlink w:anchor="_Toc243941107" w:history="1">
             <w:r>
               <w:rPr>
                 <w:rStyle w:val="Hyperlink"/>
@@ -2889,7 +2883,7 @@
               <w:rPr>
                 <w:noProof/>
               </w:rPr>
-              <w:instrText xml:space="preserve"> PAGEREF _Toc243940974 \h </w:instrText>
+              <w:instrText xml:space="preserve"> PAGEREF _Toc243941107 \h </w:instrText>
             </w:r>
             <w:r>
               <w:rPr>
@@ -2931,7 +2925,7 @@
               <w14:ligatures w14:val="standardContextual"/>
             </w:rPr>
           </w:pPr>
-          <w:hyperlink w:anchor="_Toc243940975" w:history="1">
+          <w:hyperlink w:anchor="_Toc243941108" w:history="1">
             <w:r>
               <w:rPr>
                 <w:rStyle w:val="Hyperlink"/>
@@ -2955,7 +2949,7 @@
               <w:rPr>
                 <w:noProof/>
               </w:rPr>
-              <w:instrText xml:space="preserve"> PAGEREF _Toc243940975 \h </w:instrText>
+              <w:instrText xml:space="preserve"> PAGEREF _Toc243941108 \h </w:instrText>
             </w:r>
             <w:r>
               <w:rPr>
@@ -2997,7 +2991,7 @@
               <w14:ligatures w14:val="standardContextual"/>
             </w:rPr>
           </w:pPr>
-          <w:hyperlink w:anchor="_Toc243940976" w:history="1">
+          <w:hyperlink w:anchor="_Toc243941109" w:history="1">
             <w:r>
               <w:rPr>
                 <w:rStyle w:val="Hyperlink"/>
@@ -3021,7 +3015,7 @@
               <w:rPr>
                 <w:noProof/>
               </w:rPr>
-              <w:instrText xml:space="preserve"> PAGEREF _Toc243940976 \h </w:instrText>
+              <w:instrText xml:space="preserve"> PAGEREF _Toc243941109 \h </w:instrText>
             </w:r>
             <w:r>
               <w:rPr>
@@ -3063,7 +3057,7 @@
               <w14:ligatures w14:val="standardContextual"/>
             </w:rPr>
           </w:pPr>
-          <w:hyperlink w:anchor="_Toc243940977" w:history="1">
+          <w:hyperlink w:anchor="_Toc243941110" w:history="1">
             <w:r>
               <w:rPr>
                 <w:rStyle w:val="Hyperlink"/>
@@ -3087,7 +3081,7 @@
               <w:rPr>
                 <w:noProof/>
               </w:rPr>
-              <w:instrText xml:space="preserve"> PAGEREF _Toc243940977 \h </w:instrText>
+              <w:instrText xml:space="preserve"> PAGEREF _Toc243941110 \h </w:instrText>
             </w:r>
             <w:r>
               <w:rPr>
@@ -3129,7 +3123,7 @@
               <w14:ligatures w14:val="standardContextual"/>
             </w:rPr>
           </w:pPr>
-          <w:hyperlink w:anchor="_Toc243940978" w:history="1">
+          <w:hyperlink w:anchor="_Toc243941111" w:history="1">
             <w:r>
               <w:rPr>
                 <w:rStyle w:val="Hyperlink"/>
@@ -3153,7 +3147,7 @@
               <w:rPr>
                 <w:noProof/>
               </w:rPr>
-              <w:instrText xml:space="preserve"> PAGEREF _Toc243940978 \h </w:instrText>
+              <w:instrText xml:space="preserve"> PAGEREF _Toc243941111 \h </w:instrText>
             </w:r>
             <w:r>
               <w:rPr>
@@ -3195,7 +3189,7 @@
               <w14:ligatures w14:val="standardContextual"/>
             </w:rPr>
           </w:pPr>
-          <w:hyperlink w:anchor="_Toc243940979" w:history="1">
+          <w:hyperlink w:anchor="_Toc243941112" w:history="1">
             <w:r>
               <w:rPr>
                 <w:rStyle w:val="Hyperlink"/>
@@ -3219,7 +3213,7 @@
               <w:rPr>
                 <w:noProof/>
               </w:rPr>
-              <w:instrText xml:space="preserve"> PAGEREF _Toc243940979 \h </w:instrText>
+              <w:instrText xml:space="preserve"> PAGEREF _Toc243941112 \h </w:instrText>
             </w:r>
             <w:r>
               <w:rPr>
@@ -3261,7 +3255,7 @@
               <w14:ligatures w14:val="standardContextual"/>
             </w:rPr>
           </w:pPr>
-          <w:hyperlink w:anchor="_Toc243940980" w:history="1">
+          <w:hyperlink w:anchor="_Toc243941113" w:history="1">
             <w:r>
               <w:rPr>
                 <w:rStyle w:val="Hyperlink"/>
@@ -3285,7 +3279,7 @@
               <w:rPr>
                 <w:noProof/>
               </w:rPr>
-              <w:instrText xml:space="preserve"> PAGEREF _Toc243940980 \h </w:instrText>
+              <w:instrText xml:space="preserve"> PAGEREF _Toc243941113 \h </w:instrText>
             </w:r>
             <w:r>
               <w:rPr>
@@ -3327,7 +3321,7 @@
               <w14:ligatures w14:val="standardContextual"/>
             </w:rPr>
           </w:pPr>
-          <w:hyperlink w:anchor="_Toc243940981" w:history="1">
+          <w:hyperlink w:anchor="_Toc243941114" w:history="1">
             <w:r>
               <w:rPr>
                 <w:rStyle w:val="Hyperlink"/>
@@ -3351,7 +3345,7 @@
               <w:rPr>
                 <w:noProof/>
               </w:rPr>
-              <w:instrText xml:space="preserve"> PAGEREF _Toc243940981 \h </w:instrText>
+              <w:instrText xml:space="preserve"> PAGEREF _Toc243941114 \h </w:instrText>
             </w:r>
             <w:r>
               <w:rPr>
@@ -3393,7 +3387,7 @@
               <w14:ligatures w14:val="standardContextual"/>
             </w:rPr>
           </w:pPr>
-          <w:hyperlink w:anchor="_Toc243940982" w:history="1">
+          <w:hyperlink w:anchor="_Toc243941115" w:history="1">
             <w:r>
               <w:rPr>
                 <w:rStyle w:val="Hyperlink"/>
@@ -3417,7 +3411,7 @@
               <w:rPr>
                 <w:noProof/>
               </w:rPr>
-              <w:instrText xml:space="preserve"> PAGEREF _Toc243940982 \h </w:instrText>
+              <w:instrText xml:space="preserve"> PAGEREF _Toc243941115 \h </w:instrText>
             </w:r>
             <w:r>
               <w:rPr>
@@ -3459,7 +3453,7 @@
               <w14:ligatures w14:val="standardContextual"/>
             </w:rPr>
           </w:pPr>
-          <w:hyperlink w:anchor="_Toc243940983" w:history="1">
+          <w:hyperlink w:anchor="_Toc243941116" w:history="1">
             <w:r>
               <w:rPr>
                 <w:rStyle w:val="Hyperlink"/>
@@ -3483,7 +3477,7 @@
               <w:rPr>
                 <w:noProof/>
               </w:rPr>
-              <w:instrText xml:space="preserve"> PAGEREF _Toc243940983 \h </w:instrText>
+              <w:instrText xml:space="preserve"> PAGEREF _Toc243941116 \h </w:instrText>
             </w:r>
             <w:r>
               <w:rPr>
@@ -3525,7 +3519,7 @@
               <w14:ligatures w14:val="standardContextual"/>
             </w:rPr>
           </w:pPr>
-          <w:hyperlink w:anchor="_Toc243940984" w:history="1">
+          <w:hyperlink w:anchor="_Toc243941117" w:history="1">
             <w:r>
               <w:rPr>
                 <w:rStyle w:val="Hyperlink"/>
@@ -3549,7 +3543,7 @@
               <w:rPr>
                 <w:noProof/>
               </w:rPr>
-              <w:instrText xml:space="preserve"> PAGEREF _Toc243940984 \h </w:instrText>
+              <w:instrText xml:space="preserve"> PAGEREF _Toc243941117 \h </w:instrText>
             </w:r>
             <w:r>
               <w:rPr>
@@ -3591,7 +3585,7 @@
               <w14:ligatures w14:val="standardContextual"/>
             </w:rPr>
           </w:pPr>
-          <w:hyperlink w:anchor="_Toc243940985" w:history="1">
+          <w:hyperlink w:anchor="_Toc243941118" w:history="1">
             <w:r>
               <w:rPr>
                 <w:rStyle w:val="Hyperlink"/>
@@ -3615,7 +3609,7 @@
               <w:rPr>
                 <w:noProof/>
               </w:rPr>
-              <w:instrText xml:space="preserve"> PAGEREF _Toc243940985 \h </w:instrText>
+              <w:instrText xml:space="preserve"> PAGEREF _Toc243941118 \h </w:instrText>
             </w:r>
             <w:r>
               <w:rPr>
@@ -3657,7 +3651,7 @@
               <w14:ligatures w14:val="standardContextual"/>
             </w:rPr>
           </w:pPr>
-          <w:hyperlink w:anchor="_Toc243940986" w:history="1">
+          <w:hyperlink w:anchor="_Toc243941119" w:history="1">
             <w:r>
               <w:rPr>
                 <w:rStyle w:val="Hyperlink"/>
@@ -3681,7 +3675,7 @@
               <w:rPr>
                 <w:noProof/>
               </w:rPr>
-              <w:instrText xml:space="preserve"> PAGEREF _Toc243940986 \h </w:instrText>
+              <w:instrText xml:space="preserve"> PAGEREF _Toc243941119 \h </w:instrText>
             </w:r>
             <w:r>
               <w:rPr>
@@ -3723,7 +3717,7 @@
               <w14:ligatures w14:val="standardContextual"/>
             </w:rPr>
           </w:pPr>
-          <w:hyperlink w:anchor="_Toc243940987" w:history="1">
+          <w:hyperlink w:anchor="_Toc243941120" w:history="1">
             <w:r>
               <w:rPr>
                 <w:rStyle w:val="Hyperlink"/>
@@ -3747,7 +3741,7 @@
               <w:rPr>
                 <w:noProof/>
               </w:rPr>
-              <w:instrText xml:space="preserve"> PAGEREF _Toc243940987 \h </w:instrText>
+              <w:instrText xml:space="preserve"> PAGEREF _Toc243941120 \h </w:instrText>
             </w:r>
             <w:r>
               <w:rPr>
@@ -3789,7 +3783,7 @@
               <w14:ligatures w14:val="standardContextual"/>
             </w:rPr>
           </w:pPr>
-          <w:hyperlink w:anchor="_Toc243940988" w:history="1">
+          <w:hyperlink w:anchor="_Toc243941121" w:history="1">
             <w:r>
               <w:rPr>
                 <w:rStyle w:val="Hyperlink"/>
@@ -3813,7 +3807,7 @@
               <w:rPr>
                 <w:noProof/>
               </w:rPr>
-              <w:instrText xml:space="preserve"> PAGEREF _Toc243940988 \h </w:instrText>
+              <w:instrText xml:space="preserve"> PAGEREF _Toc243941121 \h </w:instrText>
             </w:r>
             <w:r>
               <w:rPr>
@@ -3855,7 +3849,7 @@
               <w14:ligatures w14:val="standardContextual"/>
             </w:rPr>
           </w:pPr>
-          <w:hyperlink w:anchor="_Toc243940989" w:history="1">
+          <w:hyperlink w:anchor="_Toc243941122" w:history="1">
             <w:r>
               <w:rPr>
                 <w:rStyle w:val="Hyperlink"/>
@@ -3879,7 +3873,7 @@
               <w:rPr>
                 <w:noProof/>
               </w:rPr>
-              <w:instrText xml:space="preserve"> PAGEREF _Toc243940989 \h </w:instrText>
+              <w:instrText xml:space="preserve"> PAGEREF _Toc243941122 \h </w:instrText>
             </w:r>
             <w:r>
               <w:rPr>
@@ -3921,7 +3915,7 @@
               <w14:ligatures w14:val="standardContextual"/>
             </w:rPr>
           </w:pPr>
-          <w:hyperlink w:anchor="_Toc243940990" w:history="1">
+          <w:hyperlink w:anchor="_Toc243941123" w:history="1">
             <w:r>
               <w:rPr>
                 <w:rStyle w:val="Hyperlink"/>
@@ -3945,7 +3939,7 @@
               <w:rPr>
                 <w:noProof/>
               </w:rPr>
-              <w:instrText xml:space="preserve"> PAGEREF _Toc243940990 \h </w:instrText>
+              <w:instrText xml:space="preserve"> PAGEREF _Toc243941123 \h </w:instrText>
             </w:r>
             <w:r>
               <w:rPr>
@@ -3987,7 +3981,7 @@
               <w14:ligatures w14:val="standardContextual"/>
             </w:rPr>
           </w:pPr>
-          <w:hyperlink w:anchor="_Toc243940991" w:history="1">
+          <w:hyperlink w:anchor="_Toc243941124" w:history="1">
             <w:r>
               <w:rPr>
                 <w:rStyle w:val="Hyperlink"/>
@@ -4011,7 +4005,7 @@
               <w:rPr>
                 <w:noProof/>
               </w:rPr>
-              <w:instrText xml:space="preserve"> PAGEREF _Toc243940991 \h </w:instrText>
+              <w:instrText xml:space="preserve"> PAGEREF _Toc243941124 \h </w:instrText>
             </w:r>
             <w:r>
               <w:rPr>
@@ -4053,7 +4047,7 @@
               <w14:ligatures w14:val="standardContextual"/>
             </w:rPr>
           </w:pPr>
-          <w:hyperlink w:anchor="_Toc243940992" w:history="1">
+          <w:hyperlink w:anchor="_Toc243941125" w:history="1">
             <w:r>
               <w:rPr>
                 <w:rStyle w:val="Hyperlink"/>
@@ -4077,7 +4071,7 @@
               <w:rPr>
                 <w:noProof/>
               </w:rPr>
-              <w:instrText xml:space="preserve"> PAGEREF _Toc243940992 \h </w:instrText>
+              <w:instrText xml:space="preserve"> PAGEREF _Toc243941125 \h </w:instrText>
             </w:r>
             <w:r>
               <w:rPr>
@@ -4119,7 +4113,7 @@
               <w14:ligatures w14:val="standardContextual"/>
             </w:rPr>
           </w:pPr>
-          <w:hyperlink w:anchor="_Toc243940993" w:history="1">
+          <w:hyperlink w:anchor="_Toc243941126" w:history="1">
             <w:r>
               <w:rPr>
                 <w:rStyle w:val="Hyperlink"/>
@@ -4143,7 +4137,7 @@
               <w:rPr>
                 <w:noProof/>
               </w:rPr>
-              <w:instrText xml:space="preserve"> PAGEREF _Toc243940993 \h </w:instrText>
+              <w:instrText xml:space="preserve"> PAGEREF _Toc243941126 \h </w:instrText>
             </w:r>
             <w:r>
               <w:rPr>
@@ -4185,7 +4179,7 @@
               <w14:ligatures w14:val="standardContextual"/>
             </w:rPr>
           </w:pPr>
-          <w:hyperlink w:anchor="_Toc243940994" w:history="1">
+          <w:hyperlink w:anchor="_Toc243941127" w:history="1">
             <w:r>
               <w:rPr>
                 <w:rStyle w:val="Hyperlink"/>
@@ -4209,7 +4203,7 @@
               <w:rPr>
                 <w:noProof/>
               </w:rPr>
-              <w:instrText xml:space="preserve"> PAGEREF _Toc243940994 \h </w:instrText>
+              <w:instrText xml:space="preserve"> PAGEREF _Toc243941127 \h </w:instrText>
             </w:r>
             <w:r>
               <w:rPr>
@@ -4251,7 +4245,7 @@
               <w14:ligatures w14:val="standardContextual"/>
             </w:rPr>
           </w:pPr>
-          <w:hyperlink w:anchor="_Toc243940995" w:history="1">
+          <w:hyperlink w:anchor="_Toc243941128" w:history="1">
             <w:r>
               <w:rPr>
                 <w:rStyle w:val="Hyperlink"/>
@@ -4275,7 +4269,7 @@
               <w:rPr>
                 <w:noProof/>
               </w:rPr>
-              <w:instrText xml:space="preserve"> PAGEREF _Toc243940995 \h </w:instrText>
+              <w:instrText xml:space="preserve"> PAGEREF _Toc243941128 \h </w:instrText>
             </w:r>
             <w:r>
               <w:rPr>
@@ -4317,7 +4311,7 @@
               <w14:ligatures w14:val="standardContextual"/>
             </w:rPr>
           </w:pPr>
-          <w:hyperlink w:anchor="_Toc243940996" w:history="1">
+          <w:hyperlink w:anchor="_Toc243941129" w:history="1">
             <w:r>
               <w:rPr>
                 <w:rStyle w:val="Hyperlink"/>
@@ -4341,7 +4335,7 @@
               <w:rPr>
                 <w:noProof/>
               </w:rPr>
-              <w:instrText xml:space="preserve"> PAGEREF _Toc243940996 \h </w:instrText>
+              <w:instrText xml:space="preserve"> PAGEREF _Toc243941129 \h </w:instrText>
             </w:r>
             <w:r>
               <w:rPr>
@@ -4383,7 +4377,7 @@
               <w14:ligatures w14:val="standardContextual"/>
             </w:rPr>
           </w:pPr>
-          <w:hyperlink w:anchor="_Toc243940997" w:history="1">
+          <w:hyperlink w:anchor="_Toc243941130" w:history="1">
             <w:r>
               <w:rPr>
                 <w:rStyle w:val="Hyperlink"/>
@@ -4407,7 +4401,7 @@
               <w:rPr>
                 <w:noProof/>
               </w:rPr>
-              <w:instrText xml:space="preserve"> PAGEREF _Toc243940997 \h </w:instrText>
+              <w:instrText xml:space="preserve"> PAGEREF _Toc243941130 \h </w:instrText>
             </w:r>
             <w:r>
               <w:rPr>
@@ -4449,7 +4443,7 @@
               <w14:ligatures w14:val="standardContextual"/>
             </w:rPr>
           </w:pPr>
-          <w:hyperlink w:anchor="_Toc243940998" w:history="1">
+          <w:hyperlink w:anchor="_Toc243941131" w:history="1">
             <w:r>
               <w:rPr>
                 <w:rStyle w:val="Hyperlink"/>
@@ -4473,7 +4467,7 @@
               <w:rPr>
                 <w:noProof/>
               </w:rPr>
-              <w:instrText xml:space="preserve"> PAGEREF _Toc243940998 \h </w:instrText>
+              <w:instrText xml:space="preserve"> PAGEREF _Toc243941131 \h </w:instrText>
             </w:r>
             <w:r>
               <w:rPr>
@@ -4515,7 +4509,7 @@
               <w14:ligatures w14:val="standardContextual"/>
             </w:rPr>
           </w:pPr>
-          <w:hyperlink w:anchor="_Toc243940999" w:history="1">
+          <w:hyperlink w:anchor="_Toc243941132" w:history="1">
             <w:r>
               <w:rPr>
                 <w:rStyle w:val="Hyperlink"/>
@@ -4539,7 +4533,7 @@
               <w:rPr>
                 <w:noProof/>
               </w:rPr>
-              <w:instrText xml:space="preserve"> PAGEREF _Toc243940999 \h </w:instrText>
+              <w:instrText xml:space="preserve"> PAGEREF _Toc243941132 \h </w:instrText>
             </w:r>
             <w:r>
               <w:rPr>
@@ -4581,7 +4575,7 @@
               <w14:ligatures w14:val="standardContextual"/>
             </w:rPr>
           </w:pPr>
-          <w:hyperlink w:anchor="_Toc243941000" w:history="1">
+          <w:hyperlink w:anchor="_Toc243941133" w:history="1">
             <w:r>
               <w:rPr>
                 <w:rStyle w:val="Hyperlink"/>
@@ -4605,7 +4599,7 @@
               <w:rPr>
                 <w:noProof/>
               </w:rPr>
-              <w:instrText xml:space="preserve"> PAGEREF _Toc243941000 \h </w:instrText>
+              <w:instrText xml:space="preserve"> PAGEREF _Toc243941133 \h </w:instrText>
             </w:r>
             <w:r>
               <w:rPr>
@@ -4647,7 +4641,7 @@
               <w14:ligatures w14:val="standardContextual"/>
             </w:rPr>
           </w:pPr>
-          <w:hyperlink w:anchor="_Toc243941001" w:history="1">
+          <w:hyperlink w:anchor="_Toc243941134" w:history="1">
             <w:r>
               <w:rPr>
                 <w:rStyle w:val="Hyperlink"/>
@@ -4671,7 +4665,7 @@
               <w:rPr>
                 <w:noProof/>
               </w:rPr>
-              <w:instrText xml:space="preserve"> PAGEREF _Toc243941001 \h </w:instrText>
+              <w:instrText xml:space="preserve"> PAGEREF _Toc243941134 \h </w:instrText>
             </w:r>
             <w:r>
               <w:rPr>
@@ -4710,7 +4704,7 @@
         <w:pStyle w:val="Heading1"/>
         <w:pageBreakBefore/>
       </w:pPr>
-      <w:bookmarkStart w:id="3" w:name="_Toc243940938"/>
+      <w:bookmarkStart w:id="3" w:name="_Toc243941071"/>
       <w:r>
         <w:lastRenderedPageBreak/>
         <w:t>LIST OF FIGURES</w:t>
@@ -4720,7 +4714,7 @@
     <w:sdt>
       <w:sdtPr>
         <w:alias w:val="List of Figures"/>
-        <w:id w:val="-1504589822"/>
+        <w:id w:val="1859767536"/>
       </w:sdtPr>
       <w:sdtEndPr/>
       <w:sdtContent>
@@ -4743,7 +4737,7 @@
           <w:r>
             <w:fldChar w:fldCharType="separate"/>
           </w:r>
-          <w:hyperlink w:anchor="_Toc243940843" w:history="1">
+          <w:hyperlink w:anchor="_Toc243940976" w:history="1">
             <w:r>
               <w:rPr>
                 <w:rStyle w:val="Hyperlink"/>
@@ -4767,7 +4761,7 @@
               <w:rPr>
                 <w:noProof/>
               </w:rPr>
-              <w:instrText xml:space="preserve"> PAGEREF _Toc243940843 \h </w:instrText>
+              <w:instrText xml:space="preserve"> PAGEREF _Toc243940976 \h </w:instrText>
             </w:r>
             <w:r>
               <w:rPr>
@@ -4804,7 +4798,7 @@
               <w:noProof/>
             </w:rPr>
           </w:pPr>
-          <w:hyperlink w:anchor="_Toc243940844" w:history="1">
+          <w:hyperlink w:anchor="_Toc243940977" w:history="1">
             <w:r>
               <w:rPr>
                 <w:rStyle w:val="Hyperlink"/>
@@ -4828,7 +4822,7 @@
               <w:rPr>
                 <w:noProof/>
               </w:rPr>
-              <w:instrText xml:space="preserve"> PAGEREF _Toc243940844 \h </w:instrText>
+              <w:instrText xml:space="preserve"> PAGEREF _Toc243940977 \h </w:instrText>
             </w:r>
             <w:r>
               <w:rPr>
@@ -4865,7 +4859,7 @@
               <w:noProof/>
             </w:rPr>
           </w:pPr>
-          <w:hyperlink w:anchor="_Toc243940845" w:history="1">
+          <w:hyperlink w:anchor="_Toc243940978" w:history="1">
             <w:r>
               <w:rPr>
                 <w:rStyle w:val="Hyperlink"/>
@@ -4889,7 +4883,7 @@
               <w:rPr>
                 <w:noProof/>
               </w:rPr>
-              <w:instrText xml:space="preserve"> PAGEREF _Toc243940845 \h </w:instrText>
+              <w:instrText xml:space="preserve"> PAGEREF _Toc243940978 \h </w:instrText>
             </w:r>
             <w:r>
               <w:rPr>
@@ -4926,7 +4920,7 @@
               <w:noProof/>
             </w:rPr>
           </w:pPr>
-          <w:hyperlink w:anchor="_Toc243940846" w:history="1">
+          <w:hyperlink w:anchor="_Toc243940979" w:history="1">
             <w:r>
               <w:rPr>
                 <w:rStyle w:val="Hyperlink"/>
@@ -4950,7 +4944,7 @@
               <w:rPr>
                 <w:noProof/>
               </w:rPr>
-              <w:instrText xml:space="preserve"> PAGEREF _Toc243940846 \h </w:instrText>
+              <w:instrText xml:space="preserve"> PAGEREF _Toc243940979 \h </w:instrText>
             </w:r>
             <w:r>
               <w:rPr>
@@ -4987,7 +4981,7 @@
               <w:noProof/>
             </w:rPr>
           </w:pPr>
-          <w:hyperlink w:anchor="_Toc243940847" w:history="1">
+          <w:hyperlink w:anchor="_Toc243940980" w:history="1">
             <w:r>
               <w:rPr>
                 <w:rStyle w:val="Hyperlink"/>
@@ -5011,7 +5005,7 @@
               <w:rPr>
                 <w:noProof/>
               </w:rPr>
-              <w:instrText xml:space="preserve"> PAGEREF _Toc243940847 \h </w:instrText>
+              <w:instrText xml:space="preserve"> PAGEREF _Toc243940980 \h </w:instrText>
             </w:r>
             <w:r>
               <w:rPr>
@@ -5048,7 +5042,7 @@
               <w:noProof/>
             </w:rPr>
           </w:pPr>
-          <w:hyperlink w:anchor="_Toc243940848" w:history="1">
+          <w:hyperlink w:anchor="_Toc243940981" w:history="1">
             <w:r>
               <w:rPr>
                 <w:rStyle w:val="Hyperlink"/>
@@ -5072,7 +5066,7 @@
               <w:rPr>
                 <w:noProof/>
               </w:rPr>
-              <w:instrText xml:space="preserve"> PAGEREF _Toc243940848 \h </w:instrText>
+              <w:instrText xml:space="preserve"> PAGEREF _Toc243940981 \h </w:instrText>
             </w:r>
             <w:r>
               <w:rPr>
@@ -5109,7 +5103,7 @@
               <w:noProof/>
             </w:rPr>
           </w:pPr>
-          <w:hyperlink w:anchor="_Toc243940849" w:history="1">
+          <w:hyperlink w:anchor="_Toc243940982" w:history="1">
             <w:r>
               <w:rPr>
                 <w:rStyle w:val="Hyperlink"/>
@@ -5133,7 +5127,7 @@
               <w:rPr>
                 <w:noProof/>
               </w:rPr>
-              <w:instrText xml:space="preserve"> PAGEREF _Toc243940849 \h </w:instrText>
+              <w:instrText xml:space="preserve"> PAGEREF _Toc243940982 \h </w:instrText>
             </w:r>
             <w:r>
               <w:rPr>
@@ -5170,7 +5164,7 @@
               <w:noProof/>
             </w:rPr>
           </w:pPr>
-          <w:hyperlink w:anchor="_Toc243940850" w:history="1">
+          <w:hyperlink w:anchor="_Toc243940983" w:history="1">
             <w:r>
               <w:rPr>
                 <w:rStyle w:val="Hyperlink"/>
@@ -5194,7 +5188,7 @@
               <w:rPr>
                 <w:noProof/>
               </w:rPr>
-              <w:instrText xml:space="preserve"> PAGEREF _Toc243940850 \h </w:instrText>
+              <w:instrText xml:space="preserve"> PAGEREF _Toc243940983 \h </w:instrText>
             </w:r>
             <w:r>
               <w:rPr>
@@ -5231,7 +5225,7 @@
               <w:noProof/>
             </w:rPr>
           </w:pPr>
-          <w:hyperlink w:anchor="_Toc243940851" w:history="1">
+          <w:hyperlink w:anchor="_Toc243940984" w:history="1">
             <w:r>
               <w:rPr>
                 <w:rStyle w:val="Hyperlink"/>
@@ -5255,7 +5249,7 @@
               <w:rPr>
                 <w:noProof/>
               </w:rPr>
-              <w:instrText xml:space="preserve"> PAGEREF _Toc243940851 \h </w:instrText>
+              <w:instrText xml:space="preserve"> PAGEREF _Toc243940984 \h </w:instrText>
             </w:r>
             <w:r>
               <w:rPr>
@@ -5292,7 +5286,7 @@
               <w:noProof/>
             </w:rPr>
           </w:pPr>
-          <w:hyperlink w:anchor="_Toc243940852" w:history="1">
+          <w:hyperlink w:anchor="_Toc243940985" w:history="1">
             <w:r>
               <w:rPr>
                 <w:rStyle w:val="Hyperlink"/>
@@ -5316,7 +5310,7 @@
               <w:rPr>
                 <w:noProof/>
               </w:rPr>
-              <w:instrText xml:space="preserve"> PAGEREF _Toc243940852 \h </w:instrText>
+              <w:instrText xml:space="preserve"> PAGEREF _Toc243940985 \h </w:instrText>
             </w:r>
             <w:r>
               <w:rPr>
@@ -5353,7 +5347,7 @@
               <w:noProof/>
             </w:rPr>
           </w:pPr>
-          <w:hyperlink w:anchor="_Toc243940853" w:history="1">
+          <w:hyperlink w:anchor="_Toc243940986" w:history="1">
             <w:r>
               <w:rPr>
                 <w:rStyle w:val="Hyperlink"/>
@@ -5377,7 +5371,7 @@
               <w:rPr>
                 <w:noProof/>
               </w:rPr>
-              <w:instrText xml:space="preserve"> PAGEREF _Toc243940853 \h </w:instrText>
+              <w:instrText xml:space="preserve"> PAGEREF _Toc243940986 \h </w:instrText>
             </w:r>
             <w:r>
               <w:rPr>
@@ -5414,7 +5408,7 @@
               <w:noProof/>
             </w:rPr>
           </w:pPr>
-          <w:hyperlink w:anchor="_Toc243940854" w:history="1">
+          <w:hyperlink w:anchor="_Toc243940987" w:history="1">
             <w:r>
               <w:rPr>
                 <w:rStyle w:val="Hyperlink"/>
@@ -5438,7 +5432,7 @@
               <w:rPr>
                 <w:noProof/>
               </w:rPr>
-              <w:instrText xml:space="preserve"> PAGEREF _Toc243940854 \h </w:instrText>
+              <w:instrText xml:space="preserve"> PAGEREF _Toc243940987 \h </w:instrText>
             </w:r>
             <w:r>
               <w:rPr>
@@ -5475,7 +5469,7 @@
               <w:noProof/>
             </w:rPr>
           </w:pPr>
-          <w:hyperlink w:anchor="_Toc243940855" w:history="1">
+          <w:hyperlink w:anchor="_Toc243940988" w:history="1">
             <w:r>
               <w:rPr>
                 <w:rStyle w:val="Hyperlink"/>
@@ -5499,7 +5493,7 @@
               <w:rPr>
                 <w:noProof/>
               </w:rPr>
-              <w:instrText xml:space="preserve"> PAGEREF _Toc243940855 \h </w:instrText>
+              <w:instrText xml:space="preserve"> PAGEREF _Toc243940988 \h </w:instrText>
             </w:r>
             <w:r>
               <w:rPr>
@@ -5536,7 +5530,7 @@
               <w:noProof/>
             </w:rPr>
           </w:pPr>
-          <w:hyperlink w:anchor="_Toc243940856" w:history="1">
+          <w:hyperlink w:anchor="_Toc243940989" w:history="1">
             <w:r>
               <w:rPr>
                 <w:rStyle w:val="Hyperlink"/>
@@ -5560,7 +5554,7 @@
               <w:rPr>
                 <w:noProof/>
               </w:rPr>
-              <w:instrText xml:space="preserve"> PAGEREF _Toc243940856 \h </w:instrText>
+              <w:instrText xml:space="preserve"> PAGEREF _Toc243940989 \h </w:instrText>
             </w:r>
             <w:r>
               <w:rPr>
@@ -5597,7 +5591,7 @@
               <w:noProof/>
             </w:rPr>
           </w:pPr>
-          <w:hyperlink w:anchor="_Toc243940857" w:history="1">
+          <w:hyperlink w:anchor="_Toc243940990" w:history="1">
             <w:r>
               <w:rPr>
                 <w:rStyle w:val="Hyperlink"/>
@@ -5621,7 +5615,7 @@
               <w:rPr>
                 <w:noProof/>
               </w:rPr>
-              <w:instrText xml:space="preserve"> PAGEREF _Toc243940857 \h </w:instrText>
+              <w:instrText xml:space="preserve"> PAGEREF _Toc243940990 \h </w:instrText>
             </w:r>
             <w:r>
               <w:rPr>
@@ -5658,7 +5652,7 @@
               <w:noProof/>
             </w:rPr>
           </w:pPr>
-          <w:hyperlink w:anchor="_Toc243940858" w:history="1">
+          <w:hyperlink w:anchor="_Toc243940991" w:history="1">
             <w:r>
               <w:rPr>
                 <w:rStyle w:val="Hyperlink"/>
@@ -5682,7 +5676,7 @@
               <w:rPr>
                 <w:noProof/>
               </w:rPr>
-              <w:instrText xml:space="preserve"> PAGEREF _Toc243940858 \h </w:instrText>
+              <w:instrText xml:space="preserve"> PAGEREF _Toc243940991 \h </w:instrText>
             </w:r>
             <w:r>
               <w:rPr>
@@ -5719,7 +5713,7 @@
               <w:noProof/>
             </w:rPr>
           </w:pPr>
-          <w:hyperlink w:anchor="_Toc243940859" w:history="1">
+          <w:hyperlink w:anchor="_Toc243940992" w:history="1">
             <w:r>
               <w:rPr>
                 <w:rStyle w:val="Hyperlink"/>
@@ -5743,7 +5737,7 @@
               <w:rPr>
                 <w:noProof/>
               </w:rPr>
-              <w:instrText xml:space="preserve"> PAGEREF _Toc243940859 \h </w:instrText>
+              <w:instrText xml:space="preserve"> PAGEREF _Toc243940992 \h </w:instrText>
             </w:r>
             <w:r>
               <w:rPr>
@@ -5780,7 +5774,7 @@
               <w:noProof/>
             </w:rPr>
           </w:pPr>
-          <w:hyperlink w:anchor="_Toc243940860" w:history="1">
+          <w:hyperlink w:anchor="_Toc243940993" w:history="1">
             <w:r>
               <w:rPr>
                 <w:rStyle w:val="Hyperlink"/>
@@ -5804,7 +5798,7 @@
               <w:rPr>
                 <w:noProof/>
               </w:rPr>
-              <w:instrText xml:space="preserve"> PAGEREF _Toc243940860 \h </w:instrText>
+              <w:instrText xml:space="preserve"> PAGEREF _Toc243940993 \h </w:instrText>
             </w:r>
             <w:r>
               <w:rPr>
@@ -5842,7 +5836,7 @@
       <w:pPr>
         <w:pStyle w:val="Heading2"/>
       </w:pPr>
-      <w:bookmarkStart w:id="4" w:name="_Toc243940939"/>
+      <w:bookmarkStart w:id="4" w:name="_Toc243941072"/>
       <w:r>
         <w:t>LIST OF TABLES</w:t>
       </w:r>
@@ -5851,7 +5845,7 @@
     <w:sdt>
       <w:sdtPr>
         <w:alias w:val="List of Tables"/>
-        <w:id w:val="1266581827"/>
+        <w:id w:val="1756935043"/>
       </w:sdtPr>
       <w:sdtEndPr/>
       <w:sdtContent>
@@ -5879,7 +5873,7 @@
           <w:r>
             <w:fldChar w:fldCharType="separate"/>
           </w:r>
-          <w:hyperlink w:anchor="_Toc243940861" w:history="1">
+          <w:hyperlink w:anchor="_Toc243940994" w:history="1">
             <w:r>
               <w:rPr>
                 <w:rStyle w:val="Hyperlink"/>
@@ -5903,7 +5897,7 @@
               <w:rPr>
                 <w:noProof/>
               </w:rPr>
-              <w:instrText xml:space="preserve"> PAGEREF _Toc243940861 \h </w:instrText>
+              <w:instrText xml:space="preserve"> PAGEREF _Toc243940994 \h </w:instrText>
             </w:r>
             <w:r>
               <w:rPr>
@@ -5945,7 +5939,7 @@
               <w14:ligatures w14:val="standardContextual"/>
             </w:rPr>
           </w:pPr>
-          <w:hyperlink w:anchor="_Toc243940862" w:history="1">
+          <w:hyperlink w:anchor="_Toc243940995" w:history="1">
             <w:r>
               <w:rPr>
                 <w:rStyle w:val="Hyperlink"/>
@@ -5969,7 +5963,7 @@
               <w:rPr>
                 <w:noProof/>
               </w:rPr>
-              <w:instrText xml:space="preserve"> PAGEREF _Toc243940862 \h </w:instrText>
+              <w:instrText xml:space="preserve"> PAGEREF _Toc243940995 \h </w:instrText>
             </w:r>
             <w:r>
               <w:rPr>
@@ -6011,7 +6005,7 @@
               <w14:ligatures w14:val="standardContextual"/>
             </w:rPr>
           </w:pPr>
-          <w:hyperlink w:anchor="_Toc243940863" w:history="1">
+          <w:hyperlink w:anchor="_Toc243940996" w:history="1">
             <w:r>
               <w:rPr>
                 <w:rStyle w:val="Hyperlink"/>
@@ -6035,7 +6029,7 @@
               <w:rPr>
                 <w:noProof/>
               </w:rPr>
-              <w:instrText xml:space="preserve"> PAGEREF _Toc243940863 \h </w:instrText>
+              <w:instrText xml:space="preserve"> PAGEREF _Toc243940996 \h </w:instrText>
             </w:r>
             <w:r>
               <w:rPr>
@@ -6077,7 +6071,7 @@
               <w14:ligatures w14:val="standardContextual"/>
             </w:rPr>
           </w:pPr>
-          <w:hyperlink w:anchor="_Toc243940864" w:history="1">
+          <w:hyperlink w:anchor="_Toc243940997" w:history="1">
             <w:r>
               <w:rPr>
                 <w:rStyle w:val="Hyperlink"/>
@@ -6101,7 +6095,7 @@
               <w:rPr>
                 <w:noProof/>
               </w:rPr>
-              <w:instrText xml:space="preserve"> PAGEREF _Toc243940864 \h </w:instrText>
+              <w:instrText xml:space="preserve"> PAGEREF _Toc243940997 \h </w:instrText>
             </w:r>
             <w:r>
               <w:rPr>
@@ -6143,7 +6137,7 @@
               <w14:ligatures w14:val="standardContextual"/>
             </w:rPr>
           </w:pPr>
-          <w:hyperlink w:anchor="_Toc243940865" w:history="1">
+          <w:hyperlink w:anchor="_Toc243940998" w:history="1">
             <w:r>
               <w:rPr>
                 <w:rStyle w:val="Hyperlink"/>
@@ -6167,7 +6161,7 @@
               <w:rPr>
                 <w:noProof/>
               </w:rPr>
-              <w:instrText xml:space="preserve"> PAGEREF _Toc243940865 \h </w:instrText>
+              <w:instrText xml:space="preserve"> PAGEREF _Toc243940998 \h </w:instrText>
             </w:r>
             <w:r>
               <w:rPr>
@@ -6209,7 +6203,7 @@
               <w14:ligatures w14:val="standardContextual"/>
             </w:rPr>
           </w:pPr>
-          <w:hyperlink w:anchor="_Toc243940866" w:history="1">
+          <w:hyperlink w:anchor="_Toc243940999" w:history="1">
             <w:r>
               <w:rPr>
                 <w:rStyle w:val="Hyperlink"/>
@@ -6233,7 +6227,7 @@
               <w:rPr>
                 <w:noProof/>
               </w:rPr>
-              <w:instrText xml:space="preserve"> PAGEREF _Toc243940866 \h </w:instrText>
+              <w:instrText xml:space="preserve"> PAGEREF _Toc243940999 \h </w:instrText>
             </w:r>
             <w:r>
               <w:rPr>
@@ -6275,7 +6269,7 @@
               <w14:ligatures w14:val="standardContextual"/>
             </w:rPr>
           </w:pPr>
-          <w:hyperlink w:anchor="_Toc243940867" w:history="1">
+          <w:hyperlink w:anchor="_Toc243941000" w:history="1">
             <w:r>
               <w:rPr>
                 <w:rStyle w:val="Hyperlink"/>
@@ -6299,7 +6293,7 @@
               <w:rPr>
                 <w:noProof/>
               </w:rPr>
-              <w:instrText xml:space="preserve"> PAGEREF _Toc243940867 \h </w:instrText>
+              <w:instrText xml:space="preserve"> PAGEREF _Toc243941000 \h </w:instrText>
             </w:r>
             <w:r>
               <w:rPr>
@@ -6349,7 +6343,7 @@
       <w:pPr>
         <w:pStyle w:val="Heading1"/>
       </w:pPr>
-      <w:bookmarkStart w:id="5" w:name="_Toc243940940"/>
+      <w:bookmarkStart w:id="5" w:name="_Toc243941073"/>
       <w:r>
         <w:lastRenderedPageBreak/>
         <w:t>1. INTRODUCTION</w:t>
@@ -6360,7 +6354,7 @@
       <w:pPr>
         <w:pStyle w:val="Heading2"/>
       </w:pPr>
-      <w:bookmarkStart w:id="6" w:name="_Toc243940941"/>
+      <w:bookmarkStart w:id="6" w:name="_Toc243941074"/>
       <w:r>
         <w:t>1.1 Background</w:t>
       </w:r>
@@ -6438,7 +6432,7 @@
       <w:pPr>
         <w:pStyle w:val="Heading2"/>
       </w:pPr>
-      <w:bookmarkStart w:id="7" w:name="_Toc243940942"/>
+      <w:bookmarkStart w:id="7" w:name="_Toc243941075"/>
       <w:r>
         <w:t>1.2 Problem Statement</w:t>
       </w:r>
@@ -6457,7 +6451,7 @@
       <w:pPr>
         <w:pStyle w:val="Heading2"/>
       </w:pPr>
-      <w:bookmarkStart w:id="8" w:name="_Toc243940943"/>
+      <w:bookmarkStart w:id="8" w:name="_Toc243941076"/>
       <w:r>
         <w:t>1.3 Objectives</w:t>
       </w:r>
@@ -6566,7 +6560,7 @@
       <w:pPr>
         <w:pStyle w:val="Heading2"/>
       </w:pPr>
-      <w:bookmarkStart w:id="9" w:name="_Toc243940944"/>
+      <w:bookmarkStart w:id="9" w:name="_Toc243941077"/>
       <w:r>
         <w:t>1.4 Scope of the Project</w:t>
       </w:r>
@@ -6586,7 +6580,7 @@
         <w:pStyle w:val="Heading1"/>
         <w:pageBreakBefore/>
       </w:pPr>
-      <w:bookmarkStart w:id="10" w:name="_Toc243940945"/>
+      <w:bookmarkStart w:id="10" w:name="_Toc243941078"/>
       <w:r>
         <w:lastRenderedPageBreak/>
         <w:t>2. THEORETICAL BACKGROUND</w:t>
@@ -6606,7 +6600,7 @@
       <w:pPr>
         <w:pStyle w:val="Heading2"/>
       </w:pPr>
-      <w:bookmarkStart w:id="11" w:name="_Toc243940946"/>
+      <w:bookmarkStart w:id="11" w:name="_Toc243941079"/>
       <w:r>
         <w:t>2.1 Images as Two-Dimensional Signals</w:t>
       </w:r>
@@ -6667,7 +6661,7 @@
       <w:pPr>
         <w:pStyle w:val="Heading2"/>
       </w:pPr>
-      <w:bookmarkStart w:id="12" w:name="_Toc243940947"/>
+      <w:bookmarkStart w:id="12" w:name="_Toc243941080"/>
       <w:r>
         <w:t>2.2 Median Filtering</w:t>
       </w:r>
@@ -6686,7 +6680,7 @@
       <w:pPr>
         <w:pStyle w:val="Heading2"/>
       </w:pPr>
-      <w:bookmarkStart w:id="13" w:name="_Toc243940948"/>
+      <w:bookmarkStart w:id="13" w:name="_Toc243941081"/>
       <w:r>
         <w:t>2.3 Otsu Thresholding</w:t>
       </w:r>
@@ -6777,7 +6771,7 @@
       <w:pPr>
         <w:pStyle w:val="Heading2"/>
       </w:pPr>
-      <w:bookmarkStart w:id="14" w:name="_Toc243940949"/>
+      <w:bookmarkStart w:id="14" w:name="_Toc243941082"/>
       <w:r>
         <w:t>2.4 Discrete Fourier Transform</w:t>
       </w:r>
@@ -6810,7 +6804,7 @@
       <w:pPr>
         <w:pStyle w:val="Heading2"/>
       </w:pPr>
-      <w:bookmarkStart w:id="15" w:name="_Toc243940950"/>
+      <w:bookmarkStart w:id="15" w:name="_Toc243941083"/>
       <w:r>
         <w:t>2.5 Discrete Wavelet Transform (Haar)</w:t>
       </w:r>
@@ -6829,7 +6823,7 @@
       <w:pPr>
         <w:pStyle w:val="Heading2"/>
       </w:pPr>
-      <w:bookmarkStart w:id="16" w:name="_Toc243940951"/>
+      <w:bookmarkStart w:id="16" w:name="_Toc243941084"/>
       <w:r>
         <w:t>2.6 Normalised Cross-Correlation</w:t>
       </w:r>
@@ -6870,7 +6864,7 @@
       <w:pPr>
         <w:pStyle w:val="Heading2"/>
       </w:pPr>
-      <w:bookmarkStart w:id="17" w:name="_Toc243940952"/>
+      <w:bookmarkStart w:id="17" w:name="_Toc243941085"/>
       <w:r>
         <w:t>2.7 Statistical Moments and Hu Invariants</w:t>
       </w:r>
@@ -6899,7 +6893,7 @@
       <w:pPr>
         <w:pStyle w:val="Heading2"/>
       </w:pPr>
-      <w:bookmarkStart w:id="18" w:name="_Toc243940953"/>
+      <w:bookmarkStart w:id="18" w:name="_Toc243941086"/>
       <w:r>
         <w:t>2.8 Logistic Regression</w:t>
       </w:r>
@@ -6929,7 +6923,7 @@
         <w:pStyle w:val="Heading1"/>
         <w:pageBreakBefore/>
       </w:pPr>
-      <w:bookmarkStart w:id="19" w:name="_Toc243940954"/>
+      <w:bookmarkStart w:id="19" w:name="_Toc243941087"/>
       <w:r>
         <w:lastRenderedPageBreak/>
         <w:t>3. SYSTEM DESIGN AND ARCHITECTURE</w:t>
@@ -6940,7 +6934,7 @@
       <w:pPr>
         <w:pStyle w:val="Heading2"/>
       </w:pPr>
-      <w:bookmarkStart w:id="20" w:name="_Toc243940955"/>
+      <w:bookmarkStart w:id="20" w:name="_Toc243941088"/>
       <w:r>
         <w:t>3.1 Overall Architecture</w:t>
       </w:r>
@@ -6986,7 +6980,7 @@
           <w:noProof/>
         </w:rPr>
         <w:drawing>
-          <wp:inline distT="0" distB="0" distL="0" distR="0" wp14:anchorId="1EF97A4A" wp14:editId="63D5268C">
+          <wp:inline distT="0" distB="0" distL="0" distR="0" wp14:anchorId="17D0F1F5" wp14:editId="45DEF11C">
             <wp:extent cx="5486400" cy="1647825"/>
             <wp:effectExtent l="0" t="0" r="0" b="0"/>
             <wp:docPr id="1" name="Picture 1"/>
@@ -7031,7 +7025,7 @@
         <w:spacing w:after="200"/>
         <w:jc w:val="center"/>
       </w:pPr>
-      <w:bookmarkStart w:id="21" w:name="_Toc243940843"/>
+      <w:bookmarkStart w:id="21" w:name="_Toc243940976"/>
       <w:r>
         <w:t xml:space="preserve">Figure </w:t>
       </w:r>
@@ -7062,7 +7056,7 @@
       <w:pPr>
         <w:pStyle w:val="Heading2"/>
       </w:pPr>
-      <w:bookmarkStart w:id="22" w:name="_Toc243940956"/>
+      <w:bookmarkStart w:id="22" w:name="_Toc243941089"/>
       <w:r>
         <w:t>3.2 Module Organisation</w:t>
       </w:r>
@@ -7084,7 +7078,7 @@
         <w:spacing w:before="160" w:after="80"/>
         <w:jc w:val="center"/>
       </w:pPr>
-      <w:bookmarkStart w:id="23" w:name="_Toc243940861"/>
+      <w:bookmarkStart w:id="23" w:name="_Toc243940994"/>
       <w:r>
         <w:t xml:space="preserve">Table </w:t>
       </w:r>
@@ -7878,7 +7872,7 @@
       <w:pPr>
         <w:pStyle w:val="Heading2"/>
       </w:pPr>
-      <w:bookmarkStart w:id="24" w:name="_Toc243940957"/>
+      <w:bookmarkStart w:id="24" w:name="_Toc243941090"/>
       <w:r>
         <w:t>3.3 Dataset</w:t>
       </w:r>
@@ -7962,7 +7956,7 @@
         <w:spacing w:before="160" w:after="80"/>
         <w:jc w:val="center"/>
       </w:pPr>
-      <w:bookmarkStart w:id="25" w:name="_Toc243940862"/>
+      <w:bookmarkStart w:id="25" w:name="_Toc243940995"/>
       <w:r>
         <w:t xml:space="preserve">Table </w:t>
       </w:r>
@@ -8507,7 +8501,7 @@
       <w:pPr>
         <w:pStyle w:val="Heading2"/>
       </w:pPr>
-      <w:bookmarkStart w:id="26" w:name="_Toc243940958"/>
+      <w:bookmarkStart w:id="26" w:name="_Toc243941091"/>
       <w:r>
         <w:t>3.4 Data Stored per Account</w:t>
       </w:r>
@@ -8559,7 +8553,7 @@
         <w:pStyle w:val="Heading1"/>
         <w:pageBreakBefore/>
       </w:pPr>
-      <w:bookmarkStart w:id="27" w:name="_Toc243940959"/>
+      <w:bookmarkStart w:id="27" w:name="_Toc243941092"/>
       <w:r>
         <w:lastRenderedPageBreak/>
         <w:t>4. PREPROCESSING</w:t>
@@ -8597,7 +8591,7 @@
           <w:noProof/>
         </w:rPr>
         <w:drawing>
-          <wp:inline distT="0" distB="0" distL="0" distR="0" wp14:anchorId="0334B582" wp14:editId="1823FE3E">
+          <wp:inline distT="0" distB="0" distL="0" distR="0" wp14:anchorId="14D4A65A" wp14:editId="3CFE82BE">
             <wp:extent cx="5486400" cy="2381250"/>
             <wp:effectExtent l="0" t="0" r="0" b="0"/>
             <wp:docPr id="2" name="Picture 2"/>
@@ -8642,7 +8636,7 @@
         <w:spacing w:after="200"/>
         <w:jc w:val="center"/>
       </w:pPr>
-      <w:bookmarkStart w:id="28" w:name="_Toc243940844"/>
+      <w:bookmarkStart w:id="28" w:name="_Toc243940977"/>
       <w:r>
         <w:t xml:space="preserve">Figure </w:t>
       </w:r>
@@ -8673,7 +8667,7 @@
       <w:pPr>
         <w:pStyle w:val="Heading2"/>
       </w:pPr>
-      <w:bookmarkStart w:id="29" w:name="_Toc243940960"/>
+      <w:bookmarkStart w:id="29" w:name="_Toc243941093"/>
       <w:r>
         <w:t>4.1 Grayscale Conversion and Format Handling</w:t>
       </w:r>
@@ -8692,7 +8686,7 @@
       <w:pPr>
         <w:pStyle w:val="Heading2"/>
       </w:pPr>
-      <w:bookmarkStart w:id="30" w:name="_Toc243940961"/>
+      <w:bookmarkStart w:id="30" w:name="_Toc243941094"/>
       <w:r>
         <w:t>4.2 Median Filtering and Contrast Stretch</w:t>
       </w:r>
@@ -8711,7 +8705,7 @@
       <w:pPr>
         <w:pStyle w:val="Heading2"/>
       </w:pPr>
-      <w:bookmarkStart w:id="31" w:name="_Toc243940962"/>
+      <w:bookmarkStart w:id="31" w:name="_Toc243941095"/>
       <w:r>
         <w:t>4.3 Otsu Binarisation and Polarity Correction</w:t>
       </w:r>
@@ -8730,7 +8724,7 @@
       <w:pPr>
         <w:pStyle w:val="Heading2"/>
       </w:pPr>
-      <w:bookmarkStart w:id="32" w:name="_Toc243940963"/>
+      <w:bookmarkStart w:id="32" w:name="_Toc243941096"/>
       <w:r>
         <w:lastRenderedPageBreak/>
         <w:t>4.4 Despeckling and Gap Bridging</w:t>
@@ -8750,7 +8744,7 @@
       <w:pPr>
         <w:pStyle w:val="Heading2"/>
       </w:pPr>
-      <w:bookmarkStart w:id="33" w:name="_Toc243940964"/>
+      <w:bookmarkStart w:id="33" w:name="_Toc243941097"/>
       <w:r>
         <w:t>4.5 Deskewing by Principal Axis</w:t>
       </w:r>
@@ -8791,7 +8785,7 @@
       <w:pPr>
         <w:pStyle w:val="Heading2"/>
       </w:pPr>
-      <w:bookmarkStart w:id="34" w:name="_Toc243940965"/>
+      <w:bookmarkStart w:id="34" w:name="_Toc243941098"/>
       <w:r>
         <w:t>4.6 Cropping and Size Normalisation</w:t>
       </w:r>
@@ -9538,7 +9532,7 @@
         <w:pStyle w:val="Heading1"/>
         <w:pageBreakBefore/>
       </w:pPr>
-      <w:bookmarkStart w:id="35" w:name="_Toc243940966"/>
+      <w:bookmarkStart w:id="35" w:name="_Toc243941099"/>
       <w:r>
         <w:lastRenderedPageBreak/>
         <w:t>5. FEATURE EXTRACTION</w:t>
@@ -9576,7 +9570,7 @@
           <w:noProof/>
         </w:rPr>
         <w:drawing>
-          <wp:inline distT="0" distB="0" distL="0" distR="0" wp14:anchorId="37DD44FA" wp14:editId="3EABFAFE">
+          <wp:inline distT="0" distB="0" distL="0" distR="0" wp14:anchorId="0AEA87C5" wp14:editId="626754C0">
             <wp:extent cx="5486400" cy="1895475"/>
             <wp:effectExtent l="0" t="0" r="0" b="0"/>
             <wp:docPr id="3" name="Picture 3"/>
@@ -9621,7 +9615,7 @@
         <w:spacing w:after="200"/>
         <w:jc w:val="center"/>
       </w:pPr>
-      <w:bookmarkStart w:id="36" w:name="_Toc243940845"/>
+      <w:bookmarkStart w:id="36" w:name="_Toc243940978"/>
       <w:r>
         <w:t xml:space="preserve">Figure </w:t>
       </w:r>
@@ -9655,7 +9649,7 @@
         <w:spacing w:before="160" w:after="80"/>
         <w:jc w:val="center"/>
       </w:pPr>
-      <w:bookmarkStart w:id="37" w:name="_Toc243940863"/>
+      <w:bookmarkStart w:id="37" w:name="_Toc243940996"/>
       <w:r>
         <w:t xml:space="preserve">Table </w:t>
       </w:r>
@@ -10620,7 +10614,7 @@
       <w:pPr>
         <w:pStyle w:val="Heading2"/>
       </w:pPr>
-      <w:bookmarkStart w:id="38" w:name="_Toc243940967"/>
+      <w:bookmarkStart w:id="38" w:name="_Toc243941100"/>
       <w:r>
         <w:lastRenderedPageBreak/>
         <w:t>5.1 Projection Profiles as 1-D Signals</w:t>
@@ -10660,7 +10654,7 @@
       <w:pPr>
         <w:pStyle w:val="Heading2"/>
       </w:pPr>
-      <w:bookmarkStart w:id="39" w:name="_Toc243940968"/>
+      <w:bookmarkStart w:id="39" w:name="_Toc243941101"/>
       <w:r>
         <w:t>5.2 Energy, Entropy and Spectral Features</w:t>
       </w:r>
@@ -10686,7 +10680,7 @@
           <w:noProof/>
         </w:rPr>
         <w:drawing>
-          <wp:inline distT="0" distB="0" distL="0" distR="0" wp14:anchorId="66C8C9BF" wp14:editId="3FF09EAC">
+          <wp:inline distT="0" distB="0" distL="0" distR="0" wp14:anchorId="312B2ED4" wp14:editId="60B05620">
             <wp:extent cx="5486400" cy="2924175"/>
             <wp:effectExtent l="0" t="0" r="0" b="0"/>
             <wp:docPr id="4" name="Picture 4"/>
@@ -10731,7 +10725,7 @@
         <w:spacing w:after="200"/>
         <w:jc w:val="center"/>
       </w:pPr>
-      <w:bookmarkStart w:id="40" w:name="_Toc243940846"/>
+      <w:bookmarkStart w:id="40" w:name="_Toc243940979"/>
       <w:r>
         <w:t xml:space="preserve">Figure </w:t>
       </w:r>
@@ -10762,7 +10756,7 @@
       <w:pPr>
         <w:pStyle w:val="Heading2"/>
       </w:pPr>
-      <w:bookmarkStart w:id="41" w:name="_Toc243940969"/>
+      <w:bookmarkStart w:id="41" w:name="_Toc243941102"/>
       <w:r>
         <w:t>5.3 Two-Dimensional Spectrum</w:t>
       </w:r>
@@ -10785,7 +10779,7 @@
       <w:pPr>
         <w:pStyle w:val="Heading2"/>
       </w:pPr>
-      <w:bookmarkStart w:id="42" w:name="_Toc243940970"/>
+      <w:bookmarkStart w:id="42" w:name="_Toc243941103"/>
       <w:r>
         <w:t>5.4 Haar Wavelet Decomposition</w:t>
       </w:r>
@@ -11053,7 +11047,7 @@
       <w:pPr>
         <w:pStyle w:val="Heading2"/>
       </w:pPr>
-      <w:bookmarkStart w:id="43" w:name="_Toc243940971"/>
+      <w:bookmarkStart w:id="43" w:name="_Toc243941104"/>
       <w:r>
         <w:t>5.5 Contour Signals</w:t>
       </w:r>
@@ -11073,7 +11067,7 @@
         <w:pStyle w:val="Heading1"/>
         <w:pageBreakBefore/>
       </w:pPr>
-      <w:bookmarkStart w:id="44" w:name="_Toc243940972"/>
+      <w:bookmarkStart w:id="44" w:name="_Toc243941105"/>
       <w:r>
         <w:lastRenderedPageBreak/>
         <w:t>6. MATCHING AND SCORING</w:t>
@@ -11093,7 +11087,7 @@
       <w:pPr>
         <w:pStyle w:val="Heading2"/>
       </w:pPr>
-      <w:bookmarkStart w:id="45" w:name="_Toc243940973"/>
+      <w:bookmarkStart w:id="45" w:name="_Toc243941106"/>
       <w:r>
         <w:t>6.1 Writer-Normalised Feature Distance</w:t>
       </w:r>
@@ -11186,7 +11180,7 @@
       <w:pPr>
         <w:pStyle w:val="Heading2"/>
       </w:pPr>
-      <w:bookmarkStart w:id="46" w:name="_Toc243940974"/>
+      <w:bookmarkStart w:id="46" w:name="_Toc243941107"/>
       <w:r>
         <w:t>6.2 Peak Normalised Cross-Correlation</w:t>
       </w:r>
@@ -11483,7 +11477,7 @@
       <w:pPr>
         <w:pStyle w:val="Heading2"/>
       </w:pPr>
-      <w:bookmarkStart w:id="47" w:name="_Toc243940975"/>
+      <w:bookmarkStart w:id="47" w:name="_Toc243941108"/>
       <w:r>
         <w:lastRenderedPageBreak/>
         <w:t>6.3 DSP Score Fusion</w:t>
@@ -11909,7 +11903,7 @@
       <w:pPr>
         <w:pStyle w:val="Heading2"/>
       </w:pPr>
-      <w:bookmarkStart w:id="48" w:name="_Toc243940976"/>
+      <w:bookmarkStart w:id="48" w:name="_Toc243941109"/>
       <w:r>
         <w:t>6.4 Writer-Independent Classifier</w:t>
       </w:r>
@@ -11957,7 +11951,7 @@
       <w:pPr>
         <w:pStyle w:val="Heading2"/>
       </w:pPr>
-      <w:bookmarkStart w:id="49" w:name="_Toc243940977"/>
+      <w:bookmarkStart w:id="49" w:name="_Toc243941110"/>
       <w:r>
         <w:lastRenderedPageBreak/>
         <w:t>6.5 Scoring Modes</w:t>
@@ -11971,7 +11965,7 @@
         <w:spacing w:before="160" w:after="80"/>
         <w:jc w:val="center"/>
       </w:pPr>
-      <w:bookmarkStart w:id="50" w:name="_Toc243940864"/>
+      <w:bookmarkStart w:id="50" w:name="_Toc243940997"/>
       <w:r>
         <w:t xml:space="preserve">Table </w:t>
       </w:r>
@@ -12277,7 +12271,7 @@
         <w:pStyle w:val="Heading1"/>
         <w:pageBreakBefore/>
       </w:pPr>
-      <w:bookmarkStart w:id="51" w:name="_Toc243940978"/>
+      <w:bookmarkStart w:id="51" w:name="_Toc243941111"/>
       <w:r>
         <w:lastRenderedPageBreak/>
         <w:t>7. THRESHOLD CALIBRATION AND PARAMETER TUNING</w:t>
@@ -12288,7 +12282,7 @@
       <w:pPr>
         <w:pStyle w:val="Heading2"/>
       </w:pPr>
-      <w:bookmarkStart w:id="52" w:name="_Toc243940979"/>
+      <w:bookmarkStart w:id="52" w:name="_Toc243941112"/>
       <w:r>
         <w:t>7.1 Per-Writer Threshold by Leave-One-Out</w:t>
       </w:r>
@@ -12807,7 +12801,7 @@
           <w:noProof/>
         </w:rPr>
         <w:drawing>
-          <wp:inline distT="0" distB="0" distL="0" distR="0" wp14:anchorId="0D03F0BF" wp14:editId="6B379511">
+          <wp:inline distT="0" distB="0" distL="0" distR="0" wp14:anchorId="67E50508" wp14:editId="57FEE3F7">
             <wp:extent cx="5486400" cy="1895475"/>
             <wp:effectExtent l="0" t="0" r="0" b="0"/>
             <wp:docPr id="5" name="Picture 5"/>
@@ -12852,7 +12846,7 @@
         <w:spacing w:after="200"/>
         <w:jc w:val="center"/>
       </w:pPr>
-      <w:bookmarkStart w:id="53" w:name="_Toc243940847"/>
+      <w:bookmarkStart w:id="53" w:name="_Toc243940980"/>
       <w:r>
         <w:t xml:space="preserve">Figure </w:t>
       </w:r>
@@ -12883,7 +12877,7 @@
       <w:pPr>
         <w:pStyle w:val="Heading2"/>
       </w:pPr>
-      <w:bookmarkStart w:id="54" w:name="_Toc243940980"/>
+      <w:bookmarkStart w:id="54" w:name="_Toc243941113"/>
       <w:r>
         <w:t>7.2 Global Parameter Tuning</w:t>
       </w:r>
@@ -13016,7 +13010,7 @@
         </w:rPr>
         <w:lastRenderedPageBreak/>
         <w:drawing>
-          <wp:inline distT="0" distB="0" distL="0" distR="0" wp14:anchorId="4E5EAA88" wp14:editId="20C0F8E7">
+          <wp:inline distT="0" distB="0" distL="0" distR="0" wp14:anchorId="687C4F53" wp14:editId="03FBFFC5">
             <wp:extent cx="5048250" cy="2124075"/>
             <wp:effectExtent l="0" t="0" r="0" b="0"/>
             <wp:docPr id="6" name="Picture 6"/>
@@ -13061,7 +13055,7 @@
         <w:spacing w:after="200"/>
         <w:jc w:val="center"/>
       </w:pPr>
-      <w:bookmarkStart w:id="55" w:name="_Toc243940848"/>
+      <w:bookmarkStart w:id="55" w:name="_Toc243940981"/>
       <w:r>
         <w:t xml:space="preserve">Figure </w:t>
       </w:r>
@@ -13095,7 +13089,7 @@
         <w:spacing w:before="160" w:after="80"/>
         <w:jc w:val="center"/>
       </w:pPr>
-      <w:bookmarkStart w:id="56" w:name="_Toc243940865"/>
+      <w:bookmarkStart w:id="56" w:name="_Toc243940998"/>
       <w:r>
         <w:t xml:space="preserve">Table </w:t>
       </w:r>
@@ -13583,7 +13577,7 @@
       <w:pPr>
         <w:pStyle w:val="Heading2"/>
       </w:pPr>
-      <w:bookmarkStart w:id="57" w:name="_Toc243940981"/>
+      <w:bookmarkStart w:id="57" w:name="_Toc243941114"/>
       <w:r>
         <w:t>7.3 Classifier Training and Validation</w:t>
       </w:r>
@@ -13620,7 +13614,7 @@
         </w:rPr>
         <w:lastRenderedPageBreak/>
         <w:drawing>
-          <wp:inline distT="0" distB="0" distL="0" distR="0" wp14:anchorId="26197310" wp14:editId="395FE8AE">
+          <wp:inline distT="0" distB="0" distL="0" distR="0" wp14:anchorId="758FC928" wp14:editId="28250443">
             <wp:extent cx="2743200" cy="2105025"/>
             <wp:effectExtent l="0" t="0" r="0" b="0"/>
             <wp:docPr id="7" name="Picture 7"/>
@@ -13665,7 +13659,7 @@
         <w:spacing w:after="200"/>
         <w:jc w:val="center"/>
       </w:pPr>
-      <w:bookmarkStart w:id="58" w:name="_Toc243940849"/>
+      <w:bookmarkStart w:id="58" w:name="_Toc243940982"/>
       <w:r>
         <w:t xml:space="preserve">Figure </w:t>
       </w:r>
@@ -13697,7 +13691,7 @@
         <w:pStyle w:val="Heading1"/>
         <w:pageBreakBefore/>
       </w:pPr>
-      <w:bookmarkStart w:id="59" w:name="_Toc243940982"/>
+      <w:bookmarkStart w:id="59" w:name="_Toc243941115"/>
       <w:r>
         <w:lastRenderedPageBreak/>
         <w:t>8. GRAPHICAL USER INTERFACE</w:t>
@@ -13761,7 +13755,7 @@
       <w:pPr>
         <w:pStyle w:val="Heading2"/>
       </w:pPr>
-      <w:bookmarkStart w:id="60" w:name="_Toc243940983"/>
+      <w:bookmarkStart w:id="60" w:name="_Toc243941116"/>
       <w:r>
         <w:t>8.1 Layout</w:t>
       </w:r>
@@ -13783,7 +13777,7 @@
       <w:pPr>
         <w:pStyle w:val="Heading2"/>
       </w:pPr>
-      <w:bookmarkStart w:id="61" w:name="_Toc243940984"/>
+      <w:bookmarkStart w:id="61" w:name="_Toc243941117"/>
       <w:r>
         <w:t>8.2 Activity Log</w:t>
       </w:r>
@@ -13816,7 +13810,7 @@
       <w:pPr>
         <w:pStyle w:val="Heading2"/>
       </w:pPr>
-      <w:bookmarkStart w:id="62" w:name="_Toc243940985"/>
+      <w:bookmarkStart w:id="62" w:name="_Toc243941118"/>
       <w:r>
         <w:t>8.3 Loading States</w:t>
       </w:r>
@@ -13901,7 +13895,7 @@
               </w:rPr>
               <w:lastRenderedPageBreak/>
               <w:drawing>
-                <wp:inline distT="0" distB="0" distL="0" distR="0" wp14:anchorId="2F6E3A12" wp14:editId="32B69CBB">
+                <wp:inline distT="0" distB="0" distL="0" distR="0" wp14:anchorId="2F213437" wp14:editId="27DCEC76">
                   <wp:extent cx="2667000" cy="2047875"/>
                   <wp:effectExtent l="0" t="0" r="0" b="0"/>
                   <wp:docPr id="8" name="Picture 8"/>
@@ -13946,7 +13940,7 @@
               <w:spacing w:after="120"/>
               <w:jc w:val="center"/>
             </w:pPr>
-            <w:bookmarkStart w:id="63" w:name="_Toc243940850"/>
+            <w:bookmarkStart w:id="63" w:name="_Toc243940983"/>
             <w:r>
               <w:t xml:space="preserve">Figure </w:t>
             </w:r>
@@ -13998,7 +13992,7 @@
                 <w:noProof/>
               </w:rPr>
               <w:drawing>
-                <wp:inline distT="0" distB="0" distL="0" distR="0" wp14:anchorId="22A783C2" wp14:editId="0F766A71">
+                <wp:inline distT="0" distB="0" distL="0" distR="0" wp14:anchorId="61683379" wp14:editId="758B832B">
                   <wp:extent cx="2667000" cy="2047875"/>
                   <wp:effectExtent l="0" t="0" r="0" b="0"/>
                   <wp:docPr id="9" name="Picture 9"/>
@@ -14043,7 +14037,7 @@
               <w:spacing w:after="120"/>
               <w:jc w:val="center"/>
             </w:pPr>
-            <w:bookmarkStart w:id="64" w:name="_Toc243940851"/>
+            <w:bookmarkStart w:id="64" w:name="_Toc243940984"/>
             <w:r>
               <w:t xml:space="preserve">Figure </w:t>
             </w:r>
@@ -14082,7 +14076,7 @@
       <w:pPr>
         <w:pStyle w:val="Heading2"/>
       </w:pPr>
-      <w:bookmarkStart w:id="65" w:name="_Toc243940986"/>
+      <w:bookmarkStart w:id="65" w:name="_Toc243941119"/>
       <w:r>
         <w:t>8.4 Enrolment and Verification</w:t>
       </w:r>
@@ -14147,7 +14141,7 @@
                 <w:noProof/>
               </w:rPr>
               <w:drawing>
-                <wp:inline distT="0" distB="0" distL="0" distR="0" wp14:anchorId="4CDE3709" wp14:editId="03F220C6">
+                <wp:inline distT="0" distB="0" distL="0" distR="0" wp14:anchorId="0433FD23" wp14:editId="5982EC93">
                   <wp:extent cx="2667000" cy="2047875"/>
                   <wp:effectExtent l="0" t="0" r="0" b="0"/>
                   <wp:docPr id="10" name="Picture 10"/>
@@ -14192,7 +14186,7 @@
               <w:spacing w:after="120"/>
               <w:jc w:val="center"/>
             </w:pPr>
-            <w:bookmarkStart w:id="66" w:name="_Toc243940852"/>
+            <w:bookmarkStart w:id="66" w:name="_Toc243940985"/>
             <w:r>
               <w:t xml:space="preserve">Figure </w:t>
             </w:r>
@@ -14244,7 +14238,7 @@
                 <w:noProof/>
               </w:rPr>
               <w:drawing>
-                <wp:inline distT="0" distB="0" distL="0" distR="0" wp14:anchorId="7AE010DC" wp14:editId="00F3CC53">
+                <wp:inline distT="0" distB="0" distL="0" distR="0" wp14:anchorId="0EBA9A79" wp14:editId="27C4C9FB">
                   <wp:extent cx="2667000" cy="2047875"/>
                   <wp:effectExtent l="0" t="0" r="0" b="0"/>
                   <wp:docPr id="11" name="Picture 11"/>
@@ -14289,7 +14283,7 @@
               <w:spacing w:after="120"/>
               <w:jc w:val="center"/>
             </w:pPr>
-            <w:bookmarkStart w:id="67" w:name="_Toc243940853"/>
+            <w:bookmarkStart w:id="67" w:name="_Toc243940986"/>
             <w:r>
               <w:t xml:space="preserve">Figure </w:t>
             </w:r>
@@ -14328,7 +14322,7 @@
       <w:pPr>
         <w:pStyle w:val="Heading2"/>
       </w:pPr>
-      <w:bookmarkStart w:id="68" w:name="_Toc243940987"/>
+      <w:bookmarkStart w:id="68" w:name="_Toc243941120"/>
       <w:r>
         <w:t>8.5 Error and Warning States</w:t>
       </w:r>
@@ -14414,7 +14408,7 @@
                 <w:noProof/>
               </w:rPr>
               <w:drawing>
-                <wp:inline distT="0" distB="0" distL="0" distR="0" wp14:anchorId="23F23E22" wp14:editId="1F4657C0">
+                <wp:inline distT="0" distB="0" distL="0" distR="0" wp14:anchorId="43857A99" wp14:editId="72BD264E">
                   <wp:extent cx="2667000" cy="2047875"/>
                   <wp:effectExtent l="0" t="0" r="0" b="0"/>
                   <wp:docPr id="12" name="Picture 12"/>
@@ -14459,7 +14453,7 @@
               <w:spacing w:after="120"/>
               <w:jc w:val="center"/>
             </w:pPr>
-            <w:bookmarkStart w:id="69" w:name="_Toc243940854"/>
+            <w:bookmarkStart w:id="69" w:name="_Toc243940987"/>
             <w:r>
               <w:t xml:space="preserve">Figure </w:t>
             </w:r>
@@ -14511,7 +14505,7 @@
                 <w:noProof/>
               </w:rPr>
               <w:drawing>
-                <wp:inline distT="0" distB="0" distL="0" distR="0" wp14:anchorId="68A124F8" wp14:editId="091439D7">
+                <wp:inline distT="0" distB="0" distL="0" distR="0" wp14:anchorId="5D737FA9" wp14:editId="32F56404">
                   <wp:extent cx="2667000" cy="2047875"/>
                   <wp:effectExtent l="0" t="0" r="0" b="0"/>
                   <wp:docPr id="13" name="Picture 13"/>
@@ -14556,7 +14550,7 @@
               <w:spacing w:after="120"/>
               <w:jc w:val="center"/>
             </w:pPr>
-            <w:bookmarkStart w:id="70" w:name="_Toc243940855"/>
+            <w:bookmarkStart w:id="70" w:name="_Toc243940988"/>
             <w:r>
               <w:t xml:space="preserve">Figure </w:t>
             </w:r>
@@ -15105,7 +15099,7 @@
       <w:pPr>
         <w:pStyle w:val="Heading2"/>
       </w:pPr>
-      <w:bookmarkStart w:id="71" w:name="_Toc243940988"/>
+      <w:bookmarkStart w:id="71" w:name="_Toc243941121"/>
       <w:r>
         <w:lastRenderedPageBreak/>
         <w:t>8.6 DSP Analysis Figure</w:t>
@@ -15126,7 +15120,7 @@
         <w:pStyle w:val="Heading1"/>
         <w:pageBreakBefore/>
       </w:pPr>
-      <w:bookmarkStart w:id="72" w:name="_Toc243940989"/>
+      <w:bookmarkStart w:id="72" w:name="_Toc243941122"/>
       <w:r>
         <w:lastRenderedPageBreak/>
         <w:t>9. RESULTS AND EVALUATION</w:t>
@@ -15137,7 +15131,7 @@
       <w:pPr>
         <w:pStyle w:val="Heading2"/>
       </w:pPr>
-      <w:bookmarkStart w:id="73" w:name="_Toc243940990"/>
+      <w:bookmarkStart w:id="73" w:name="_Toc243941123"/>
       <w:r>
         <w:t>9.1 Evaluation Metrics</w:t>
       </w:r>
@@ -15240,7 +15234,7 @@
       <w:pPr>
         <w:pStyle w:val="Heading2"/>
       </w:pPr>
-      <w:bookmarkStart w:id="74" w:name="_Toc243940991"/>
+      <w:bookmarkStart w:id="74" w:name="_Toc243941124"/>
       <w:r>
         <w:t>9.2 Results on Held-Out Writers</w:t>
       </w:r>
@@ -15262,7 +15256,7 @@
         <w:spacing w:before="160" w:after="80"/>
         <w:jc w:val="center"/>
       </w:pPr>
-      <w:bookmarkStart w:id="75" w:name="_Toc243940866"/>
+      <w:bookmarkStart w:id="75" w:name="_Toc243940999"/>
       <w:r>
         <w:t xml:space="preserve">Table </w:t>
       </w:r>
@@ -15935,7 +15929,7 @@
         </w:rPr>
         <w:lastRenderedPageBreak/>
         <w:drawing>
-          <wp:inline distT="0" distB="0" distL="0" distR="0" wp14:anchorId="67FBB2F0" wp14:editId="3E0C861E">
+          <wp:inline distT="0" distB="0" distL="0" distR="0" wp14:anchorId="0B0ABD55" wp14:editId="360E0B1F">
             <wp:extent cx="5486400" cy="2085975"/>
             <wp:effectExtent l="0" t="0" r="0" b="0"/>
             <wp:docPr id="14" name="Picture 14"/>
@@ -15980,7 +15974,7 @@
         <w:spacing w:after="200"/>
         <w:jc w:val="center"/>
       </w:pPr>
-      <w:bookmarkStart w:id="76" w:name="_Toc243940856"/>
+      <w:bookmarkStart w:id="76" w:name="_Toc243940989"/>
       <w:r>
         <w:t xml:space="preserve">Figure </w:t>
       </w:r>
@@ -16011,7 +16005,7 @@
       <w:pPr>
         <w:pStyle w:val="Heading2"/>
       </w:pPr>
-      <w:bookmarkStart w:id="77" w:name="_Toc243940992"/>
+      <w:bookmarkStart w:id="77" w:name="_Toc243941125"/>
       <w:r>
         <w:t>9.3 Score Distributions and ROC</w:t>
       </w:r>
@@ -16037,7 +16031,7 @@
           <w:noProof/>
         </w:rPr>
         <w:drawing>
-          <wp:inline distT="0" distB="0" distL="0" distR="0" wp14:anchorId="0181FA14" wp14:editId="7263882F">
+          <wp:inline distT="0" distB="0" distL="0" distR="0" wp14:anchorId="53CD624D" wp14:editId="09410D1A">
             <wp:extent cx="3400425" cy="2047875"/>
             <wp:effectExtent l="0" t="0" r="0" b="0"/>
             <wp:docPr id="15" name="Picture 15"/>
@@ -16082,7 +16076,7 @@
         <w:spacing w:after="200"/>
         <w:jc w:val="center"/>
       </w:pPr>
-      <w:bookmarkStart w:id="78" w:name="_Toc243940857"/>
+      <w:bookmarkStart w:id="78" w:name="_Toc243940990"/>
       <w:r>
         <w:t xml:space="preserve">Figure </w:t>
       </w:r>
@@ -16121,7 +16115,7 @@
         </w:rPr>
         <w:lastRenderedPageBreak/>
         <w:drawing>
-          <wp:inline distT="0" distB="0" distL="0" distR="0" wp14:anchorId="6F6C78BF" wp14:editId="2F611E90">
+          <wp:inline distT="0" distB="0" distL="0" distR="0" wp14:anchorId="1FA04BDB" wp14:editId="638AC6E1">
             <wp:extent cx="5486400" cy="2305050"/>
             <wp:effectExtent l="0" t="0" r="0" b="0"/>
             <wp:docPr id="16" name="Picture 16"/>
@@ -16166,7 +16160,7 @@
         <w:spacing w:after="200"/>
         <w:jc w:val="center"/>
       </w:pPr>
-      <w:bookmarkStart w:id="79" w:name="_Toc243940858"/>
+      <w:bookmarkStart w:id="79" w:name="_Toc243940991"/>
       <w:r>
         <w:t xml:space="preserve">Figure </w:t>
       </w:r>
@@ -16197,7 +16191,7 @@
       <w:pPr>
         <w:pStyle w:val="Heading2"/>
       </w:pPr>
-      <w:bookmarkStart w:id="80" w:name="_Toc243940993"/>
+      <w:bookmarkStart w:id="80" w:name="_Toc243941126"/>
       <w:r>
         <w:t>9.4 Discussion</w:t>
       </w:r>
@@ -16333,7 +16327,7 @@
       <w:pPr>
         <w:pStyle w:val="Heading2"/>
       </w:pPr>
-      <w:bookmarkStart w:id="81" w:name="_Toc243940994"/>
+      <w:bookmarkStart w:id="81" w:name="_Toc243941127"/>
       <w:r>
         <w:t>9.5 Example Decisions</w:t>
       </w:r>
@@ -16399,7 +16393,7 @@
                 <w:noProof/>
               </w:rPr>
               <w:drawing>
-                <wp:inline distT="0" distB="0" distL="0" distR="0" wp14:anchorId="3BDE58CC" wp14:editId="5C0165D2">
+                <wp:inline distT="0" distB="0" distL="0" distR="0" wp14:anchorId="5DFC9A07" wp14:editId="3EADD4C9">
                   <wp:extent cx="2667000" cy="1504950"/>
                   <wp:effectExtent l="0" t="0" r="0" b="0"/>
                   <wp:docPr id="17" name="Picture 17"/>
@@ -16444,7 +16438,7 @@
               <w:spacing w:after="120"/>
               <w:jc w:val="center"/>
             </w:pPr>
-            <w:bookmarkStart w:id="82" w:name="_Toc243940859"/>
+            <w:bookmarkStart w:id="82" w:name="_Toc243940992"/>
             <w:r>
               <w:t xml:space="preserve">Figure </w:t>
             </w:r>
@@ -16496,7 +16490,7 @@
                 <w:noProof/>
               </w:rPr>
               <w:drawing>
-                <wp:inline distT="0" distB="0" distL="0" distR="0" wp14:anchorId="3CAC0FB7" wp14:editId="2FE3C4EF">
+                <wp:inline distT="0" distB="0" distL="0" distR="0" wp14:anchorId="2DC8FF7C" wp14:editId="12FDF112">
                   <wp:extent cx="2667000" cy="1504950"/>
                   <wp:effectExtent l="0" t="0" r="0" b="0"/>
                   <wp:docPr id="18" name="Picture 18"/>
@@ -16541,7 +16535,7 @@
               <w:spacing w:after="120"/>
               <w:jc w:val="center"/>
             </w:pPr>
-            <w:bookmarkStart w:id="83" w:name="_Toc243940860"/>
+            <w:bookmarkStart w:id="83" w:name="_Toc243940993"/>
             <w:r>
               <w:t xml:space="preserve">Figure </w:t>
             </w:r>
@@ -16581,7 +16575,7 @@
         <w:pStyle w:val="Heading1"/>
         <w:pageBreakBefore/>
       </w:pPr>
-      <w:bookmarkStart w:id="84" w:name="_Toc243940995"/>
+      <w:bookmarkStart w:id="84" w:name="_Toc243941128"/>
       <w:r>
         <w:lastRenderedPageBreak/>
         <w:t>10. APPLICATIONS</w:t>
@@ -16761,7 +16755,7 @@
         <w:pStyle w:val="Heading1"/>
         <w:spacing w:before="480"/>
       </w:pPr>
-      <w:bookmarkStart w:id="85" w:name="_Toc243940996"/>
+      <w:bookmarkStart w:id="85" w:name="_Toc243941129"/>
       <w:r>
         <w:t>11. FUTURE SCOPE</w:t>
       </w:r>
@@ -16972,7 +16966,7 @@
         <w:pStyle w:val="Heading1"/>
         <w:spacing w:before="480"/>
       </w:pPr>
-      <w:bookmarkStart w:id="86" w:name="_Toc243940997"/>
+      <w:bookmarkStart w:id="86" w:name="_Toc243941130"/>
       <w:r>
         <w:t>12. CONCLUSION</w:t>
       </w:r>
@@ -17020,7 +17014,7 @@
         <w:pStyle w:val="Heading1"/>
         <w:pageBreakBefore/>
       </w:pPr>
-      <w:bookmarkStart w:id="87" w:name="_Toc243940998"/>
+      <w:bookmarkStart w:id="87" w:name="_Toc243941131"/>
       <w:r>
         <w:lastRenderedPageBreak/>
         <w:t>REFERENCES</w:t>
@@ -17272,7 +17266,7 @@
         <w:pStyle w:val="Heading1"/>
         <w:pageBreakBefore/>
       </w:pPr>
-      <w:bookmarkStart w:id="88" w:name="_Toc243940999"/>
+      <w:bookmarkStart w:id="88" w:name="_Toc243941132"/>
       <w:r>
         <w:lastRenderedPageBreak/>
         <w:t>APPENDIX A: PROJECT FILE LISTING</w:t>
@@ -17295,7 +17289,7 @@
         <w:spacing w:before="160" w:after="80"/>
         <w:jc w:val="center"/>
       </w:pPr>
-      <w:bookmarkStart w:id="89" w:name="_Toc243940867"/>
+      <w:bookmarkStart w:id="89" w:name="_Toc243941000"/>
       <w:r>
         <w:t xml:space="preserve">Table </w:t>
       </w:r>
@@ -18981,7 +18975,7 @@
         <w:pStyle w:val="Heading1"/>
         <w:spacing w:before="360"/>
       </w:pPr>
-      <w:bookmarkStart w:id="90" w:name="_Toc243941000"/>
+      <w:bookmarkStart w:id="90" w:name="_Toc243941133"/>
       <w:r>
         <w:t>APPENDIX B: HOW TO RUN AND REPRODUCE</w:t>
       </w:r>
@@ -19318,7 +19312,7 @@
         <w:pStyle w:val="Heading1"/>
         <w:spacing w:before="360"/>
       </w:pPr>
-      <w:bookmarkStart w:id="91" w:name="_Toc243941001"/>
+      <w:bookmarkStart w:id="91" w:name="_Toc243941134"/>
       <w:r>
         <w:t>APPENDIX C: SAMPLE ACTIVITY LOG</w:t>
       </w:r>
@@ -19719,10 +19713,10 @@
 <file path=word/numbering.xml><?xml version="1.0" encoding="utf-8"?>
 <w:numbering xmlns:wpc="http://schemas.microsoft.com/office/word/2010/wordprocessingCanvas" xmlns:cx="http://schemas.microsoft.com/office/drawing/2014/chartex" xmlns:cx1="http://schemas.microsoft.com/office/drawing/2015/9/8/chartex" xmlns:cx2="http://schemas.microsoft.com/office/drawing/2015/10/21/chartex" xmlns:cx3="http://schemas.microsoft.com/office/drawing/2016/5/9/chartex" xmlns:cx4="http://schemas.microsoft.com/office/drawing/2016/5/10/chartex" xmlns:cx5="http://schemas.microsoft.com/office/drawing/2016/5/11/chartex" xmlns:cx6="http://schemas.microsoft.com/office/drawing/2016/5/12/chartex" xmlns:cx7="http://schemas.microsoft.com/office/drawing/2016/5/13/chartex" xmlns:cx8="http://schemas.microsoft.com/office/drawing/2016/5/14/chartex" xmlns:mc="http://schemas.openxmlformats.org/markup-compatibility/2006" xmlns:aink="http://schemas.microsoft.com/office/drawing/2016/ink" xmlns:am3d="http://schemas.microsoft.com/office/drawing/2017/model3d" xmlns:o="urn:schemas-microsoft-com:office:office" xmlns:oel="http://schemas.microsoft.com/office/2019/extlst" xmlns:r="http://schemas.openxmlformats.org/officeDocument/2006/relationships" xmlns:m="http://schemas.openxmlformats.org/officeDocument/2006/math" xmlns:v="urn:schemas-microsoft-com:vml" xmlns:wp14="http://schemas.microsoft.com/office/word/2010/wordprocessingDrawing" xmlns:wp="http://schemas.openxmlformats.org/drawingml/2006/wordprocessingDrawing" xmlns:w10="urn:schemas-microsoft-com:office:word" xmlns:w="http://schemas.openxmlformats.org/wordprocessingml/2006/main" xmlns:w14="http://schemas.microsoft.com/office/word/2010/wordml" xmlns:w15="http://schemas.microsoft.com/office/word/2012/wordml" xmlns:w16cex="http://schemas.microsoft.com/office/word/2018/wordml/cex" xmlns:w16cid="http://schemas.microsoft.com/office/word/2016/wordml/cid" xmlns:w16="http://schemas.microsoft.com/office/word/2018/wordml" xmlns:w16du="http://schemas.microsoft.com/office/word/2023/wordml/word16du" xmlns:w16sdtdh="http://schemas.microsoft.com/office/word/2020/wordml/sdtdatahash" xmlns:w16sdtfl="http://schemas.microsoft.com/office/word/2024/wordml/sdtformatlock" xmlns:w16se="http://schemas.microsoft.com/office/word/2015/wordml/symex" xmlns:wpg="http://schemas.microsoft.com/office/word/2010/wordprocessingGroup" xmlns:wpi="http://schemas.microsoft.com/office/word/2010/wordprocessingInk" xmlns:wne="http://schemas.microsoft.com/office/word/2006/wordml" xmlns:wps="http://schemas.microsoft.com/office/word/2010/wordprocessingShape" mc:Ignorable="w14 w15 w16se w16cid w16 w16cex w16sdtdh w16sdtfl w16du wp14">
   <w:abstractNum w:abstractNumId="0" w15:restartNumberingAfterBreak="0">
-    <w:nsid w:val="1311338B"/>
+    <w:nsid w:val="18F46F34"/>
     <w:multiLevelType w:val="hybridMultilevel"/>
-    <w:tmpl w:val="217E4E7A"/>
-    <w:lvl w:ilvl="0" w:tplc="F648D80C" w:tentative="1">
+    <w:tmpl w:val="ECBEE528"/>
+    <w:lvl w:ilvl="0" w:tplc="EB22255E" w:tentative="1">
       <w:start w:val="1"/>
       <w:numFmt w:val="decimal"/>
       <w:lvlText w:val="%1."/>
@@ -19731,52 +19725,52 @@
         <w:ind w:left="720" w:hanging="360"/>
       </w:pPr>
     </w:lvl>
-    <w:lvl w:ilvl="1" w:tplc="F02A31CE">
+    <w:lvl w:ilvl="1" w:tplc="EBDCEDDE">
       <w:numFmt w:val="decimal"/>
       <w:lvlText w:val=""/>
       <w:lvlJc w:val="left"/>
     </w:lvl>
-    <w:lvl w:ilvl="2" w:tplc="12220D62">
+    <w:lvl w:ilvl="2" w:tplc="120A62FC">
       <w:numFmt w:val="decimal"/>
       <w:lvlText w:val=""/>
       <w:lvlJc w:val="left"/>
     </w:lvl>
-    <w:lvl w:ilvl="3" w:tplc="C59800FC">
+    <w:lvl w:ilvl="3" w:tplc="E87A3A8C">
       <w:numFmt w:val="decimal"/>
       <w:lvlText w:val=""/>
       <w:lvlJc w:val="left"/>
     </w:lvl>
-    <w:lvl w:ilvl="4" w:tplc="2236C5CC">
+    <w:lvl w:ilvl="4" w:tplc="578C2874">
       <w:numFmt w:val="decimal"/>
       <w:lvlText w:val=""/>
       <w:lvlJc w:val="left"/>
     </w:lvl>
-    <w:lvl w:ilvl="5" w:tplc="9800BDC0">
+    <w:lvl w:ilvl="5" w:tplc="3612A842">
       <w:numFmt w:val="decimal"/>
       <w:lvlText w:val=""/>
       <w:lvlJc w:val="left"/>
     </w:lvl>
-    <w:lvl w:ilvl="6" w:tplc="094C280C">
+    <w:lvl w:ilvl="6" w:tplc="691601D2">
       <w:numFmt w:val="decimal"/>
       <w:lvlText w:val=""/>
       <w:lvlJc w:val="left"/>
     </w:lvl>
-    <w:lvl w:ilvl="7" w:tplc="DE2CF578">
+    <w:lvl w:ilvl="7" w:tplc="1E9A824A">
       <w:numFmt w:val="decimal"/>
       <w:lvlText w:val=""/>
       <w:lvlJc w:val="left"/>
     </w:lvl>
-    <w:lvl w:ilvl="8" w:tplc="B23AEA3E">
+    <w:lvl w:ilvl="8" w:tplc="B06EDF42">
       <w:numFmt w:val="decimal"/>
       <w:lvlText w:val=""/>
       <w:lvlJc w:val="left"/>
     </w:lvl>
   </w:abstractNum>
   <w:abstractNum w:abstractNumId="1" w15:restartNumberingAfterBreak="0">
-    <w:nsid w:val="343166AC"/>
+    <w:nsid w:val="336E3748"/>
     <w:multiLevelType w:val="hybridMultilevel"/>
-    <w:tmpl w:val="2BA0112C"/>
-    <w:lvl w:ilvl="0" w:tplc="45FAFB6A">
+    <w:tmpl w:val="0A5CD9F4"/>
+    <w:lvl w:ilvl="0" w:tplc="1C100A0C">
       <w:start w:val="1"/>
       <w:numFmt w:val="decimal"/>
       <w:lvlText w:val="[%1]"/>
@@ -19785,52 +19779,52 @@
         <w:ind w:left="720" w:hanging="540"/>
       </w:pPr>
     </w:lvl>
-    <w:lvl w:ilvl="1" w:tplc="B7DE6B00">
+    <w:lvl w:ilvl="1" w:tplc="B9C2D0AE">
       <w:numFmt w:val="decimal"/>
       <w:lvlText w:val=""/>
       <w:lvlJc w:val="left"/>
     </w:lvl>
-    <w:lvl w:ilvl="2" w:tplc="3D44B3FA">
+    <w:lvl w:ilvl="2" w:tplc="63CAD8F0">
       <w:numFmt w:val="decimal"/>
       <w:lvlText w:val=""/>
       <w:lvlJc w:val="left"/>
     </w:lvl>
-    <w:lvl w:ilvl="3" w:tplc="2D4C2E18">
+    <w:lvl w:ilvl="3" w:tplc="EB908F66">
       <w:numFmt w:val="decimal"/>
       <w:lvlText w:val=""/>
       <w:lvlJc w:val="left"/>
     </w:lvl>
-    <w:lvl w:ilvl="4" w:tplc="D8560018">
+    <w:lvl w:ilvl="4" w:tplc="A170C156">
       <w:numFmt w:val="decimal"/>
       <w:lvlText w:val=""/>
       <w:lvlJc w:val="left"/>
     </w:lvl>
-    <w:lvl w:ilvl="5" w:tplc="108874F4">
+    <w:lvl w:ilvl="5" w:tplc="9BF6BA0A">
       <w:numFmt w:val="decimal"/>
       <w:lvlText w:val=""/>
       <w:lvlJc w:val="left"/>
     </w:lvl>
-    <w:lvl w:ilvl="6" w:tplc="47DAF9AC">
+    <w:lvl w:ilvl="6" w:tplc="B0F8983A">
       <w:numFmt w:val="decimal"/>
       <w:lvlText w:val=""/>
       <w:lvlJc w:val="left"/>
     </w:lvl>
-    <w:lvl w:ilvl="7" w:tplc="DF30AECA">
+    <w:lvl w:ilvl="7" w:tplc="85A0BB3E">
       <w:numFmt w:val="decimal"/>
       <w:lvlText w:val=""/>
       <w:lvlJc w:val="left"/>
     </w:lvl>
-    <w:lvl w:ilvl="8" w:tplc="E850F4B8">
+    <w:lvl w:ilvl="8" w:tplc="B13A6F4E">
       <w:numFmt w:val="decimal"/>
       <w:lvlText w:val=""/>
       <w:lvlJc w:val="left"/>
     </w:lvl>
   </w:abstractNum>
   <w:abstractNum w:abstractNumId="2" w15:restartNumberingAfterBreak="0">
-    <w:nsid w:val="542F697A"/>
+    <w:nsid w:val="3B55648D"/>
     <w:multiLevelType w:val="hybridMultilevel"/>
-    <w:tmpl w:val="6436FB52"/>
-    <w:lvl w:ilvl="0" w:tplc="39FE1B78">
+    <w:tmpl w:val="A2EE0400"/>
+    <w:lvl w:ilvl="0" w:tplc="F2F8D978">
       <w:start w:val="1"/>
       <w:numFmt w:val="bullet"/>
       <w:lvlText w:val="•"/>
@@ -19839,7 +19833,7 @@
         <w:ind w:left="720" w:hanging="360"/>
       </w:pPr>
     </w:lvl>
-    <w:lvl w:ilvl="1" w:tplc="50D42B72" w:tentative="1">
+    <w:lvl w:ilvl="1" w:tplc="4C3C2512" w:tentative="1">
       <w:start w:val="1"/>
       <w:numFmt w:val="bullet"/>
       <w:lvlText w:val="◦"/>
@@ -19848,47 +19842,47 @@
         <w:ind w:left="1440" w:hanging="360"/>
       </w:pPr>
     </w:lvl>
-    <w:lvl w:ilvl="2" w:tplc="357066D2">
+    <w:lvl w:ilvl="2" w:tplc="9BD49C6C">
       <w:numFmt w:val="decimal"/>
       <w:lvlText w:val=""/>
       <w:lvlJc w:val="left"/>
     </w:lvl>
-    <w:lvl w:ilvl="3" w:tplc="FAE26396">
+    <w:lvl w:ilvl="3" w:tplc="84B6C8F4">
       <w:numFmt w:val="decimal"/>
       <w:lvlText w:val=""/>
       <w:lvlJc w:val="left"/>
     </w:lvl>
-    <w:lvl w:ilvl="4" w:tplc="DBD04BEC">
+    <w:lvl w:ilvl="4" w:tplc="CE169A50">
       <w:numFmt w:val="decimal"/>
       <w:lvlText w:val=""/>
       <w:lvlJc w:val="left"/>
     </w:lvl>
-    <w:lvl w:ilvl="5" w:tplc="0CEE55DA">
+    <w:lvl w:ilvl="5" w:tplc="6E26FF40">
       <w:numFmt w:val="decimal"/>
       <w:lvlText w:val=""/>
       <w:lvlJc w:val="left"/>
     </w:lvl>
-    <w:lvl w:ilvl="6" w:tplc="124A1B60">
+    <w:lvl w:ilvl="6" w:tplc="CF6E65A2">
       <w:numFmt w:val="decimal"/>
       <w:lvlText w:val=""/>
       <w:lvlJc w:val="left"/>
     </w:lvl>
-    <w:lvl w:ilvl="7" w:tplc="A9D044C4">
+    <w:lvl w:ilvl="7" w:tplc="66264DA6">
       <w:numFmt w:val="decimal"/>
       <w:lvlText w:val=""/>
       <w:lvlJc w:val="left"/>
     </w:lvl>
-    <w:lvl w:ilvl="8" w:tplc="87B8FDA0">
+    <w:lvl w:ilvl="8" w:tplc="438CD778">
       <w:numFmt w:val="decimal"/>
       <w:lvlText w:val=""/>
       <w:lvlJc w:val="left"/>
     </w:lvl>
   </w:abstractNum>
   <w:abstractNum w:abstractNumId="3" w15:restartNumberingAfterBreak="0">
-    <w:nsid w:val="57AC2493"/>
+    <w:nsid w:val="6784708E"/>
     <w:multiLevelType w:val="hybridMultilevel"/>
-    <w:tmpl w:val="ED8C9C80"/>
-    <w:lvl w:ilvl="0" w:tplc="5EBE3250" w:tentative="1">
+    <w:tmpl w:val="C632FC84"/>
+    <w:lvl w:ilvl="0" w:tplc="E654D486" w:tentative="1">
       <w:start w:val="1"/>
       <w:numFmt w:val="bullet"/>
       <w:lvlText w:val="●"/>
@@ -19897,7 +19891,7 @@
         <w:ind w:left="720" w:hanging="360"/>
       </w:pPr>
     </w:lvl>
-    <w:lvl w:ilvl="1" w:tplc="B26A4108" w:tentative="1">
+    <w:lvl w:ilvl="1" w:tplc="C2FCC596" w:tentative="1">
       <w:start w:val="1"/>
       <w:numFmt w:val="bullet"/>
       <w:lvlText w:val="○"/>
@@ -19906,7 +19900,7 @@
         <w:ind w:left="1440" w:hanging="360"/>
       </w:pPr>
     </w:lvl>
-    <w:lvl w:ilvl="2" w:tplc="2924D7BA" w:tentative="1">
+    <w:lvl w:ilvl="2" w:tplc="A67E9DD0" w:tentative="1">
       <w:start w:val="1"/>
       <w:numFmt w:val="bullet"/>
       <w:lvlText w:val="■"/>
@@ -19915,7 +19909,7 @@
         <w:ind w:left="2160" w:hanging="360"/>
       </w:pPr>
     </w:lvl>
-    <w:lvl w:ilvl="3" w:tplc="97A88486" w:tentative="1">
+    <w:lvl w:ilvl="3" w:tplc="ADC86F70" w:tentative="1">
       <w:start w:val="1"/>
       <w:numFmt w:val="bullet"/>
       <w:lvlText w:val="●"/>
@@ -19924,7 +19918,7 @@
         <w:ind w:left="2880" w:hanging="360"/>
       </w:pPr>
     </w:lvl>
-    <w:lvl w:ilvl="4" w:tplc="9B8E1DDA" w:tentative="1">
+    <w:lvl w:ilvl="4" w:tplc="8BB04EB0" w:tentative="1">
       <w:start w:val="1"/>
       <w:numFmt w:val="bullet"/>
       <w:lvlText w:val="○"/>
@@ -19933,7 +19927,7 @@
         <w:ind w:left="3600" w:hanging="360"/>
       </w:pPr>
     </w:lvl>
-    <w:lvl w:ilvl="5" w:tplc="B4860176" w:tentative="1">
+    <w:lvl w:ilvl="5" w:tplc="4938810A" w:tentative="1">
       <w:start w:val="1"/>
       <w:numFmt w:val="bullet"/>
       <w:lvlText w:val="■"/>
@@ -19942,7 +19936,7 @@
         <w:ind w:left="4320" w:hanging="360"/>
       </w:pPr>
     </w:lvl>
-    <w:lvl w:ilvl="6" w:tplc="51083AEE" w:tentative="1">
+    <w:lvl w:ilvl="6" w:tplc="039A8C6A" w:tentative="1">
       <w:start w:val="1"/>
       <w:numFmt w:val="bullet"/>
       <w:lvlText w:val="●"/>
@@ -19951,7 +19945,7 @@
         <w:ind w:left="5040" w:hanging="360"/>
       </w:pPr>
     </w:lvl>
-    <w:lvl w:ilvl="7" w:tplc="18D03792" w:tentative="1">
+    <w:lvl w:ilvl="7" w:tplc="3C2E03CC" w:tentative="1">
       <w:start w:val="1"/>
       <w:numFmt w:val="bullet"/>
       <w:lvlText w:val="●"/>
@@ -19960,7 +19954,7 @@
         <w:ind w:left="5760" w:hanging="360"/>
       </w:pPr>
     </w:lvl>
-    <w:lvl w:ilvl="8" w:tplc="312CCA6E" w:tentative="1">
+    <w:lvl w:ilvl="8" w:tplc="157EEE80" w:tentative="1">
       <w:start w:val="1"/>
       <w:numFmt w:val="bullet"/>
       <w:lvlText w:val="●"/>
@@ -19970,13 +19964,13 @@
       </w:pPr>
     </w:lvl>
   </w:abstractNum>
-  <w:num w:numId="1" w16cid:durableId="1989245298">
+  <w:num w:numId="1" w16cid:durableId="953050839">
     <w:abstractNumId w:val="3"/>
     <w:lvlOverride w:ilvl="0">
       <w:startOverride w:val="1"/>
     </w:lvlOverride>
   </w:num>
-  <w:num w:numId="2" w16cid:durableId="2141914625">
+  <w:num w:numId="2" w16cid:durableId="1001812305">
     <w:abstractNumId w:val="2"/>
     <w:lvlOverride w:ilvl="0">
       <w:startOverride w:val="1"/>
@@ -19985,7 +19979,7 @@
       <w:startOverride w:val="1"/>
     </w:lvlOverride>
   </w:num>
-  <w:num w:numId="3" w16cid:durableId="561214859">
+  <w:num w:numId="3" w16cid:durableId="749738000">
     <w:abstractNumId w:val="1"/>
     <w:lvlOverride w:ilvl="0">
       <w:startOverride w:val="1"/>
@@ -20755,7 +20749,7 @@
     <w:next w:val="Normal"/>
     <w:uiPriority w:val="99"/>
     <w:unhideWhenUsed/>
-    <w:rsid w:val="005254DD"/>
+    <w:rsid w:val="00650038"/>
   </w:style>
 </w:styles>
 </file>

</xml_diff>